<commit_message>
Production deployment using exported MLflow model
</commit_message>
<xml_diff>
--- a/doc.docx
+++ b/doc.docx
@@ -22659,6 +22659,4876 @@
       </w:pPr>
     </w:p>
     <w:p/>
+    <w:p>
+      <w:pPr>
+        <w:spacing w:before="100" w:beforeAutospacing="1" w:after="100" w:afterAutospacing="1" w:line="240" w:lineRule="auto"/>
+        <w:rPr>
+          <w:rFonts w:ascii="Times New Roman" w:eastAsia="Times New Roman" w:hAnsi="Times New Roman" w:cs="Times New Roman"/>
+          <w:sz w:val="24"/>
+          <w:szCs w:val="24"/>
+          <w:lang w:eastAsia="en-IN"/>
+        </w:rPr>
+      </w:pPr>
+      <w:r>
+        <w:rPr>
+          <w:rFonts w:ascii="Times New Roman" w:eastAsia="Times New Roman" w:hAnsi="Times New Roman" w:cs="Times New Roman"/>
+          <w:sz w:val="24"/>
+          <w:szCs w:val="24"/>
+          <w:lang w:eastAsia="en-IN"/>
+        </w:rPr>
+        <w:t>titanic-ml-</w:t>
+      </w:r>
+      <w:proofErr w:type="spellStart"/>
+      <w:r>
+        <w:rPr>
+          <w:rFonts w:ascii="Times New Roman" w:eastAsia="Times New Roman" w:hAnsi="Times New Roman" w:cs="Times New Roman"/>
+          <w:sz w:val="24"/>
+          <w:szCs w:val="24"/>
+          <w:lang w:eastAsia="en-IN"/>
+        </w:rPr>
+        <w:t>api</w:t>
+      </w:r>
+      <w:proofErr w:type="spellEnd"/>
+      <w:r>
+        <w:rPr>
+          <w:rFonts w:ascii="Times New Roman" w:eastAsia="Times New Roman" w:hAnsi="Times New Roman" w:cs="Times New Roman"/>
+          <w:sz w:val="24"/>
+          <w:szCs w:val="24"/>
+          <w:lang w:eastAsia="en-IN"/>
+        </w:rPr>
+        <w:t>/</w:t>
+      </w:r>
+    </w:p>
+    <w:p>
+      <w:pPr>
+        <w:spacing w:before="100" w:beforeAutospacing="1" w:after="100" w:afterAutospacing="1" w:line="240" w:lineRule="auto"/>
+        <w:rPr>
+          <w:rFonts w:ascii="Times New Roman" w:eastAsia="Times New Roman" w:hAnsi="Times New Roman" w:cs="Times New Roman"/>
+          <w:sz w:val="24"/>
+          <w:szCs w:val="24"/>
+          <w:lang w:eastAsia="en-IN"/>
+        </w:rPr>
+      </w:pPr>
+      <w:r>
+        <w:rPr>
+          <w:rFonts w:ascii="Times New Roman" w:eastAsia="Times New Roman" w:hAnsi="Times New Roman" w:cs="Times New Roman"/>
+          <w:sz w:val="24"/>
+          <w:szCs w:val="24"/>
+          <w:lang w:eastAsia="en-IN"/>
+        </w:rPr>
+        <w:t>│</w:t>
+      </w:r>
+    </w:p>
+    <w:p>
+      <w:pPr>
+        <w:spacing w:before="100" w:beforeAutospacing="1" w:after="100" w:afterAutospacing="1" w:line="240" w:lineRule="auto"/>
+        <w:rPr>
+          <w:rFonts w:ascii="Times New Roman" w:eastAsia="Times New Roman" w:hAnsi="Times New Roman" w:cs="Times New Roman"/>
+          <w:sz w:val="24"/>
+          <w:szCs w:val="24"/>
+          <w:lang w:eastAsia="en-IN"/>
+        </w:rPr>
+      </w:pPr>
+      <w:r>
+        <w:rPr>
+          <w:rFonts w:ascii="Times New Roman" w:eastAsia="Times New Roman" w:hAnsi="Times New Roman" w:cs="Times New Roman"/>
+          <w:sz w:val="24"/>
+          <w:szCs w:val="24"/>
+          <w:lang w:eastAsia="en-IN"/>
+        </w:rPr>
+        <w:t>├── app/</w:t>
+      </w:r>
+    </w:p>
+    <w:p>
+      <w:pPr>
+        <w:spacing w:before="100" w:beforeAutospacing="1" w:after="100" w:afterAutospacing="1" w:line="240" w:lineRule="auto"/>
+        <w:rPr>
+          <w:rFonts w:ascii="Times New Roman" w:eastAsia="Times New Roman" w:hAnsi="Times New Roman" w:cs="Times New Roman"/>
+          <w:sz w:val="24"/>
+          <w:szCs w:val="24"/>
+          <w:lang w:eastAsia="en-IN"/>
+        </w:rPr>
+      </w:pPr>
+      <w:r>
+        <w:rPr>
+          <w:rFonts w:ascii="Times New Roman" w:eastAsia="Times New Roman" w:hAnsi="Times New Roman" w:cs="Times New Roman"/>
+          <w:sz w:val="24"/>
+          <w:szCs w:val="24"/>
+          <w:lang w:eastAsia="en-IN"/>
+        </w:rPr>
+        <w:t>├── data/</w:t>
+      </w:r>
+    </w:p>
+    <w:p>
+      <w:pPr>
+        <w:spacing w:before="100" w:beforeAutospacing="1" w:after="100" w:afterAutospacing="1" w:line="240" w:lineRule="auto"/>
+        <w:rPr>
+          <w:rFonts w:ascii="Times New Roman" w:eastAsia="Times New Roman" w:hAnsi="Times New Roman" w:cs="Times New Roman"/>
+          <w:sz w:val="24"/>
+          <w:szCs w:val="24"/>
+          <w:lang w:eastAsia="en-IN"/>
+        </w:rPr>
+      </w:pPr>
+      <w:r>
+        <w:rPr>
+          <w:rFonts w:ascii="Times New Roman" w:eastAsia="Times New Roman" w:hAnsi="Times New Roman" w:cs="Times New Roman"/>
+          <w:sz w:val="24"/>
+          <w:szCs w:val="24"/>
+          <w:lang w:eastAsia="en-IN"/>
+        </w:rPr>
+        <w:t xml:space="preserve">├── </w:t>
+      </w:r>
+      <w:proofErr w:type="spellStart"/>
+      <w:r>
+        <w:rPr>
+          <w:rFonts w:ascii="Times New Roman" w:eastAsia="Times New Roman" w:hAnsi="Times New Roman" w:cs="Times New Roman"/>
+          <w:sz w:val="24"/>
+          <w:szCs w:val="24"/>
+          <w:lang w:eastAsia="en-IN"/>
+        </w:rPr>
+        <w:t>mlruns</w:t>
+      </w:r>
+      <w:proofErr w:type="spellEnd"/>
+      <w:r>
+        <w:rPr>
+          <w:rFonts w:ascii="Times New Roman" w:eastAsia="Times New Roman" w:hAnsi="Times New Roman" w:cs="Times New Roman"/>
+          <w:sz w:val="24"/>
+          <w:szCs w:val="24"/>
+          <w:lang w:eastAsia="en-IN"/>
+        </w:rPr>
+        <w:t>/</w:t>
+      </w:r>
+    </w:p>
+    <w:p>
+      <w:pPr>
+        <w:spacing w:before="100" w:beforeAutospacing="1" w:after="100" w:afterAutospacing="1" w:line="240" w:lineRule="auto"/>
+        <w:rPr>
+          <w:rFonts w:ascii="Times New Roman" w:eastAsia="Times New Roman" w:hAnsi="Times New Roman" w:cs="Times New Roman"/>
+          <w:sz w:val="24"/>
+          <w:szCs w:val="24"/>
+          <w:lang w:eastAsia="en-IN"/>
+        </w:rPr>
+      </w:pPr>
+      <w:r>
+        <w:rPr>
+          <w:rFonts w:ascii="Times New Roman" w:eastAsia="Times New Roman" w:hAnsi="Times New Roman" w:cs="Times New Roman"/>
+          <w:sz w:val="24"/>
+          <w:szCs w:val="24"/>
+          <w:lang w:eastAsia="en-IN"/>
+        </w:rPr>
+        <w:t>├── model/</w:t>
+      </w:r>
+    </w:p>
+    <w:p>
+      <w:pPr>
+        <w:spacing w:before="100" w:beforeAutospacing="1" w:after="100" w:afterAutospacing="1" w:line="240" w:lineRule="auto"/>
+        <w:rPr>
+          <w:rFonts w:ascii="Times New Roman" w:eastAsia="Times New Roman" w:hAnsi="Times New Roman" w:cs="Times New Roman"/>
+          <w:sz w:val="24"/>
+          <w:szCs w:val="24"/>
+          <w:lang w:eastAsia="en-IN"/>
+        </w:rPr>
+      </w:pPr>
+      <w:r>
+        <w:rPr>
+          <w:rFonts w:ascii="Times New Roman" w:eastAsia="Times New Roman" w:hAnsi="Times New Roman" w:cs="Times New Roman"/>
+          <w:sz w:val="24"/>
+          <w:szCs w:val="24"/>
+          <w:lang w:eastAsia="en-IN"/>
+        </w:rPr>
+        <w:t xml:space="preserve">├── </w:t>
+      </w:r>
+      <w:proofErr w:type="spellStart"/>
+      <w:r>
+        <w:rPr>
+          <w:rFonts w:ascii="Times New Roman" w:eastAsia="Times New Roman" w:hAnsi="Times New Roman" w:cs="Times New Roman"/>
+          <w:sz w:val="24"/>
+          <w:szCs w:val="24"/>
+          <w:lang w:eastAsia="en-IN"/>
+        </w:rPr>
+        <w:t>venv</w:t>
+      </w:r>
+      <w:proofErr w:type="spellEnd"/>
+      <w:r>
+        <w:rPr>
+          <w:rFonts w:ascii="Times New Roman" w:eastAsia="Times New Roman" w:hAnsi="Times New Roman" w:cs="Times New Roman"/>
+          <w:sz w:val="24"/>
+          <w:szCs w:val="24"/>
+          <w:lang w:eastAsia="en-IN"/>
+        </w:rPr>
+        <w:t>/</w:t>
+      </w:r>
+    </w:p>
+    <w:p>
+      <w:r>
+        <w:t xml:space="preserve"> |----- </w:t>
+      </w:r>
+      <w:proofErr w:type="spellStart"/>
+      <w:r>
+        <w:t>mlflow.db</w:t>
+      </w:r>
+      <w:proofErr w:type="spellEnd"/>
+    </w:p>
+    <w:p>
+      <w:r>
+        <w:t xml:space="preserve"> |----- requiremnets.txt</w:t>
+      </w:r>
+      <w:r>
+        <w:t xml:space="preserve">     </w:t>
+      </w:r>
+    </w:p>
+    <w:p>
+      <w:pPr>
+        <w:spacing w:before="100" w:beforeAutospacing="1" w:after="100" w:afterAutospacing="1" w:line="240" w:lineRule="auto"/>
+        <w:rPr>
+          <w:rFonts w:ascii="Times New Roman" w:eastAsia="Times New Roman" w:hAnsi="Times New Roman" w:cs="Times New Roman"/>
+          <w:sz w:val="24"/>
+          <w:szCs w:val="24"/>
+          <w:lang w:eastAsia="en-IN"/>
+        </w:rPr>
+      </w:pPr>
+      <w:r>
+        <w:rPr>
+          <w:rFonts w:ascii="Times New Roman" w:eastAsia="Times New Roman" w:hAnsi="Times New Roman" w:cs="Times New Roman"/>
+          <w:sz w:val="24"/>
+          <w:szCs w:val="24"/>
+          <w:lang w:eastAsia="en-IN"/>
+        </w:rPr>
+        <w:lastRenderedPageBreak/>
+        <w:t>You already have:</w:t>
+      </w:r>
+    </w:p>
+    <w:p>
+      <w:pPr>
+        <w:tabs>
+          <w:tab w:val="left" w:pos="916"/>
+          <w:tab w:val="left" w:pos="1832"/>
+          <w:tab w:val="left" w:pos="2748"/>
+          <w:tab w:val="left" w:pos="3664"/>
+          <w:tab w:val="left" w:pos="4580"/>
+          <w:tab w:val="left" w:pos="5496"/>
+          <w:tab w:val="left" w:pos="6412"/>
+          <w:tab w:val="left" w:pos="7328"/>
+          <w:tab w:val="left" w:pos="8244"/>
+          <w:tab w:val="left" w:pos="9160"/>
+          <w:tab w:val="left" w:pos="10076"/>
+          <w:tab w:val="left" w:pos="10992"/>
+          <w:tab w:val="left" w:pos="11908"/>
+          <w:tab w:val="left" w:pos="12824"/>
+          <w:tab w:val="left" w:pos="13740"/>
+          <w:tab w:val="left" w:pos="14656"/>
+        </w:tabs>
+        <w:spacing w:after="0" w:line="240" w:lineRule="auto"/>
+        <w:rPr>
+          <w:rFonts w:ascii="Courier New" w:eastAsia="Times New Roman" w:hAnsi="Courier New" w:cs="Courier New"/>
+          <w:sz w:val="20"/>
+          <w:szCs w:val="20"/>
+          <w:lang w:eastAsia="en-IN"/>
+        </w:rPr>
+      </w:pPr>
+      <w:r>
+        <w:rPr>
+          <w:rFonts w:ascii="Courier New" w:eastAsia="Times New Roman" w:hAnsi="Courier New" w:cs="Courier New"/>
+          <w:sz w:val="20"/>
+          <w:szCs w:val="20"/>
+          <w:lang w:eastAsia="en-IN"/>
+        </w:rPr>
+        <w:t>(</w:t>
+      </w:r>
+      <w:proofErr w:type="spellStart"/>
+      <w:r>
+        <w:rPr>
+          <w:rFonts w:ascii="Courier New" w:eastAsia="Times New Roman" w:hAnsi="Courier New" w:cs="Courier New"/>
+          <w:sz w:val="20"/>
+          <w:szCs w:val="20"/>
+          <w:lang w:eastAsia="en-IN"/>
+        </w:rPr>
+        <w:t>venv</w:t>
+      </w:r>
+      <w:proofErr w:type="spellEnd"/>
+      <w:r>
+        <w:rPr>
+          <w:rFonts w:ascii="Courier New" w:eastAsia="Times New Roman" w:hAnsi="Courier New" w:cs="Courier New"/>
+          <w:sz w:val="20"/>
+          <w:szCs w:val="20"/>
+          <w:lang w:eastAsia="en-IN"/>
+        </w:rPr>
+        <w:t>) PS C:\Users\hp\Documents\Austria\titanic-ml-api&gt;</w:t>
+      </w:r>
+    </w:p>
+    <w:p>
+      <w:pPr>
+        <w:spacing w:before="100" w:beforeAutospacing="1" w:after="100" w:afterAutospacing="1" w:line="240" w:lineRule="auto"/>
+        <w:rPr>
+          <w:rFonts w:ascii="Times New Roman" w:eastAsia="Times New Roman" w:hAnsi="Times New Roman" w:cs="Times New Roman"/>
+          <w:sz w:val="24"/>
+          <w:szCs w:val="24"/>
+          <w:lang w:eastAsia="en-IN"/>
+        </w:rPr>
+      </w:pPr>
+      <w:r>
+        <w:rPr>
+          <w:rFonts w:ascii="Segoe UI Emoji" w:eastAsia="Times New Roman" w:hAnsi="Segoe UI Emoji" w:cs="Segoe UI Emoji"/>
+          <w:sz w:val="24"/>
+          <w:szCs w:val="24"/>
+          <w:lang w:eastAsia="en-IN"/>
+        </w:rPr>
+        <w:t>✔</w:t>
+      </w:r>
+      <w:r>
+        <w:rPr>
+          <w:rFonts w:ascii="Times New Roman" w:eastAsia="Times New Roman" w:hAnsi="Times New Roman" w:cs="Times New Roman"/>
+          <w:sz w:val="24"/>
+          <w:szCs w:val="24"/>
+          <w:lang w:eastAsia="en-IN"/>
+        </w:rPr>
+        <w:t xml:space="preserve"> This is correct</w:t>
+      </w:r>
+      <w:r>
+        <w:rPr>
+          <w:rFonts w:ascii="Times New Roman" w:eastAsia="Times New Roman" w:hAnsi="Times New Roman" w:cs="Times New Roman"/>
+          <w:sz w:val="24"/>
+          <w:szCs w:val="24"/>
+          <w:lang w:eastAsia="en-IN"/>
+        </w:rPr>
+        <w:br/>
+      </w:r>
+      <w:r>
+        <w:rPr>
+          <w:rFonts w:ascii="Segoe UI Emoji" w:eastAsia="Times New Roman" w:hAnsi="Segoe UI Emoji" w:cs="Segoe UI Emoji"/>
+          <w:sz w:val="24"/>
+          <w:szCs w:val="24"/>
+          <w:lang w:eastAsia="en-IN"/>
+        </w:rPr>
+        <w:t>✔</w:t>
+      </w:r>
+      <w:r>
+        <w:rPr>
+          <w:rFonts w:ascii="Times New Roman" w:eastAsia="Times New Roman" w:hAnsi="Times New Roman" w:cs="Times New Roman"/>
+          <w:sz w:val="24"/>
+          <w:szCs w:val="24"/>
+          <w:lang w:eastAsia="en-IN"/>
+        </w:rPr>
+        <w:t xml:space="preserve"> Do NOT exit </w:t>
+      </w:r>
+      <w:proofErr w:type="spellStart"/>
+      <w:r>
+        <w:rPr>
+          <w:rFonts w:ascii="Times New Roman" w:eastAsia="Times New Roman" w:hAnsi="Times New Roman" w:cs="Times New Roman"/>
+          <w:sz w:val="24"/>
+          <w:szCs w:val="24"/>
+          <w:lang w:eastAsia="en-IN"/>
+        </w:rPr>
+        <w:t>venv</w:t>
+      </w:r>
+      <w:proofErr w:type="spellEnd"/>
+      <w:r>
+        <w:rPr>
+          <w:rFonts w:ascii="Times New Roman" w:eastAsia="Times New Roman" w:hAnsi="Times New Roman" w:cs="Times New Roman"/>
+          <w:sz w:val="24"/>
+          <w:szCs w:val="24"/>
+          <w:lang w:eastAsia="en-IN"/>
+        </w:rPr>
+        <w:t xml:space="preserve"> yet</w:t>
+      </w:r>
+    </w:p>
+    <w:p>
+      <w:pPr>
+        <w:spacing w:after="0" w:line="240" w:lineRule="auto"/>
+        <w:rPr>
+          <w:rFonts w:ascii="Times New Roman" w:eastAsia="Times New Roman" w:hAnsi="Times New Roman" w:cs="Times New Roman"/>
+          <w:sz w:val="24"/>
+          <w:szCs w:val="24"/>
+          <w:lang w:eastAsia="en-IN"/>
+        </w:rPr>
+      </w:pPr>
+      <w:r>
+        <w:rPr>
+          <w:rFonts w:ascii="Times New Roman" w:eastAsia="Times New Roman" w:hAnsi="Times New Roman" w:cs="Times New Roman"/>
+          <w:sz w:val="24"/>
+          <w:szCs w:val="24"/>
+          <w:lang w:eastAsia="en-IN"/>
+        </w:rPr>
+        <w:pict w14:anchorId="2F3F170F">
+          <v:rect id="_x0000_i1059" style="width:0;height:1.5pt" o:hralign="center" o:hrstd="t" o:hr="t" fillcolor="#a0a0a0" stroked="f"/>
+        </w:pict>
+      </w:r>
+    </w:p>
+    <w:p>
+      <w:pPr>
+        <w:spacing w:before="100" w:beforeAutospacing="1" w:after="100" w:afterAutospacing="1" w:line="240" w:lineRule="auto"/>
+        <w:outlineLvl w:val="0"/>
+        <w:rPr>
+          <w:rFonts w:ascii="Times New Roman" w:eastAsia="Times New Roman" w:hAnsi="Times New Roman" w:cs="Times New Roman"/>
+          <w:b/>
+          <w:bCs/>
+          <w:kern w:val="36"/>
+          <w:sz w:val="48"/>
+          <w:szCs w:val="48"/>
+          <w:lang w:eastAsia="en-IN"/>
+        </w:rPr>
+      </w:pPr>
+      <w:r>
+        <w:rPr>
+          <w:rFonts w:ascii="Segoe UI Emoji" w:eastAsia="Times New Roman" w:hAnsi="Segoe UI Emoji" w:cs="Segoe UI Emoji"/>
+          <w:b/>
+          <w:bCs/>
+          <w:kern w:val="36"/>
+          <w:sz w:val="48"/>
+          <w:szCs w:val="48"/>
+          <w:lang w:eastAsia="en-IN"/>
+        </w:rPr>
+        <w:t>🚀</w:t>
+      </w:r>
+      <w:r>
+        <w:rPr>
+          <w:rFonts w:ascii="Times New Roman" w:eastAsia="Times New Roman" w:hAnsi="Times New Roman" w:cs="Times New Roman"/>
+          <w:b/>
+          <w:bCs/>
+          <w:kern w:val="36"/>
+          <w:sz w:val="48"/>
+          <w:szCs w:val="48"/>
+          <w:lang w:eastAsia="en-IN"/>
+        </w:rPr>
+        <w:t xml:space="preserve"> STEP 2 — </w:t>
+      </w:r>
+      <w:proofErr w:type="gramStart"/>
+      <w:r>
+        <w:rPr>
+          <w:rFonts w:ascii="Times New Roman" w:eastAsia="Times New Roman" w:hAnsi="Times New Roman" w:cs="Times New Roman"/>
+          <w:b/>
+          <w:bCs/>
+          <w:kern w:val="36"/>
+          <w:sz w:val="48"/>
+          <w:szCs w:val="48"/>
+          <w:lang w:eastAsia="en-IN"/>
+        </w:rPr>
+        <w:t>CREATE .</w:t>
+      </w:r>
+      <w:proofErr w:type="spellStart"/>
+      <w:r>
+        <w:rPr>
+          <w:rFonts w:ascii="Times New Roman" w:eastAsia="Times New Roman" w:hAnsi="Times New Roman" w:cs="Times New Roman"/>
+          <w:b/>
+          <w:bCs/>
+          <w:kern w:val="36"/>
+          <w:sz w:val="48"/>
+          <w:szCs w:val="48"/>
+          <w:lang w:eastAsia="en-IN"/>
+        </w:rPr>
+        <w:t>gitignore</w:t>
+      </w:r>
+      <w:proofErr w:type="spellEnd"/>
+      <w:proofErr w:type="gramEnd"/>
+      <w:r>
+        <w:rPr>
+          <w:rFonts w:ascii="Times New Roman" w:eastAsia="Times New Roman" w:hAnsi="Times New Roman" w:cs="Times New Roman"/>
+          <w:b/>
+          <w:bCs/>
+          <w:kern w:val="36"/>
+          <w:sz w:val="48"/>
+          <w:szCs w:val="48"/>
+          <w:lang w:eastAsia="en-IN"/>
+        </w:rPr>
+        <w:t xml:space="preserve"> (MOST IMPORTANT STEP)</w:t>
+      </w:r>
+    </w:p>
+    <w:p>
+      <w:pPr>
+        <w:spacing w:before="100" w:beforeAutospacing="1" w:after="100" w:afterAutospacing="1" w:line="240" w:lineRule="auto"/>
+        <w:rPr>
+          <w:rFonts w:ascii="Times New Roman" w:eastAsia="Times New Roman" w:hAnsi="Times New Roman" w:cs="Times New Roman"/>
+          <w:sz w:val="24"/>
+          <w:szCs w:val="24"/>
+          <w:lang w:eastAsia="en-IN"/>
+        </w:rPr>
+      </w:pPr>
+      <w:r>
+        <w:rPr>
+          <w:rFonts w:ascii="Times New Roman" w:eastAsia="Times New Roman" w:hAnsi="Times New Roman" w:cs="Times New Roman"/>
+          <w:sz w:val="24"/>
+          <w:szCs w:val="24"/>
+          <w:lang w:eastAsia="en-IN"/>
+        </w:rPr>
+        <w:t>In VS Code:</w:t>
+      </w:r>
+    </w:p>
+    <w:p>
+      <w:pPr>
+        <w:spacing w:before="100" w:beforeAutospacing="1" w:after="100" w:afterAutospacing="1" w:line="240" w:lineRule="auto"/>
+        <w:rPr>
+          <w:rFonts w:ascii="Times New Roman" w:eastAsia="Times New Roman" w:hAnsi="Times New Roman" w:cs="Times New Roman"/>
+          <w:sz w:val="24"/>
+          <w:szCs w:val="24"/>
+          <w:lang w:eastAsia="en-IN"/>
+        </w:rPr>
+      </w:pPr>
+      <w:r>
+        <w:rPr>
+          <w:rFonts w:ascii="Segoe UI Emoji" w:eastAsia="Times New Roman" w:hAnsi="Segoe UI Emoji" w:cs="Segoe UI Emoji"/>
+          <w:sz w:val="24"/>
+          <w:szCs w:val="24"/>
+          <w:lang w:eastAsia="en-IN"/>
+        </w:rPr>
+        <w:t>👉</w:t>
+      </w:r>
+      <w:r>
+        <w:rPr>
+          <w:rFonts w:ascii="Times New Roman" w:eastAsia="Times New Roman" w:hAnsi="Times New Roman" w:cs="Times New Roman"/>
+          <w:sz w:val="24"/>
+          <w:szCs w:val="24"/>
+          <w:lang w:eastAsia="en-IN"/>
+        </w:rPr>
+        <w:t xml:space="preserve"> Right click root folder → New File </w:t>
+      </w:r>
+      <w:proofErr w:type="gramStart"/>
+      <w:r>
+        <w:rPr>
+          <w:rFonts w:ascii="Times New Roman" w:eastAsia="Times New Roman" w:hAnsi="Times New Roman" w:cs="Times New Roman"/>
+          <w:sz w:val="24"/>
+          <w:szCs w:val="24"/>
+          <w:lang w:eastAsia="en-IN"/>
+        </w:rPr>
+        <w:t xml:space="preserve">→ </w:t>
+      </w:r>
+      <w:r>
+        <w:rPr>
+          <w:rFonts w:ascii="Courier New" w:eastAsia="Times New Roman" w:hAnsi="Courier New" w:cs="Courier New"/>
+          <w:sz w:val="20"/>
+          <w:szCs w:val="20"/>
+          <w:lang w:eastAsia="en-IN"/>
+        </w:rPr>
+        <w:t>.</w:t>
+      </w:r>
+      <w:proofErr w:type="spellStart"/>
+      <w:r>
+        <w:rPr>
+          <w:rFonts w:ascii="Courier New" w:eastAsia="Times New Roman" w:hAnsi="Courier New" w:cs="Courier New"/>
+          <w:sz w:val="20"/>
+          <w:szCs w:val="20"/>
+          <w:lang w:eastAsia="en-IN"/>
+        </w:rPr>
+        <w:t>gitignore</w:t>
+      </w:r>
+      <w:proofErr w:type="spellEnd"/>
+      <w:proofErr w:type="gramEnd"/>
+    </w:p>
+    <w:p>
+      <w:pPr>
+        <w:spacing w:before="100" w:beforeAutospacing="1" w:after="100" w:afterAutospacing="1" w:line="240" w:lineRule="auto"/>
+        <w:rPr>
+          <w:rFonts w:ascii="Times New Roman" w:eastAsia="Times New Roman" w:hAnsi="Times New Roman" w:cs="Times New Roman"/>
+          <w:sz w:val="24"/>
+          <w:szCs w:val="24"/>
+          <w:lang w:eastAsia="en-IN"/>
+        </w:rPr>
+      </w:pPr>
+      <w:r>
+        <w:rPr>
+          <w:rFonts w:ascii="Times New Roman" w:eastAsia="Times New Roman" w:hAnsi="Times New Roman" w:cs="Times New Roman"/>
+          <w:sz w:val="24"/>
+          <w:szCs w:val="24"/>
+          <w:lang w:eastAsia="en-IN"/>
+        </w:rPr>
+        <w:t>Paste THIS:</w:t>
+      </w:r>
+    </w:p>
+    <w:p>
+      <w:pPr>
+        <w:tabs>
+          <w:tab w:val="left" w:pos="916"/>
+          <w:tab w:val="left" w:pos="1832"/>
+          <w:tab w:val="left" w:pos="2748"/>
+          <w:tab w:val="left" w:pos="3664"/>
+          <w:tab w:val="left" w:pos="4580"/>
+          <w:tab w:val="left" w:pos="5496"/>
+          <w:tab w:val="left" w:pos="6412"/>
+          <w:tab w:val="left" w:pos="7328"/>
+          <w:tab w:val="left" w:pos="8244"/>
+          <w:tab w:val="left" w:pos="9160"/>
+          <w:tab w:val="left" w:pos="10076"/>
+          <w:tab w:val="left" w:pos="10992"/>
+          <w:tab w:val="left" w:pos="11908"/>
+          <w:tab w:val="left" w:pos="12824"/>
+          <w:tab w:val="left" w:pos="13740"/>
+          <w:tab w:val="left" w:pos="14656"/>
+        </w:tabs>
+        <w:spacing w:after="0" w:line="240" w:lineRule="auto"/>
+        <w:rPr>
+          <w:rFonts w:ascii="Courier New" w:eastAsia="Times New Roman" w:hAnsi="Courier New" w:cs="Courier New"/>
+          <w:sz w:val="20"/>
+          <w:szCs w:val="20"/>
+          <w:lang w:eastAsia="en-IN"/>
+        </w:rPr>
+      </w:pPr>
+      <w:r>
+        <w:rPr>
+          <w:rFonts w:ascii="Courier New" w:eastAsia="Times New Roman" w:hAnsi="Courier New" w:cs="Courier New"/>
+          <w:sz w:val="20"/>
+          <w:szCs w:val="20"/>
+          <w:lang w:eastAsia="en-IN"/>
+        </w:rPr>
+        <w:t># Virtual environment</w:t>
+      </w:r>
+      <w:r>
+        <w:rPr>
+          <w:rFonts w:ascii="Courier New" w:eastAsia="Times New Roman" w:hAnsi="Courier New" w:cs="Courier New"/>
+          <w:sz w:val="20"/>
+          <w:szCs w:val="20"/>
+          <w:lang w:eastAsia="en-IN"/>
+        </w:rPr>
+        <w:br/>
+      </w:r>
+      <w:proofErr w:type="spellStart"/>
+      <w:r>
+        <w:rPr>
+          <w:rFonts w:ascii="Courier New" w:eastAsia="Times New Roman" w:hAnsi="Courier New" w:cs="Courier New"/>
+          <w:sz w:val="20"/>
+          <w:szCs w:val="20"/>
+          <w:lang w:eastAsia="en-IN"/>
+        </w:rPr>
+        <w:t>venv</w:t>
+      </w:r>
+      <w:proofErr w:type="spellEnd"/>
+      <w:r>
+        <w:rPr>
+          <w:rFonts w:ascii="Courier New" w:eastAsia="Times New Roman" w:hAnsi="Courier New" w:cs="Courier New"/>
+          <w:sz w:val="20"/>
+          <w:szCs w:val="20"/>
+          <w:lang w:eastAsia="en-IN"/>
+        </w:rPr>
+        <w:t>/</w:t>
+      </w:r>
+      <w:r>
+        <w:rPr>
+          <w:rFonts w:ascii="Courier New" w:eastAsia="Times New Roman" w:hAnsi="Courier New" w:cs="Courier New"/>
+          <w:sz w:val="20"/>
+          <w:szCs w:val="20"/>
+          <w:lang w:eastAsia="en-IN"/>
+        </w:rPr>
+        <w:br/>
+      </w:r>
+      <w:r>
+        <w:rPr>
+          <w:rFonts w:ascii="Courier New" w:eastAsia="Times New Roman" w:hAnsi="Courier New" w:cs="Courier New"/>
+          <w:sz w:val="20"/>
+          <w:szCs w:val="20"/>
+          <w:lang w:eastAsia="en-IN"/>
+        </w:rPr>
+        <w:br/>
+        <w:t xml:space="preserve"># </w:t>
+      </w:r>
+      <w:proofErr w:type="spellStart"/>
+      <w:r>
+        <w:rPr>
+          <w:rFonts w:ascii="Courier New" w:eastAsia="Times New Roman" w:hAnsi="Courier New" w:cs="Courier New"/>
+          <w:sz w:val="20"/>
+          <w:szCs w:val="20"/>
+          <w:lang w:eastAsia="en-IN"/>
+        </w:rPr>
+        <w:t>MLflow</w:t>
+      </w:r>
+      <w:proofErr w:type="spellEnd"/>
+      <w:r>
+        <w:rPr>
+          <w:rFonts w:ascii="Courier New" w:eastAsia="Times New Roman" w:hAnsi="Courier New" w:cs="Courier New"/>
+          <w:sz w:val="20"/>
+          <w:szCs w:val="20"/>
+          <w:lang w:eastAsia="en-IN"/>
+        </w:rPr>
+        <w:t xml:space="preserve"> artifacts</w:t>
+      </w:r>
+      <w:r>
+        <w:rPr>
+          <w:rFonts w:ascii="Courier New" w:eastAsia="Times New Roman" w:hAnsi="Courier New" w:cs="Courier New"/>
+          <w:sz w:val="20"/>
+          <w:szCs w:val="20"/>
+          <w:lang w:eastAsia="en-IN"/>
+        </w:rPr>
+        <w:br/>
+      </w:r>
+      <w:proofErr w:type="spellStart"/>
+      <w:r>
+        <w:rPr>
+          <w:rFonts w:ascii="Courier New" w:eastAsia="Times New Roman" w:hAnsi="Courier New" w:cs="Courier New"/>
+          <w:sz w:val="20"/>
+          <w:szCs w:val="20"/>
+          <w:lang w:eastAsia="en-IN"/>
+        </w:rPr>
+        <w:t>mlruns</w:t>
+      </w:r>
+      <w:proofErr w:type="spellEnd"/>
+      <w:r>
+        <w:rPr>
+          <w:rFonts w:ascii="Courier New" w:eastAsia="Times New Roman" w:hAnsi="Courier New" w:cs="Courier New"/>
+          <w:sz w:val="20"/>
+          <w:szCs w:val="20"/>
+          <w:lang w:eastAsia="en-IN"/>
+        </w:rPr>
+        <w:t>/</w:t>
+      </w:r>
+      <w:r>
+        <w:rPr>
+          <w:rFonts w:ascii="Courier New" w:eastAsia="Times New Roman" w:hAnsi="Courier New" w:cs="Courier New"/>
+          <w:sz w:val="20"/>
+          <w:szCs w:val="20"/>
+          <w:lang w:eastAsia="en-IN"/>
+        </w:rPr>
+        <w:br/>
+      </w:r>
+      <w:proofErr w:type="spellStart"/>
+      <w:r>
+        <w:rPr>
+          <w:rFonts w:ascii="Courier New" w:eastAsia="Times New Roman" w:hAnsi="Courier New" w:cs="Courier New"/>
+          <w:sz w:val="20"/>
+          <w:szCs w:val="20"/>
+          <w:lang w:eastAsia="en-IN"/>
+        </w:rPr>
+        <w:t>mlflow.db</w:t>
+      </w:r>
+      <w:proofErr w:type="spellEnd"/>
+      <w:r>
+        <w:rPr>
+          <w:rFonts w:ascii="Courier New" w:eastAsia="Times New Roman" w:hAnsi="Courier New" w:cs="Courier New"/>
+          <w:sz w:val="20"/>
+          <w:szCs w:val="20"/>
+          <w:lang w:eastAsia="en-IN"/>
+        </w:rPr>
+        <w:br/>
+      </w:r>
+      <w:r>
+        <w:rPr>
+          <w:rFonts w:ascii="Courier New" w:eastAsia="Times New Roman" w:hAnsi="Courier New" w:cs="Courier New"/>
+          <w:sz w:val="20"/>
+          <w:szCs w:val="20"/>
+          <w:lang w:eastAsia="en-IN"/>
+        </w:rPr>
+        <w:br/>
+        <w:t># Python cache</w:t>
+      </w:r>
+      <w:r>
+        <w:rPr>
+          <w:rFonts w:ascii="Courier New" w:eastAsia="Times New Roman" w:hAnsi="Courier New" w:cs="Courier New"/>
+          <w:sz w:val="20"/>
+          <w:szCs w:val="20"/>
+          <w:lang w:eastAsia="en-IN"/>
+        </w:rPr>
+        <w:br/>
+        <w:t>__</w:t>
+      </w:r>
+      <w:proofErr w:type="spellStart"/>
+      <w:r>
+        <w:rPr>
+          <w:rFonts w:ascii="Courier New" w:eastAsia="Times New Roman" w:hAnsi="Courier New" w:cs="Courier New"/>
+          <w:sz w:val="20"/>
+          <w:szCs w:val="20"/>
+          <w:lang w:eastAsia="en-IN"/>
+        </w:rPr>
+        <w:t>pycache</w:t>
+      </w:r>
+      <w:proofErr w:type="spellEnd"/>
+      <w:r>
+        <w:rPr>
+          <w:rFonts w:ascii="Courier New" w:eastAsia="Times New Roman" w:hAnsi="Courier New" w:cs="Courier New"/>
+          <w:sz w:val="20"/>
+          <w:szCs w:val="20"/>
+          <w:lang w:eastAsia="en-IN"/>
+        </w:rPr>
+        <w:t>__/</w:t>
+      </w:r>
+      <w:r>
+        <w:rPr>
+          <w:rFonts w:ascii="Courier New" w:eastAsia="Times New Roman" w:hAnsi="Courier New" w:cs="Courier New"/>
+          <w:sz w:val="20"/>
+          <w:szCs w:val="20"/>
+          <w:lang w:eastAsia="en-IN"/>
+        </w:rPr>
+        <w:br/>
+        <w:t>*.</w:t>
+      </w:r>
+      <w:proofErr w:type="spellStart"/>
+      <w:r>
+        <w:rPr>
+          <w:rFonts w:ascii="Courier New" w:eastAsia="Times New Roman" w:hAnsi="Courier New" w:cs="Courier New"/>
+          <w:sz w:val="20"/>
+          <w:szCs w:val="20"/>
+          <w:lang w:eastAsia="en-IN"/>
+        </w:rPr>
+        <w:t>pyc</w:t>
+      </w:r>
+      <w:proofErr w:type="spellEnd"/>
+      <w:r>
+        <w:rPr>
+          <w:rFonts w:ascii="Courier New" w:eastAsia="Times New Roman" w:hAnsi="Courier New" w:cs="Courier New"/>
+          <w:sz w:val="20"/>
+          <w:szCs w:val="20"/>
+          <w:lang w:eastAsia="en-IN"/>
+        </w:rPr>
+        <w:br/>
+      </w:r>
+      <w:r>
+        <w:rPr>
+          <w:rFonts w:ascii="Courier New" w:eastAsia="Times New Roman" w:hAnsi="Courier New" w:cs="Courier New"/>
+          <w:sz w:val="20"/>
+          <w:szCs w:val="20"/>
+          <w:lang w:eastAsia="en-IN"/>
+        </w:rPr>
+        <w:br/>
+        <w:t># Environment files</w:t>
+      </w:r>
+      <w:r>
+        <w:rPr>
+          <w:rFonts w:ascii="Courier New" w:eastAsia="Times New Roman" w:hAnsi="Courier New" w:cs="Courier New"/>
+          <w:sz w:val="20"/>
+          <w:szCs w:val="20"/>
+          <w:lang w:eastAsia="en-IN"/>
+        </w:rPr>
+        <w:br/>
+        <w:t>.env</w:t>
+      </w:r>
+      <w:r>
+        <w:rPr>
+          <w:rFonts w:ascii="Courier New" w:eastAsia="Times New Roman" w:hAnsi="Courier New" w:cs="Courier New"/>
+          <w:sz w:val="20"/>
+          <w:szCs w:val="20"/>
+          <w:lang w:eastAsia="en-IN"/>
+        </w:rPr>
+        <w:br/>
+      </w:r>
+      <w:r>
+        <w:rPr>
+          <w:rFonts w:ascii="Courier New" w:eastAsia="Times New Roman" w:hAnsi="Courier New" w:cs="Courier New"/>
+          <w:sz w:val="20"/>
+          <w:szCs w:val="20"/>
+          <w:lang w:eastAsia="en-IN"/>
+        </w:rPr>
+        <w:br/>
+        <w:t># OS files</w:t>
+      </w:r>
+      <w:r>
+        <w:rPr>
+          <w:rFonts w:ascii="Courier New" w:eastAsia="Times New Roman" w:hAnsi="Courier New" w:cs="Courier New"/>
+          <w:sz w:val="20"/>
+          <w:szCs w:val="20"/>
+          <w:lang w:eastAsia="en-IN"/>
+        </w:rPr>
+        <w:br/>
+        <w:t>.</w:t>
+      </w:r>
+      <w:proofErr w:type="spellStart"/>
+      <w:r>
+        <w:rPr>
+          <w:rFonts w:ascii="Courier New" w:eastAsia="Times New Roman" w:hAnsi="Courier New" w:cs="Courier New"/>
+          <w:sz w:val="20"/>
+          <w:szCs w:val="20"/>
+          <w:lang w:eastAsia="en-IN"/>
+        </w:rPr>
+        <w:t>DS_Store</w:t>
+      </w:r>
+      <w:proofErr w:type="spellEnd"/>
+    </w:p>
+    <w:p>
+      <w:pPr>
+        <w:spacing w:after="0" w:line="240" w:lineRule="auto"/>
+        <w:rPr>
+          <w:rFonts w:ascii="Times New Roman" w:eastAsia="Times New Roman" w:hAnsi="Times New Roman" w:cs="Times New Roman"/>
+          <w:sz w:val="24"/>
+          <w:szCs w:val="24"/>
+          <w:lang w:eastAsia="en-IN"/>
+        </w:rPr>
+      </w:pPr>
+      <w:r>
+        <w:rPr>
+          <w:rFonts w:ascii="Times New Roman" w:eastAsia="Times New Roman" w:hAnsi="Times New Roman" w:cs="Times New Roman"/>
+          <w:sz w:val="24"/>
+          <w:szCs w:val="24"/>
+          <w:lang w:eastAsia="en-IN"/>
+        </w:rPr>
+        <w:pict w14:anchorId="22646ED2">
+          <v:rect id="_x0000_i1060" style="width:0;height:1.5pt" o:hralign="center" o:hrstd="t" o:hr="t" fillcolor="#a0a0a0" stroked="f"/>
+        </w:pict>
+      </w:r>
+    </w:p>
+    <w:p>
+      <w:pPr>
+        <w:spacing w:before="100" w:beforeAutospacing="1" w:after="100" w:afterAutospacing="1" w:line="240" w:lineRule="auto"/>
+        <w:outlineLvl w:val="0"/>
+        <w:rPr>
+          <w:rFonts w:ascii="Times New Roman" w:eastAsia="Times New Roman" w:hAnsi="Times New Roman" w:cs="Times New Roman"/>
+          <w:b/>
+          <w:bCs/>
+          <w:kern w:val="36"/>
+          <w:sz w:val="48"/>
+          <w:szCs w:val="48"/>
+          <w:lang w:eastAsia="en-IN"/>
+        </w:rPr>
+      </w:pPr>
+      <w:r>
+        <w:rPr>
+          <w:rFonts w:ascii="Segoe UI Emoji" w:eastAsia="Times New Roman" w:hAnsi="Segoe UI Emoji" w:cs="Segoe UI Emoji"/>
+          <w:b/>
+          <w:bCs/>
+          <w:kern w:val="36"/>
+          <w:sz w:val="48"/>
+          <w:szCs w:val="48"/>
+          <w:lang w:eastAsia="en-IN"/>
+        </w:rPr>
+        <w:t>🚀</w:t>
+      </w:r>
+      <w:r>
+        <w:rPr>
+          <w:rFonts w:ascii="Times New Roman" w:eastAsia="Times New Roman" w:hAnsi="Times New Roman" w:cs="Times New Roman"/>
+          <w:b/>
+          <w:bCs/>
+          <w:kern w:val="36"/>
+          <w:sz w:val="48"/>
+          <w:szCs w:val="48"/>
+          <w:lang w:eastAsia="en-IN"/>
+        </w:rPr>
+        <w:t xml:space="preserve"> STEP 3 — FIX requirements.txt (VERY IMPORTANT)</w:t>
+      </w:r>
+    </w:p>
+    <w:p>
+      <w:pPr>
+        <w:spacing w:before="100" w:beforeAutospacing="1" w:after="100" w:afterAutospacing="1" w:line="240" w:lineRule="auto"/>
+        <w:rPr>
+          <w:rFonts w:ascii="Times New Roman" w:eastAsia="Times New Roman" w:hAnsi="Times New Roman" w:cs="Times New Roman"/>
+          <w:sz w:val="24"/>
+          <w:szCs w:val="24"/>
+          <w:lang w:eastAsia="en-IN"/>
+        </w:rPr>
+      </w:pPr>
+      <w:r>
+        <w:rPr>
+          <w:rFonts w:ascii="Times New Roman" w:eastAsia="Times New Roman" w:hAnsi="Times New Roman" w:cs="Times New Roman"/>
+          <w:sz w:val="24"/>
+          <w:szCs w:val="24"/>
+          <w:lang w:eastAsia="en-IN"/>
+        </w:rPr>
+        <w:t>Inside terminal run:</w:t>
+      </w:r>
+    </w:p>
+    <w:p>
+      <w:pPr>
+        <w:tabs>
+          <w:tab w:val="left" w:pos="916"/>
+          <w:tab w:val="left" w:pos="1832"/>
+          <w:tab w:val="left" w:pos="2748"/>
+          <w:tab w:val="left" w:pos="3664"/>
+          <w:tab w:val="left" w:pos="4580"/>
+          <w:tab w:val="left" w:pos="5496"/>
+          <w:tab w:val="left" w:pos="6412"/>
+          <w:tab w:val="left" w:pos="7328"/>
+          <w:tab w:val="left" w:pos="8244"/>
+          <w:tab w:val="left" w:pos="9160"/>
+          <w:tab w:val="left" w:pos="10076"/>
+          <w:tab w:val="left" w:pos="10992"/>
+          <w:tab w:val="left" w:pos="11908"/>
+          <w:tab w:val="left" w:pos="12824"/>
+          <w:tab w:val="left" w:pos="13740"/>
+          <w:tab w:val="left" w:pos="14656"/>
+        </w:tabs>
+        <w:spacing w:after="0" w:line="240" w:lineRule="auto"/>
+        <w:rPr>
+          <w:rFonts w:ascii="Courier New" w:eastAsia="Times New Roman" w:hAnsi="Courier New" w:cs="Courier New"/>
+          <w:sz w:val="20"/>
+          <w:szCs w:val="20"/>
+          <w:lang w:eastAsia="en-IN"/>
+        </w:rPr>
+      </w:pPr>
+      <w:r>
+        <w:rPr>
+          <w:rFonts w:ascii="Courier New" w:eastAsia="Times New Roman" w:hAnsi="Courier New" w:cs="Courier New"/>
+          <w:sz w:val="20"/>
+          <w:szCs w:val="20"/>
+          <w:lang w:eastAsia="en-IN"/>
+        </w:rPr>
+        <w:t>pip freeze &gt; requirements.txt</w:t>
+      </w:r>
+    </w:p>
+    <w:p>
+      <w:pPr>
+        <w:spacing w:before="100" w:beforeAutospacing="1" w:after="100" w:afterAutospacing="1" w:line="240" w:lineRule="auto"/>
+        <w:rPr>
+          <w:rFonts w:ascii="Times New Roman" w:eastAsia="Times New Roman" w:hAnsi="Times New Roman" w:cs="Times New Roman"/>
+          <w:sz w:val="24"/>
+          <w:szCs w:val="24"/>
+          <w:lang w:eastAsia="en-IN"/>
+        </w:rPr>
+      </w:pPr>
+      <w:r>
+        <w:rPr>
+          <w:rFonts w:ascii="Segoe UI Emoji" w:eastAsia="Times New Roman" w:hAnsi="Segoe UI Emoji" w:cs="Segoe UI Emoji"/>
+          <w:sz w:val="24"/>
+          <w:szCs w:val="24"/>
+          <w:lang w:eastAsia="en-IN"/>
+        </w:rPr>
+        <w:t>✔</w:t>
+      </w:r>
+      <w:r>
+        <w:rPr>
+          <w:rFonts w:ascii="Times New Roman" w:eastAsia="Times New Roman" w:hAnsi="Times New Roman" w:cs="Times New Roman"/>
+          <w:sz w:val="24"/>
+          <w:szCs w:val="24"/>
+          <w:lang w:eastAsia="en-IN"/>
+        </w:rPr>
+        <w:t xml:space="preserve"> This ensures correct spelling + full dependencies</w:t>
+      </w:r>
+    </w:p>
+    <w:p>
+      <w:pPr>
+        <w:spacing w:after="0" w:line="240" w:lineRule="auto"/>
+        <w:rPr>
+          <w:rFonts w:ascii="Times New Roman" w:eastAsia="Times New Roman" w:hAnsi="Times New Roman" w:cs="Times New Roman"/>
+          <w:sz w:val="24"/>
+          <w:szCs w:val="24"/>
+          <w:lang w:eastAsia="en-IN"/>
+        </w:rPr>
+      </w:pPr>
+      <w:r>
+        <w:rPr>
+          <w:rFonts w:ascii="Times New Roman" w:eastAsia="Times New Roman" w:hAnsi="Times New Roman" w:cs="Times New Roman"/>
+          <w:sz w:val="24"/>
+          <w:szCs w:val="24"/>
+          <w:lang w:eastAsia="en-IN"/>
+        </w:rPr>
+        <w:pict w14:anchorId="01FC3600">
+          <v:rect id="_x0000_i1061" style="width:0;height:1.5pt" o:hralign="center" o:hrstd="t" o:hr="t" fillcolor="#a0a0a0" stroked="f"/>
+        </w:pict>
+      </w:r>
+    </w:p>
+    <w:p>
+      <w:pPr>
+        <w:spacing w:before="100" w:beforeAutospacing="1" w:after="100" w:afterAutospacing="1" w:line="240" w:lineRule="auto"/>
+        <w:outlineLvl w:val="0"/>
+        <w:rPr>
+          <w:rFonts w:ascii="Times New Roman" w:eastAsia="Times New Roman" w:hAnsi="Times New Roman" w:cs="Times New Roman"/>
+          <w:b/>
+          <w:bCs/>
+          <w:kern w:val="36"/>
+          <w:sz w:val="48"/>
+          <w:szCs w:val="48"/>
+          <w:lang w:eastAsia="en-IN"/>
+        </w:rPr>
+      </w:pPr>
+      <w:r>
+        <w:rPr>
+          <w:rFonts w:ascii="Segoe UI Emoji" w:eastAsia="Times New Roman" w:hAnsi="Segoe UI Emoji" w:cs="Segoe UI Emoji"/>
+          <w:b/>
+          <w:bCs/>
+          <w:kern w:val="36"/>
+          <w:sz w:val="48"/>
+          <w:szCs w:val="48"/>
+          <w:lang w:eastAsia="en-IN"/>
+        </w:rPr>
+        <w:lastRenderedPageBreak/>
+        <w:t>🚀</w:t>
+      </w:r>
+      <w:r>
+        <w:rPr>
+          <w:rFonts w:ascii="Times New Roman" w:eastAsia="Times New Roman" w:hAnsi="Times New Roman" w:cs="Times New Roman"/>
+          <w:b/>
+          <w:bCs/>
+          <w:kern w:val="36"/>
+          <w:sz w:val="48"/>
+          <w:szCs w:val="48"/>
+          <w:lang w:eastAsia="en-IN"/>
+        </w:rPr>
+        <w:t xml:space="preserve"> STEP 4 — CREATE CI/CD (GitHub Actions)</w:t>
+      </w:r>
+    </w:p>
+    <w:p>
+      <w:pPr>
+        <w:spacing w:before="100" w:beforeAutospacing="1" w:after="100" w:afterAutospacing="1" w:line="240" w:lineRule="auto"/>
+        <w:rPr>
+          <w:rFonts w:ascii="Times New Roman" w:eastAsia="Times New Roman" w:hAnsi="Times New Roman" w:cs="Times New Roman"/>
+          <w:sz w:val="24"/>
+          <w:szCs w:val="24"/>
+          <w:lang w:eastAsia="en-IN"/>
+        </w:rPr>
+      </w:pPr>
+      <w:r>
+        <w:rPr>
+          <w:rFonts w:ascii="Times New Roman" w:eastAsia="Times New Roman" w:hAnsi="Times New Roman" w:cs="Times New Roman"/>
+          <w:sz w:val="24"/>
+          <w:szCs w:val="24"/>
+          <w:lang w:eastAsia="en-IN"/>
+        </w:rPr>
+        <w:t>Now create folders:</w:t>
+      </w:r>
+    </w:p>
+    <w:p>
+      <w:pPr>
+        <w:spacing w:before="100" w:beforeAutospacing="1" w:after="100" w:afterAutospacing="1" w:line="240" w:lineRule="auto"/>
+        <w:outlineLvl w:val="2"/>
+        <w:rPr>
+          <w:rFonts w:ascii="Times New Roman" w:eastAsia="Times New Roman" w:hAnsi="Times New Roman" w:cs="Times New Roman"/>
+          <w:b/>
+          <w:bCs/>
+          <w:sz w:val="27"/>
+          <w:szCs w:val="27"/>
+          <w:lang w:eastAsia="en-IN"/>
+        </w:rPr>
+      </w:pPr>
+      <w:r>
+        <w:rPr>
+          <w:rFonts w:ascii="Times New Roman" w:eastAsia="Times New Roman" w:hAnsi="Times New Roman" w:cs="Times New Roman"/>
+          <w:b/>
+          <w:bCs/>
+          <w:sz w:val="27"/>
+          <w:szCs w:val="27"/>
+          <w:lang w:eastAsia="en-IN"/>
+        </w:rPr>
+        <w:t>In VS Code:</w:t>
+      </w:r>
+    </w:p>
+    <w:p>
+      <w:pPr>
+        <w:tabs>
+          <w:tab w:val="left" w:pos="916"/>
+          <w:tab w:val="left" w:pos="1832"/>
+          <w:tab w:val="left" w:pos="2748"/>
+          <w:tab w:val="left" w:pos="3664"/>
+          <w:tab w:val="left" w:pos="4580"/>
+          <w:tab w:val="left" w:pos="5496"/>
+          <w:tab w:val="left" w:pos="6412"/>
+          <w:tab w:val="left" w:pos="7328"/>
+          <w:tab w:val="left" w:pos="8244"/>
+          <w:tab w:val="left" w:pos="9160"/>
+          <w:tab w:val="left" w:pos="10076"/>
+          <w:tab w:val="left" w:pos="10992"/>
+          <w:tab w:val="left" w:pos="11908"/>
+          <w:tab w:val="left" w:pos="12824"/>
+          <w:tab w:val="left" w:pos="13740"/>
+          <w:tab w:val="left" w:pos="14656"/>
+        </w:tabs>
+        <w:spacing w:after="0" w:line="240" w:lineRule="auto"/>
+        <w:rPr>
+          <w:rFonts w:ascii="Courier New" w:eastAsia="Times New Roman" w:hAnsi="Courier New" w:cs="Courier New"/>
+          <w:sz w:val="20"/>
+          <w:szCs w:val="20"/>
+          <w:lang w:eastAsia="en-IN"/>
+        </w:rPr>
+      </w:pPr>
+      <w:proofErr w:type="gramStart"/>
+      <w:r>
+        <w:rPr>
+          <w:rFonts w:ascii="Courier New" w:eastAsia="Times New Roman" w:hAnsi="Courier New" w:cs="Courier New"/>
+          <w:sz w:val="20"/>
+          <w:szCs w:val="20"/>
+          <w:lang w:eastAsia="en-IN"/>
+        </w:rPr>
+        <w:t>.</w:t>
+      </w:r>
+      <w:proofErr w:type="spellStart"/>
+      <w:r>
+        <w:rPr>
+          <w:rFonts w:ascii="Courier New" w:eastAsia="Times New Roman" w:hAnsi="Courier New" w:cs="Courier New"/>
+          <w:sz w:val="20"/>
+          <w:szCs w:val="20"/>
+          <w:lang w:eastAsia="en-IN"/>
+        </w:rPr>
+        <w:t>github</w:t>
+      </w:r>
+      <w:proofErr w:type="spellEnd"/>
+      <w:proofErr w:type="gramEnd"/>
+      <w:r>
+        <w:rPr>
+          <w:rFonts w:ascii="Courier New" w:eastAsia="Times New Roman" w:hAnsi="Courier New" w:cs="Courier New"/>
+          <w:sz w:val="20"/>
+          <w:szCs w:val="20"/>
+          <w:lang w:eastAsia="en-IN"/>
+        </w:rPr>
+        <w:t>/workflows/</w:t>
+      </w:r>
+    </w:p>
+    <w:p>
+      <w:pPr>
+        <w:spacing w:before="100" w:beforeAutospacing="1" w:after="100" w:afterAutospacing="1" w:line="240" w:lineRule="auto"/>
+        <w:rPr>
+          <w:rFonts w:ascii="Times New Roman" w:eastAsia="Times New Roman" w:hAnsi="Times New Roman" w:cs="Times New Roman"/>
+          <w:sz w:val="24"/>
+          <w:szCs w:val="24"/>
+          <w:lang w:eastAsia="en-IN"/>
+        </w:rPr>
+      </w:pPr>
+      <w:r>
+        <w:rPr>
+          <w:rFonts w:ascii="Times New Roman" w:eastAsia="Times New Roman" w:hAnsi="Times New Roman" w:cs="Times New Roman"/>
+          <w:sz w:val="24"/>
+          <w:szCs w:val="24"/>
+          <w:lang w:eastAsia="en-IN"/>
+        </w:rPr>
+        <w:t>Then create file:</w:t>
+      </w:r>
+    </w:p>
+    <w:p>
+      <w:pPr>
+        <w:tabs>
+          <w:tab w:val="left" w:pos="916"/>
+          <w:tab w:val="left" w:pos="1832"/>
+          <w:tab w:val="left" w:pos="2748"/>
+          <w:tab w:val="left" w:pos="3664"/>
+          <w:tab w:val="left" w:pos="4580"/>
+          <w:tab w:val="left" w:pos="5496"/>
+          <w:tab w:val="left" w:pos="6412"/>
+          <w:tab w:val="left" w:pos="7328"/>
+          <w:tab w:val="left" w:pos="8244"/>
+          <w:tab w:val="left" w:pos="9160"/>
+          <w:tab w:val="left" w:pos="10076"/>
+          <w:tab w:val="left" w:pos="10992"/>
+          <w:tab w:val="left" w:pos="11908"/>
+          <w:tab w:val="left" w:pos="12824"/>
+          <w:tab w:val="left" w:pos="13740"/>
+          <w:tab w:val="left" w:pos="14656"/>
+        </w:tabs>
+        <w:spacing w:after="0" w:line="240" w:lineRule="auto"/>
+        <w:rPr>
+          <w:rFonts w:ascii="Courier New" w:eastAsia="Times New Roman" w:hAnsi="Courier New" w:cs="Courier New"/>
+          <w:sz w:val="20"/>
+          <w:szCs w:val="20"/>
+          <w:lang w:eastAsia="en-IN"/>
+        </w:rPr>
+      </w:pPr>
+      <w:r>
+        <w:rPr>
+          <w:rFonts w:ascii="Courier New" w:eastAsia="Times New Roman" w:hAnsi="Courier New" w:cs="Courier New"/>
+          <w:sz w:val="20"/>
+          <w:szCs w:val="20"/>
+          <w:lang w:eastAsia="en-IN"/>
+        </w:rPr>
+        <w:t>ci-</w:t>
+      </w:r>
+      <w:proofErr w:type="spellStart"/>
+      <w:r>
+        <w:rPr>
+          <w:rFonts w:ascii="Courier New" w:eastAsia="Times New Roman" w:hAnsi="Courier New" w:cs="Courier New"/>
+          <w:sz w:val="20"/>
+          <w:szCs w:val="20"/>
+          <w:lang w:eastAsia="en-IN"/>
+        </w:rPr>
+        <w:t>cd.yml</w:t>
+      </w:r>
+      <w:proofErr w:type="spellEnd"/>
+    </w:p>
+    <w:p>
+      <w:pPr>
+        <w:spacing w:before="100" w:beforeAutospacing="1" w:after="100" w:afterAutospacing="1" w:line="240" w:lineRule="auto"/>
+        <w:rPr>
+          <w:rFonts w:ascii="Times New Roman" w:eastAsia="Times New Roman" w:hAnsi="Times New Roman" w:cs="Times New Roman"/>
+          <w:sz w:val="24"/>
+          <w:szCs w:val="24"/>
+          <w:lang w:eastAsia="en-IN"/>
+        </w:rPr>
+      </w:pPr>
+      <w:r>
+        <w:rPr>
+          <w:rFonts w:ascii="Times New Roman" w:eastAsia="Times New Roman" w:hAnsi="Times New Roman" w:cs="Times New Roman"/>
+          <w:sz w:val="24"/>
+          <w:szCs w:val="24"/>
+          <w:lang w:eastAsia="en-IN"/>
+        </w:rPr>
+        <w:t>Paste:</w:t>
+      </w:r>
+    </w:p>
+    <w:p>
+      <w:pPr>
+        <w:tabs>
+          <w:tab w:val="left" w:pos="916"/>
+          <w:tab w:val="left" w:pos="1832"/>
+          <w:tab w:val="left" w:pos="2748"/>
+          <w:tab w:val="left" w:pos="3664"/>
+          <w:tab w:val="left" w:pos="4580"/>
+          <w:tab w:val="left" w:pos="5496"/>
+          <w:tab w:val="left" w:pos="6412"/>
+          <w:tab w:val="left" w:pos="7328"/>
+          <w:tab w:val="left" w:pos="8244"/>
+          <w:tab w:val="left" w:pos="9160"/>
+          <w:tab w:val="left" w:pos="10076"/>
+          <w:tab w:val="left" w:pos="10992"/>
+          <w:tab w:val="left" w:pos="11908"/>
+          <w:tab w:val="left" w:pos="12824"/>
+          <w:tab w:val="left" w:pos="13740"/>
+          <w:tab w:val="left" w:pos="14656"/>
+        </w:tabs>
+        <w:spacing w:after="0" w:line="240" w:lineRule="auto"/>
+        <w:rPr>
+          <w:rFonts w:ascii="Courier New" w:eastAsia="Times New Roman" w:hAnsi="Courier New" w:cs="Courier New"/>
+          <w:sz w:val="20"/>
+          <w:szCs w:val="20"/>
+          <w:lang w:eastAsia="en-IN"/>
+        </w:rPr>
+      </w:pPr>
+      <w:r>
+        <w:rPr>
+          <w:rFonts w:ascii="Courier New" w:eastAsia="Times New Roman" w:hAnsi="Courier New" w:cs="Courier New"/>
+          <w:sz w:val="20"/>
+          <w:szCs w:val="20"/>
+          <w:lang w:eastAsia="en-IN"/>
+        </w:rPr>
+        <w:t>name: Titanic ML CI/CD</w:t>
+      </w:r>
+      <w:r>
+        <w:rPr>
+          <w:rFonts w:ascii="Courier New" w:eastAsia="Times New Roman" w:hAnsi="Courier New" w:cs="Courier New"/>
+          <w:sz w:val="20"/>
+          <w:szCs w:val="20"/>
+          <w:lang w:eastAsia="en-IN"/>
+        </w:rPr>
+        <w:br/>
+      </w:r>
+      <w:r>
+        <w:rPr>
+          <w:rFonts w:ascii="Courier New" w:eastAsia="Times New Roman" w:hAnsi="Courier New" w:cs="Courier New"/>
+          <w:sz w:val="20"/>
+          <w:szCs w:val="20"/>
+          <w:lang w:eastAsia="en-IN"/>
+        </w:rPr>
+        <w:br/>
+        <w:t>on:</w:t>
+      </w:r>
+      <w:r>
+        <w:rPr>
+          <w:rFonts w:ascii="Courier New" w:eastAsia="Times New Roman" w:hAnsi="Courier New" w:cs="Courier New"/>
+          <w:sz w:val="20"/>
+          <w:szCs w:val="20"/>
+          <w:lang w:eastAsia="en-IN"/>
+        </w:rPr>
+        <w:br/>
+        <w:t xml:space="preserve">  push:</w:t>
+      </w:r>
+      <w:r>
+        <w:rPr>
+          <w:rFonts w:ascii="Courier New" w:eastAsia="Times New Roman" w:hAnsi="Courier New" w:cs="Courier New"/>
+          <w:sz w:val="20"/>
+          <w:szCs w:val="20"/>
+          <w:lang w:eastAsia="en-IN"/>
+        </w:rPr>
+        <w:br/>
+        <w:t xml:space="preserve">    branches: [ "main" ]</w:t>
+      </w:r>
+      <w:r>
+        <w:rPr>
+          <w:rFonts w:ascii="Courier New" w:eastAsia="Times New Roman" w:hAnsi="Courier New" w:cs="Courier New"/>
+          <w:sz w:val="20"/>
+          <w:szCs w:val="20"/>
+          <w:lang w:eastAsia="en-IN"/>
+        </w:rPr>
+        <w:br/>
+      </w:r>
+      <w:r>
+        <w:rPr>
+          <w:rFonts w:ascii="Courier New" w:eastAsia="Times New Roman" w:hAnsi="Courier New" w:cs="Courier New"/>
+          <w:sz w:val="20"/>
+          <w:szCs w:val="20"/>
+          <w:lang w:eastAsia="en-IN"/>
+        </w:rPr>
+        <w:br/>
+        <w:t>jobs:</w:t>
+      </w:r>
+      <w:r>
+        <w:rPr>
+          <w:rFonts w:ascii="Courier New" w:eastAsia="Times New Roman" w:hAnsi="Courier New" w:cs="Courier New"/>
+          <w:sz w:val="20"/>
+          <w:szCs w:val="20"/>
+          <w:lang w:eastAsia="en-IN"/>
+        </w:rPr>
+        <w:br/>
+        <w:t xml:space="preserve">  build:</w:t>
+      </w:r>
+      <w:r>
+        <w:rPr>
+          <w:rFonts w:ascii="Courier New" w:eastAsia="Times New Roman" w:hAnsi="Courier New" w:cs="Courier New"/>
+          <w:sz w:val="20"/>
+          <w:szCs w:val="20"/>
+          <w:lang w:eastAsia="en-IN"/>
+        </w:rPr>
+        <w:br/>
+        <w:t xml:space="preserve">    runs-on: ubuntu-latest</w:t>
+      </w:r>
+      <w:r>
+        <w:rPr>
+          <w:rFonts w:ascii="Courier New" w:eastAsia="Times New Roman" w:hAnsi="Courier New" w:cs="Courier New"/>
+          <w:sz w:val="20"/>
+          <w:szCs w:val="20"/>
+          <w:lang w:eastAsia="en-IN"/>
+        </w:rPr>
+        <w:br/>
+      </w:r>
+      <w:r>
+        <w:rPr>
+          <w:rFonts w:ascii="Courier New" w:eastAsia="Times New Roman" w:hAnsi="Courier New" w:cs="Courier New"/>
+          <w:sz w:val="20"/>
+          <w:szCs w:val="20"/>
+          <w:lang w:eastAsia="en-IN"/>
+        </w:rPr>
+        <w:br/>
+        <w:t xml:space="preserve">    steps:</w:t>
+      </w:r>
+      <w:r>
+        <w:rPr>
+          <w:rFonts w:ascii="Courier New" w:eastAsia="Times New Roman" w:hAnsi="Courier New" w:cs="Courier New"/>
+          <w:sz w:val="20"/>
+          <w:szCs w:val="20"/>
+          <w:lang w:eastAsia="en-IN"/>
+        </w:rPr>
+        <w:br/>
+        <w:t xml:space="preserve">      - name: Checkout repo</w:t>
+      </w:r>
+      <w:r>
+        <w:rPr>
+          <w:rFonts w:ascii="Courier New" w:eastAsia="Times New Roman" w:hAnsi="Courier New" w:cs="Courier New"/>
+          <w:sz w:val="20"/>
+          <w:szCs w:val="20"/>
+          <w:lang w:eastAsia="en-IN"/>
+        </w:rPr>
+        <w:br/>
+        <w:t xml:space="preserve">        uses: actions/checkout@v3</w:t>
+      </w:r>
+      <w:r>
+        <w:rPr>
+          <w:rFonts w:ascii="Courier New" w:eastAsia="Times New Roman" w:hAnsi="Courier New" w:cs="Courier New"/>
+          <w:sz w:val="20"/>
+          <w:szCs w:val="20"/>
+          <w:lang w:eastAsia="en-IN"/>
+        </w:rPr>
+        <w:br/>
+      </w:r>
+      <w:r>
+        <w:rPr>
+          <w:rFonts w:ascii="Courier New" w:eastAsia="Times New Roman" w:hAnsi="Courier New" w:cs="Courier New"/>
+          <w:sz w:val="20"/>
+          <w:szCs w:val="20"/>
+          <w:lang w:eastAsia="en-IN"/>
+        </w:rPr>
+        <w:br/>
+        <w:t xml:space="preserve">      - name: Setup Python</w:t>
+      </w:r>
+      <w:r>
+        <w:rPr>
+          <w:rFonts w:ascii="Courier New" w:eastAsia="Times New Roman" w:hAnsi="Courier New" w:cs="Courier New"/>
+          <w:sz w:val="20"/>
+          <w:szCs w:val="20"/>
+          <w:lang w:eastAsia="en-IN"/>
+        </w:rPr>
+        <w:br/>
+        <w:t xml:space="preserve">        uses: actions/setup-python@v4</w:t>
+      </w:r>
+      <w:r>
+        <w:rPr>
+          <w:rFonts w:ascii="Courier New" w:eastAsia="Times New Roman" w:hAnsi="Courier New" w:cs="Courier New"/>
+          <w:sz w:val="20"/>
+          <w:szCs w:val="20"/>
+          <w:lang w:eastAsia="en-IN"/>
+        </w:rPr>
+        <w:br/>
+        <w:t xml:space="preserve">        with:</w:t>
+      </w:r>
+      <w:r>
+        <w:rPr>
+          <w:rFonts w:ascii="Courier New" w:eastAsia="Times New Roman" w:hAnsi="Courier New" w:cs="Courier New"/>
+          <w:sz w:val="20"/>
+          <w:szCs w:val="20"/>
+          <w:lang w:eastAsia="en-IN"/>
+        </w:rPr>
+        <w:br/>
+        <w:t xml:space="preserve">          python-version: "3.10"</w:t>
+      </w:r>
+      <w:r>
+        <w:rPr>
+          <w:rFonts w:ascii="Courier New" w:eastAsia="Times New Roman" w:hAnsi="Courier New" w:cs="Courier New"/>
+          <w:sz w:val="20"/>
+          <w:szCs w:val="20"/>
+          <w:lang w:eastAsia="en-IN"/>
+        </w:rPr>
+        <w:br/>
+      </w:r>
+      <w:r>
+        <w:rPr>
+          <w:rFonts w:ascii="Courier New" w:eastAsia="Times New Roman" w:hAnsi="Courier New" w:cs="Courier New"/>
+          <w:sz w:val="20"/>
+          <w:szCs w:val="20"/>
+          <w:lang w:eastAsia="en-IN"/>
+        </w:rPr>
+        <w:br/>
+        <w:t xml:space="preserve">      - name: Install dependencies</w:t>
+      </w:r>
+      <w:r>
+        <w:rPr>
+          <w:rFonts w:ascii="Courier New" w:eastAsia="Times New Roman" w:hAnsi="Courier New" w:cs="Courier New"/>
+          <w:sz w:val="20"/>
+          <w:szCs w:val="20"/>
+          <w:lang w:eastAsia="en-IN"/>
+        </w:rPr>
+        <w:br/>
+        <w:t xml:space="preserve">        run: |</w:t>
+      </w:r>
+      <w:r>
+        <w:rPr>
+          <w:rFonts w:ascii="Courier New" w:eastAsia="Times New Roman" w:hAnsi="Courier New" w:cs="Courier New"/>
+          <w:sz w:val="20"/>
+          <w:szCs w:val="20"/>
+          <w:lang w:eastAsia="en-IN"/>
+        </w:rPr>
+        <w:br/>
+        <w:t xml:space="preserve">          pip install -r requirements.txt</w:t>
+      </w:r>
+      <w:r>
+        <w:rPr>
+          <w:rFonts w:ascii="Courier New" w:eastAsia="Times New Roman" w:hAnsi="Courier New" w:cs="Courier New"/>
+          <w:sz w:val="20"/>
+          <w:szCs w:val="20"/>
+          <w:lang w:eastAsia="en-IN"/>
+        </w:rPr>
+        <w:br/>
+      </w:r>
+      <w:r>
+        <w:rPr>
+          <w:rFonts w:ascii="Courier New" w:eastAsia="Times New Roman" w:hAnsi="Courier New" w:cs="Courier New"/>
+          <w:sz w:val="20"/>
+          <w:szCs w:val="20"/>
+          <w:lang w:eastAsia="en-IN"/>
+        </w:rPr>
+        <w:br/>
+        <w:t xml:space="preserve">      - name: Validate </w:t>
+      </w:r>
+      <w:proofErr w:type="spellStart"/>
+      <w:r>
+        <w:rPr>
+          <w:rFonts w:ascii="Courier New" w:eastAsia="Times New Roman" w:hAnsi="Courier New" w:cs="Courier New"/>
+          <w:sz w:val="20"/>
+          <w:szCs w:val="20"/>
+          <w:lang w:eastAsia="en-IN"/>
+        </w:rPr>
+        <w:t>FastAPI</w:t>
+      </w:r>
+      <w:proofErr w:type="spellEnd"/>
+      <w:r>
+        <w:rPr>
+          <w:rFonts w:ascii="Courier New" w:eastAsia="Times New Roman" w:hAnsi="Courier New" w:cs="Courier New"/>
+          <w:sz w:val="20"/>
+          <w:szCs w:val="20"/>
+          <w:lang w:eastAsia="en-IN"/>
+        </w:rPr>
+        <w:t xml:space="preserve"> app import</w:t>
+      </w:r>
+      <w:r>
+        <w:rPr>
+          <w:rFonts w:ascii="Courier New" w:eastAsia="Times New Roman" w:hAnsi="Courier New" w:cs="Courier New"/>
+          <w:sz w:val="20"/>
+          <w:szCs w:val="20"/>
+          <w:lang w:eastAsia="en-IN"/>
+        </w:rPr>
+        <w:br/>
+        <w:t xml:space="preserve">        run: |</w:t>
+      </w:r>
+      <w:r>
+        <w:rPr>
+          <w:rFonts w:ascii="Courier New" w:eastAsia="Times New Roman" w:hAnsi="Courier New" w:cs="Courier New"/>
+          <w:sz w:val="20"/>
+          <w:szCs w:val="20"/>
+          <w:lang w:eastAsia="en-IN"/>
+        </w:rPr>
+        <w:br/>
+        <w:t xml:space="preserve">          python -c "from </w:t>
+      </w:r>
+      <w:proofErr w:type="spellStart"/>
+      <w:r>
+        <w:rPr>
+          <w:rFonts w:ascii="Courier New" w:eastAsia="Times New Roman" w:hAnsi="Courier New" w:cs="Courier New"/>
+          <w:sz w:val="20"/>
+          <w:szCs w:val="20"/>
+          <w:lang w:eastAsia="en-IN"/>
+        </w:rPr>
+        <w:t>app.main</w:t>
+      </w:r>
+      <w:proofErr w:type="spellEnd"/>
+      <w:r>
+        <w:rPr>
+          <w:rFonts w:ascii="Courier New" w:eastAsia="Times New Roman" w:hAnsi="Courier New" w:cs="Courier New"/>
+          <w:sz w:val="20"/>
+          <w:szCs w:val="20"/>
+          <w:lang w:eastAsia="en-IN"/>
+        </w:rPr>
+        <w:t xml:space="preserve"> import app; print('APP OK')"</w:t>
+      </w:r>
+    </w:p>
+    <w:p>
+      <w:pPr>
+        <w:pBdr>
+          <w:bottom w:val="single" w:sz="6" w:space="1" w:color="auto"/>
+        </w:pBdr>
+        <w:tabs>
+          <w:tab w:val="left" w:pos="916"/>
+          <w:tab w:val="left" w:pos="1832"/>
+          <w:tab w:val="left" w:pos="2748"/>
+          <w:tab w:val="left" w:pos="3664"/>
+          <w:tab w:val="left" w:pos="4580"/>
+          <w:tab w:val="left" w:pos="5496"/>
+          <w:tab w:val="left" w:pos="6412"/>
+          <w:tab w:val="left" w:pos="7328"/>
+          <w:tab w:val="left" w:pos="8244"/>
+          <w:tab w:val="left" w:pos="9160"/>
+          <w:tab w:val="left" w:pos="10076"/>
+          <w:tab w:val="left" w:pos="10992"/>
+          <w:tab w:val="left" w:pos="11908"/>
+          <w:tab w:val="left" w:pos="12824"/>
+          <w:tab w:val="left" w:pos="13740"/>
+          <w:tab w:val="left" w:pos="14656"/>
+        </w:tabs>
+        <w:spacing w:after="0" w:line="240" w:lineRule="auto"/>
+        <w:rPr>
+          <w:rFonts w:ascii="Courier New" w:eastAsia="Times New Roman" w:hAnsi="Courier New" w:cs="Courier New"/>
+          <w:sz w:val="20"/>
+          <w:szCs w:val="20"/>
+          <w:lang w:eastAsia="en-IN"/>
+        </w:rPr>
+      </w:pPr>
+    </w:p>
+    <w:p>
+      <w:pPr>
+        <w:pStyle w:val="Heading1"/>
+      </w:pPr>
+      <w:r>
+        <w:t>Install Git (IMPORTANT FIX)</w:t>
+      </w:r>
+    </w:p>
+    <w:p>
+      <w:pPr>
+        <w:pStyle w:val="Heading3"/>
+      </w:pPr>
+      <w:r>
+        <w:rPr>
+          <w:rFonts w:ascii="Segoe UI Emoji" w:hAnsi="Segoe UI Emoji" w:cs="Segoe UI Emoji"/>
+        </w:rPr>
+        <w:t>👉</w:t>
+      </w:r>
+      <w:r>
+        <w:t xml:space="preserve"> Download Git for Windows:</w:t>
+      </w:r>
+    </w:p>
+    <w:p>
+      <w:pPr>
+        <w:pStyle w:val="NormalWeb"/>
+      </w:pPr>
+      <w:r>
+        <w:t>Go here:</w:t>
+      </w:r>
+    </w:p>
+    <w:p>
+      <w:pPr>
+        <w:pStyle w:val="NormalWeb"/>
+      </w:pPr>
+      <w:hyperlink r:id="rId6" w:tgtFrame="_new" w:history="1">
+        <w:r>
+          <w:rPr>
+            <w:rStyle w:val="Hyperlink"/>
+          </w:rPr>
+          <w:t>https://git-scm.com/download/win</w:t>
+        </w:r>
+      </w:hyperlink>
+    </w:p>
+    <w:p>
+      <w:pPr>
+        <w:spacing w:before="100" w:beforeAutospacing="1" w:after="100" w:afterAutospacing="1" w:line="240" w:lineRule="auto"/>
+        <w:outlineLvl w:val="2"/>
+        <w:rPr>
+          <w:rFonts w:ascii="Times New Roman" w:eastAsia="Times New Roman" w:hAnsi="Times New Roman" w:cs="Times New Roman"/>
+          <w:b/>
+          <w:bCs/>
+          <w:sz w:val="27"/>
+          <w:szCs w:val="27"/>
+          <w:lang w:eastAsia="en-IN"/>
+        </w:rPr>
+      </w:pPr>
+      <w:r>
+        <w:rPr>
+          <w:rFonts w:ascii="Times New Roman" w:eastAsia="Times New Roman" w:hAnsi="Times New Roman" w:cs="Times New Roman"/>
+          <w:b/>
+          <w:bCs/>
+          <w:sz w:val="27"/>
+          <w:szCs w:val="27"/>
+          <w:lang w:eastAsia="en-IN"/>
+        </w:rPr>
+        <w:lastRenderedPageBreak/>
+        <w:t>During installation (VERY IMPORTANT settings):</w:t>
+      </w:r>
+    </w:p>
+    <w:p>
+      <w:pPr>
+        <w:spacing w:before="100" w:beforeAutospacing="1" w:after="100" w:afterAutospacing="1" w:line="240" w:lineRule="auto"/>
+        <w:rPr>
+          <w:rFonts w:ascii="Times New Roman" w:eastAsia="Times New Roman" w:hAnsi="Times New Roman" w:cs="Times New Roman"/>
+          <w:sz w:val="24"/>
+          <w:szCs w:val="24"/>
+          <w:lang w:eastAsia="en-IN"/>
+        </w:rPr>
+      </w:pPr>
+      <w:r>
+        <w:rPr>
+          <w:rFonts w:ascii="Times New Roman" w:eastAsia="Times New Roman" w:hAnsi="Times New Roman" w:cs="Times New Roman"/>
+          <w:sz w:val="24"/>
+          <w:szCs w:val="24"/>
+          <w:lang w:eastAsia="en-IN"/>
+        </w:rPr>
+        <w:t>When installer opens:</w:t>
+      </w:r>
+    </w:p>
+    <w:p>
+      <w:pPr>
+        <w:spacing w:before="100" w:beforeAutospacing="1" w:after="100" w:afterAutospacing="1" w:line="240" w:lineRule="auto"/>
+        <w:rPr>
+          <w:rFonts w:ascii="Times New Roman" w:eastAsia="Times New Roman" w:hAnsi="Times New Roman" w:cs="Times New Roman"/>
+          <w:sz w:val="24"/>
+          <w:szCs w:val="24"/>
+          <w:lang w:eastAsia="en-IN"/>
+        </w:rPr>
+      </w:pPr>
+      <w:r>
+        <w:rPr>
+          <w:rFonts w:ascii="Segoe UI Emoji" w:eastAsia="Times New Roman" w:hAnsi="Segoe UI Emoji" w:cs="Segoe UI Emoji"/>
+          <w:sz w:val="24"/>
+          <w:szCs w:val="24"/>
+          <w:lang w:eastAsia="en-IN"/>
+        </w:rPr>
+        <w:t>✔</w:t>
+      </w:r>
+      <w:r>
+        <w:rPr>
+          <w:rFonts w:ascii="Times New Roman" w:eastAsia="Times New Roman" w:hAnsi="Times New Roman" w:cs="Times New Roman"/>
+          <w:sz w:val="24"/>
+          <w:szCs w:val="24"/>
+          <w:lang w:eastAsia="en-IN"/>
+        </w:rPr>
+        <w:t xml:space="preserve"> Keep everything default</w:t>
+      </w:r>
+      <w:r>
+        <w:rPr>
+          <w:rFonts w:ascii="Times New Roman" w:eastAsia="Times New Roman" w:hAnsi="Times New Roman" w:cs="Times New Roman"/>
+          <w:sz w:val="24"/>
+          <w:szCs w:val="24"/>
+          <w:lang w:eastAsia="en-IN"/>
+        </w:rPr>
+        <w:br/>
+        <w:t>BUT make sure this option is selected:</w:t>
+      </w:r>
+    </w:p>
+    <w:p>
+      <w:pPr>
+        <w:spacing w:before="100" w:beforeAutospacing="1" w:after="100" w:afterAutospacing="1" w:line="240" w:lineRule="auto"/>
+        <w:outlineLvl w:val="2"/>
+        <w:rPr>
+          <w:rFonts w:ascii="Times New Roman" w:eastAsia="Times New Roman" w:hAnsi="Times New Roman" w:cs="Times New Roman"/>
+          <w:b/>
+          <w:bCs/>
+          <w:sz w:val="27"/>
+          <w:szCs w:val="27"/>
+          <w:lang w:eastAsia="en-IN"/>
+        </w:rPr>
+      </w:pPr>
+      <w:r>
+        <w:rPr>
+          <w:rFonts w:ascii="Segoe UI Emoji" w:eastAsia="Times New Roman" w:hAnsi="Segoe UI Emoji" w:cs="Segoe UI Emoji"/>
+          <w:b/>
+          <w:bCs/>
+          <w:sz w:val="27"/>
+          <w:szCs w:val="27"/>
+          <w:lang w:eastAsia="en-IN"/>
+        </w:rPr>
+        <w:t>👉</w:t>
+      </w:r>
+      <w:r>
+        <w:rPr>
+          <w:rFonts w:ascii="Times New Roman" w:eastAsia="Times New Roman" w:hAnsi="Times New Roman" w:cs="Times New Roman"/>
+          <w:b/>
+          <w:bCs/>
+          <w:sz w:val="27"/>
+          <w:szCs w:val="27"/>
+          <w:lang w:eastAsia="en-IN"/>
+        </w:rPr>
+        <w:t xml:space="preserve"> “Git from the command line and also from 3rd-party software”</w:t>
+      </w:r>
+    </w:p>
+    <w:p>
+      <w:pPr>
+        <w:spacing w:before="100" w:beforeAutospacing="1" w:after="100" w:afterAutospacing="1" w:line="240" w:lineRule="auto"/>
+        <w:rPr>
+          <w:rFonts w:ascii="Times New Roman" w:eastAsia="Times New Roman" w:hAnsi="Times New Roman" w:cs="Times New Roman"/>
+          <w:sz w:val="24"/>
+          <w:szCs w:val="24"/>
+          <w:lang w:eastAsia="en-IN"/>
+        </w:rPr>
+      </w:pPr>
+      <w:r>
+        <w:rPr>
+          <w:rFonts w:ascii="Times New Roman" w:eastAsia="Times New Roman" w:hAnsi="Times New Roman" w:cs="Times New Roman"/>
+          <w:sz w:val="24"/>
+          <w:szCs w:val="24"/>
+          <w:lang w:eastAsia="en-IN"/>
+        </w:rPr>
+        <w:t>(This is the PATH setting — MOST IMPORTANT STEP)</w:t>
+      </w:r>
+    </w:p>
+    <w:p>
+      <w:pPr>
+        <w:spacing w:after="0" w:line="240" w:lineRule="auto"/>
+        <w:rPr>
+          <w:rFonts w:ascii="Times New Roman" w:eastAsia="Times New Roman" w:hAnsi="Times New Roman" w:cs="Times New Roman"/>
+          <w:sz w:val="24"/>
+          <w:szCs w:val="24"/>
+          <w:lang w:eastAsia="en-IN"/>
+        </w:rPr>
+      </w:pPr>
+      <w:r>
+        <w:rPr>
+          <w:rFonts w:ascii="Times New Roman" w:eastAsia="Times New Roman" w:hAnsi="Times New Roman" w:cs="Times New Roman"/>
+          <w:sz w:val="24"/>
+          <w:szCs w:val="24"/>
+          <w:lang w:eastAsia="en-IN"/>
+        </w:rPr>
+        <w:pict w14:anchorId="66D36B3D">
+          <v:rect id="_x0000_i1065" style="width:0;height:1.5pt" o:hralign="center" o:hrstd="t" o:hr="t" fillcolor="#a0a0a0" stroked="f"/>
+        </w:pict>
+      </w:r>
+    </w:p>
+    <w:p>
+      <w:pPr>
+        <w:spacing w:before="100" w:beforeAutospacing="1" w:after="100" w:afterAutospacing="1" w:line="240" w:lineRule="auto"/>
+        <w:outlineLvl w:val="0"/>
+        <w:rPr>
+          <w:rFonts w:ascii="Times New Roman" w:eastAsia="Times New Roman" w:hAnsi="Times New Roman" w:cs="Times New Roman"/>
+          <w:b/>
+          <w:bCs/>
+          <w:kern w:val="36"/>
+          <w:sz w:val="48"/>
+          <w:szCs w:val="48"/>
+          <w:lang w:eastAsia="en-IN"/>
+        </w:rPr>
+      </w:pPr>
+      <w:r>
+        <w:rPr>
+          <w:rFonts w:ascii="Segoe UI Emoji" w:eastAsia="Times New Roman" w:hAnsi="Segoe UI Emoji" w:cs="Segoe UI Emoji"/>
+          <w:b/>
+          <w:bCs/>
+          <w:kern w:val="36"/>
+          <w:sz w:val="48"/>
+          <w:szCs w:val="48"/>
+          <w:lang w:eastAsia="en-IN"/>
+        </w:rPr>
+        <w:t>🚀</w:t>
+      </w:r>
+      <w:r>
+        <w:rPr>
+          <w:rFonts w:ascii="Times New Roman" w:eastAsia="Times New Roman" w:hAnsi="Times New Roman" w:cs="Times New Roman"/>
+          <w:b/>
+          <w:bCs/>
+          <w:kern w:val="36"/>
+          <w:sz w:val="48"/>
+          <w:szCs w:val="48"/>
+          <w:lang w:eastAsia="en-IN"/>
+        </w:rPr>
+        <w:t xml:space="preserve"> STEP 3 — Finish </w:t>
+      </w:r>
+      <w:proofErr w:type="gramStart"/>
+      <w:r>
+        <w:rPr>
+          <w:rFonts w:ascii="Times New Roman" w:eastAsia="Times New Roman" w:hAnsi="Times New Roman" w:cs="Times New Roman"/>
+          <w:b/>
+          <w:bCs/>
+          <w:kern w:val="36"/>
+          <w:sz w:val="48"/>
+          <w:szCs w:val="48"/>
+          <w:lang w:eastAsia="en-IN"/>
+        </w:rPr>
+        <w:t>install</w:t>
+      </w:r>
+      <w:proofErr w:type="gramEnd"/>
+    </w:p>
+    <w:p>
+      <w:pPr>
+        <w:spacing w:before="100" w:beforeAutospacing="1" w:after="100" w:afterAutospacing="1" w:line="240" w:lineRule="auto"/>
+        <w:rPr>
+          <w:rFonts w:ascii="Times New Roman" w:eastAsia="Times New Roman" w:hAnsi="Times New Roman" w:cs="Times New Roman"/>
+          <w:sz w:val="24"/>
+          <w:szCs w:val="24"/>
+          <w:lang w:eastAsia="en-IN"/>
+        </w:rPr>
+      </w:pPr>
+      <w:r>
+        <w:rPr>
+          <w:rFonts w:ascii="Times New Roman" w:eastAsia="Times New Roman" w:hAnsi="Times New Roman" w:cs="Times New Roman"/>
+          <w:sz w:val="24"/>
+          <w:szCs w:val="24"/>
+          <w:lang w:eastAsia="en-IN"/>
+        </w:rPr>
+        <w:t>Click:</w:t>
+      </w:r>
+    </w:p>
+    <w:p>
+      <w:pPr>
+        <w:spacing w:before="100" w:beforeAutospacing="1" w:after="100" w:afterAutospacing="1" w:line="240" w:lineRule="auto"/>
+        <w:rPr>
+          <w:rFonts w:ascii="Times New Roman" w:eastAsia="Times New Roman" w:hAnsi="Times New Roman" w:cs="Times New Roman"/>
+          <w:sz w:val="24"/>
+          <w:szCs w:val="24"/>
+          <w:lang w:eastAsia="en-IN"/>
+        </w:rPr>
+      </w:pPr>
+      <w:r>
+        <w:rPr>
+          <w:rFonts w:ascii="Segoe UI Emoji" w:eastAsia="Times New Roman" w:hAnsi="Segoe UI Emoji" w:cs="Segoe UI Emoji"/>
+          <w:sz w:val="24"/>
+          <w:szCs w:val="24"/>
+          <w:lang w:eastAsia="en-IN"/>
+        </w:rPr>
+        <w:t>✔</w:t>
+      </w:r>
+      <w:r>
+        <w:rPr>
+          <w:rFonts w:ascii="Times New Roman" w:eastAsia="Times New Roman" w:hAnsi="Times New Roman" w:cs="Times New Roman"/>
+          <w:sz w:val="24"/>
+          <w:szCs w:val="24"/>
+          <w:lang w:eastAsia="en-IN"/>
+        </w:rPr>
+        <w:t xml:space="preserve"> Next → Next → Next → Install</w:t>
+      </w:r>
+    </w:p>
+    <w:p>
+      <w:pPr>
+        <w:spacing w:after="0" w:line="240" w:lineRule="auto"/>
+        <w:rPr>
+          <w:rFonts w:ascii="Times New Roman" w:eastAsia="Times New Roman" w:hAnsi="Times New Roman" w:cs="Times New Roman"/>
+          <w:sz w:val="24"/>
+          <w:szCs w:val="24"/>
+          <w:lang w:eastAsia="en-IN"/>
+        </w:rPr>
+      </w:pPr>
+      <w:r>
+        <w:rPr>
+          <w:rFonts w:ascii="Times New Roman" w:eastAsia="Times New Roman" w:hAnsi="Times New Roman" w:cs="Times New Roman"/>
+          <w:sz w:val="24"/>
+          <w:szCs w:val="24"/>
+          <w:lang w:eastAsia="en-IN"/>
+        </w:rPr>
+        <w:pict w14:anchorId="57C5EE15">
+          <v:rect id="_x0000_i1066" style="width:0;height:1.5pt" o:hralign="center" o:hrstd="t" o:hr="t" fillcolor="#a0a0a0" stroked="f"/>
+        </w:pict>
+      </w:r>
+    </w:p>
+    <w:p>
+      <w:pPr>
+        <w:spacing w:before="100" w:beforeAutospacing="1" w:after="100" w:afterAutospacing="1" w:line="240" w:lineRule="auto"/>
+        <w:outlineLvl w:val="0"/>
+        <w:rPr>
+          <w:rFonts w:ascii="Times New Roman" w:eastAsia="Times New Roman" w:hAnsi="Times New Roman" w:cs="Times New Roman"/>
+          <w:b/>
+          <w:bCs/>
+          <w:kern w:val="36"/>
+          <w:sz w:val="48"/>
+          <w:szCs w:val="48"/>
+          <w:lang w:eastAsia="en-IN"/>
+        </w:rPr>
+      </w:pPr>
+      <w:r>
+        <w:rPr>
+          <w:rFonts w:ascii="Segoe UI Emoji" w:eastAsia="Times New Roman" w:hAnsi="Segoe UI Emoji" w:cs="Segoe UI Emoji"/>
+          <w:b/>
+          <w:bCs/>
+          <w:kern w:val="36"/>
+          <w:sz w:val="48"/>
+          <w:szCs w:val="48"/>
+          <w:lang w:eastAsia="en-IN"/>
+        </w:rPr>
+        <w:t>🚀</w:t>
+      </w:r>
+      <w:r>
+        <w:rPr>
+          <w:rFonts w:ascii="Times New Roman" w:eastAsia="Times New Roman" w:hAnsi="Times New Roman" w:cs="Times New Roman"/>
+          <w:b/>
+          <w:bCs/>
+          <w:kern w:val="36"/>
+          <w:sz w:val="48"/>
+          <w:szCs w:val="48"/>
+          <w:lang w:eastAsia="en-IN"/>
+        </w:rPr>
+        <w:t xml:space="preserve"> STEP 4 — Restart VS Code (IMPORTANT)</w:t>
+      </w:r>
+    </w:p>
+    <w:p>
+      <w:pPr>
+        <w:spacing w:before="100" w:beforeAutospacing="1" w:after="100" w:afterAutospacing="1" w:line="240" w:lineRule="auto"/>
+        <w:rPr>
+          <w:rFonts w:ascii="Times New Roman" w:eastAsia="Times New Roman" w:hAnsi="Times New Roman" w:cs="Times New Roman"/>
+          <w:sz w:val="24"/>
+          <w:szCs w:val="24"/>
+          <w:lang w:eastAsia="en-IN"/>
+        </w:rPr>
+      </w:pPr>
+      <w:r>
+        <w:rPr>
+          <w:rFonts w:ascii="Times New Roman" w:eastAsia="Times New Roman" w:hAnsi="Times New Roman" w:cs="Times New Roman"/>
+          <w:sz w:val="24"/>
+          <w:szCs w:val="24"/>
+          <w:lang w:eastAsia="en-IN"/>
+        </w:rPr>
+        <w:t>After installation:</w:t>
+      </w:r>
+    </w:p>
+    <w:p>
+      <w:pPr>
+        <w:spacing w:before="100" w:beforeAutospacing="1" w:after="100" w:afterAutospacing="1" w:line="240" w:lineRule="auto"/>
+        <w:rPr>
+          <w:rFonts w:ascii="Times New Roman" w:eastAsia="Times New Roman" w:hAnsi="Times New Roman" w:cs="Times New Roman"/>
+          <w:sz w:val="24"/>
+          <w:szCs w:val="24"/>
+          <w:lang w:eastAsia="en-IN"/>
+        </w:rPr>
+      </w:pPr>
+      <w:r>
+        <w:rPr>
+          <w:rFonts w:ascii="Segoe UI Emoji" w:eastAsia="Times New Roman" w:hAnsi="Segoe UI Emoji" w:cs="Segoe UI Emoji"/>
+          <w:sz w:val="24"/>
+          <w:szCs w:val="24"/>
+          <w:lang w:eastAsia="en-IN"/>
+        </w:rPr>
+        <w:t>👉</w:t>
+      </w:r>
+      <w:r>
+        <w:rPr>
+          <w:rFonts w:ascii="Times New Roman" w:eastAsia="Times New Roman" w:hAnsi="Times New Roman" w:cs="Times New Roman"/>
+          <w:sz w:val="24"/>
+          <w:szCs w:val="24"/>
+          <w:lang w:eastAsia="en-IN"/>
+        </w:rPr>
+        <w:t xml:space="preserve"> CLOSE VS CODE completely</w:t>
+      </w:r>
+      <w:r>
+        <w:rPr>
+          <w:rFonts w:ascii="Times New Roman" w:eastAsia="Times New Roman" w:hAnsi="Times New Roman" w:cs="Times New Roman"/>
+          <w:sz w:val="24"/>
+          <w:szCs w:val="24"/>
+          <w:lang w:eastAsia="en-IN"/>
+        </w:rPr>
+        <w:br/>
+      </w:r>
+      <w:r>
+        <w:rPr>
+          <w:rFonts w:ascii="Segoe UI Emoji" w:eastAsia="Times New Roman" w:hAnsi="Segoe UI Emoji" w:cs="Segoe UI Emoji"/>
+          <w:sz w:val="24"/>
+          <w:szCs w:val="24"/>
+          <w:lang w:eastAsia="en-IN"/>
+        </w:rPr>
+        <w:t>👉</w:t>
+      </w:r>
+      <w:r>
+        <w:rPr>
+          <w:rFonts w:ascii="Times New Roman" w:eastAsia="Times New Roman" w:hAnsi="Times New Roman" w:cs="Times New Roman"/>
+          <w:sz w:val="24"/>
+          <w:szCs w:val="24"/>
+          <w:lang w:eastAsia="en-IN"/>
+        </w:rPr>
+        <w:t xml:space="preserve"> Reopen VS Code</w:t>
+      </w:r>
+      <w:r>
+        <w:rPr>
+          <w:rFonts w:ascii="Times New Roman" w:eastAsia="Times New Roman" w:hAnsi="Times New Roman" w:cs="Times New Roman"/>
+          <w:sz w:val="24"/>
+          <w:szCs w:val="24"/>
+          <w:lang w:eastAsia="en-IN"/>
+        </w:rPr>
+        <w:br/>
+      </w:r>
+      <w:r>
+        <w:rPr>
+          <w:rFonts w:ascii="Segoe UI Emoji" w:eastAsia="Times New Roman" w:hAnsi="Segoe UI Emoji" w:cs="Segoe UI Emoji"/>
+          <w:sz w:val="24"/>
+          <w:szCs w:val="24"/>
+          <w:lang w:eastAsia="en-IN"/>
+        </w:rPr>
+        <w:t>👉</w:t>
+      </w:r>
+      <w:r>
+        <w:rPr>
+          <w:rFonts w:ascii="Times New Roman" w:eastAsia="Times New Roman" w:hAnsi="Times New Roman" w:cs="Times New Roman"/>
+          <w:sz w:val="24"/>
+          <w:szCs w:val="24"/>
+          <w:lang w:eastAsia="en-IN"/>
+        </w:rPr>
+        <w:t xml:space="preserve"> Open your project again</w:t>
+      </w:r>
+    </w:p>
+    <w:p>
+      <w:pPr>
+        <w:spacing w:after="0" w:line="240" w:lineRule="auto"/>
+        <w:rPr>
+          <w:rFonts w:ascii="Times New Roman" w:eastAsia="Times New Roman" w:hAnsi="Times New Roman" w:cs="Times New Roman"/>
+          <w:sz w:val="24"/>
+          <w:szCs w:val="24"/>
+          <w:lang w:eastAsia="en-IN"/>
+        </w:rPr>
+      </w:pPr>
+      <w:r>
+        <w:rPr>
+          <w:rFonts w:ascii="Times New Roman" w:eastAsia="Times New Roman" w:hAnsi="Times New Roman" w:cs="Times New Roman"/>
+          <w:sz w:val="24"/>
+          <w:szCs w:val="24"/>
+          <w:lang w:eastAsia="en-IN"/>
+        </w:rPr>
+        <w:pict w14:anchorId="5F4B7D2F">
+          <v:rect id="_x0000_i1067" style="width:0;height:1.5pt" o:hralign="center" o:hrstd="t" o:hr="t" fillcolor="#a0a0a0" stroked="f"/>
+        </w:pict>
+      </w:r>
+    </w:p>
+    <w:p>
+      <w:pPr>
+        <w:spacing w:before="100" w:beforeAutospacing="1" w:after="100" w:afterAutospacing="1" w:line="240" w:lineRule="auto"/>
+        <w:outlineLvl w:val="0"/>
+        <w:rPr>
+          <w:rFonts w:ascii="Times New Roman" w:eastAsia="Times New Roman" w:hAnsi="Times New Roman" w:cs="Times New Roman"/>
+          <w:b/>
+          <w:bCs/>
+          <w:kern w:val="36"/>
+          <w:sz w:val="48"/>
+          <w:szCs w:val="48"/>
+          <w:lang w:eastAsia="en-IN"/>
+        </w:rPr>
+      </w:pPr>
+      <w:r>
+        <w:rPr>
+          <w:rFonts w:ascii="Segoe UI Emoji" w:eastAsia="Times New Roman" w:hAnsi="Segoe UI Emoji" w:cs="Segoe UI Emoji"/>
+          <w:b/>
+          <w:bCs/>
+          <w:kern w:val="36"/>
+          <w:sz w:val="48"/>
+          <w:szCs w:val="48"/>
+          <w:lang w:eastAsia="en-IN"/>
+        </w:rPr>
+        <w:t>🚀</w:t>
+      </w:r>
+      <w:r>
+        <w:rPr>
+          <w:rFonts w:ascii="Times New Roman" w:eastAsia="Times New Roman" w:hAnsi="Times New Roman" w:cs="Times New Roman"/>
+          <w:b/>
+          <w:bCs/>
+          <w:kern w:val="36"/>
+          <w:sz w:val="48"/>
+          <w:szCs w:val="48"/>
+          <w:lang w:eastAsia="en-IN"/>
+        </w:rPr>
+        <w:t xml:space="preserve"> STEP 5 — Verify Git works</w:t>
+      </w:r>
+    </w:p>
+    <w:p>
+      <w:pPr>
+        <w:spacing w:before="100" w:beforeAutospacing="1" w:after="100" w:afterAutospacing="1" w:line="240" w:lineRule="auto"/>
+        <w:rPr>
+          <w:rFonts w:ascii="Times New Roman" w:eastAsia="Times New Roman" w:hAnsi="Times New Roman" w:cs="Times New Roman"/>
+          <w:sz w:val="24"/>
+          <w:szCs w:val="24"/>
+          <w:lang w:eastAsia="en-IN"/>
+        </w:rPr>
+      </w:pPr>
+      <w:r>
+        <w:rPr>
+          <w:rFonts w:ascii="Times New Roman" w:eastAsia="Times New Roman" w:hAnsi="Times New Roman" w:cs="Times New Roman"/>
+          <w:sz w:val="24"/>
+          <w:szCs w:val="24"/>
+          <w:lang w:eastAsia="en-IN"/>
+        </w:rPr>
+        <w:t>Now in terminal:</w:t>
+      </w:r>
+    </w:p>
+    <w:p>
+      <w:pPr>
+        <w:tabs>
+          <w:tab w:val="left" w:pos="916"/>
+          <w:tab w:val="left" w:pos="1832"/>
+          <w:tab w:val="left" w:pos="2748"/>
+          <w:tab w:val="left" w:pos="3664"/>
+          <w:tab w:val="left" w:pos="4580"/>
+          <w:tab w:val="left" w:pos="5496"/>
+          <w:tab w:val="left" w:pos="6412"/>
+          <w:tab w:val="left" w:pos="7328"/>
+          <w:tab w:val="left" w:pos="8244"/>
+          <w:tab w:val="left" w:pos="9160"/>
+          <w:tab w:val="left" w:pos="10076"/>
+          <w:tab w:val="left" w:pos="10992"/>
+          <w:tab w:val="left" w:pos="11908"/>
+          <w:tab w:val="left" w:pos="12824"/>
+          <w:tab w:val="left" w:pos="13740"/>
+          <w:tab w:val="left" w:pos="14656"/>
+        </w:tabs>
+        <w:spacing w:after="0" w:line="240" w:lineRule="auto"/>
+        <w:rPr>
+          <w:rFonts w:ascii="Courier New" w:eastAsia="Times New Roman" w:hAnsi="Courier New" w:cs="Courier New"/>
+          <w:sz w:val="20"/>
+          <w:szCs w:val="20"/>
+          <w:lang w:eastAsia="en-IN"/>
+        </w:rPr>
+      </w:pPr>
+      <w:r>
+        <w:rPr>
+          <w:rFonts w:ascii="Courier New" w:eastAsia="Times New Roman" w:hAnsi="Courier New" w:cs="Courier New"/>
+          <w:sz w:val="20"/>
+          <w:szCs w:val="20"/>
+          <w:lang w:eastAsia="en-IN"/>
+        </w:rPr>
+        <w:t>git --version</w:t>
+      </w:r>
+    </w:p>
+    <w:p>
+      <w:pPr>
+        <w:spacing w:before="100" w:beforeAutospacing="1" w:after="100" w:afterAutospacing="1" w:line="240" w:lineRule="auto"/>
+        <w:rPr>
+          <w:rFonts w:ascii="Times New Roman" w:eastAsia="Times New Roman" w:hAnsi="Times New Roman" w:cs="Times New Roman"/>
+          <w:sz w:val="24"/>
+          <w:szCs w:val="24"/>
+          <w:lang w:eastAsia="en-IN"/>
+        </w:rPr>
+      </w:pPr>
+      <w:r>
+        <w:rPr>
+          <w:rFonts w:ascii="Times New Roman" w:eastAsia="Times New Roman" w:hAnsi="Times New Roman" w:cs="Times New Roman"/>
+          <w:sz w:val="24"/>
+          <w:szCs w:val="24"/>
+          <w:lang w:eastAsia="en-IN"/>
+        </w:rPr>
+        <w:t>You should see something like:</w:t>
+      </w:r>
+    </w:p>
+    <w:p>
+      <w:pPr>
+        <w:tabs>
+          <w:tab w:val="left" w:pos="916"/>
+          <w:tab w:val="left" w:pos="1832"/>
+          <w:tab w:val="left" w:pos="2748"/>
+          <w:tab w:val="left" w:pos="3664"/>
+          <w:tab w:val="left" w:pos="4580"/>
+          <w:tab w:val="left" w:pos="5496"/>
+          <w:tab w:val="left" w:pos="6412"/>
+          <w:tab w:val="left" w:pos="7328"/>
+          <w:tab w:val="left" w:pos="8244"/>
+          <w:tab w:val="left" w:pos="9160"/>
+          <w:tab w:val="left" w:pos="10076"/>
+          <w:tab w:val="left" w:pos="10992"/>
+          <w:tab w:val="left" w:pos="11908"/>
+          <w:tab w:val="left" w:pos="12824"/>
+          <w:tab w:val="left" w:pos="13740"/>
+          <w:tab w:val="left" w:pos="14656"/>
+        </w:tabs>
+        <w:spacing w:after="0" w:line="240" w:lineRule="auto"/>
+        <w:rPr>
+          <w:rFonts w:ascii="Courier New" w:eastAsia="Times New Roman" w:hAnsi="Courier New" w:cs="Courier New"/>
+          <w:sz w:val="20"/>
+          <w:szCs w:val="20"/>
+          <w:lang w:eastAsia="en-IN"/>
+        </w:rPr>
+      </w:pPr>
+      <w:r>
+        <w:rPr>
+          <w:rFonts w:ascii="Courier New" w:eastAsia="Times New Roman" w:hAnsi="Courier New" w:cs="Courier New"/>
+          <w:sz w:val="20"/>
+          <w:szCs w:val="20"/>
+          <w:lang w:eastAsia="en-IN"/>
+        </w:rPr>
+        <w:t>git version 2.xx.x</w:t>
+      </w:r>
+    </w:p>
+    <w:p>
+      <w:pPr>
+        <w:spacing w:after="0" w:line="240" w:lineRule="auto"/>
+        <w:rPr>
+          <w:rFonts w:ascii="Times New Roman" w:eastAsia="Times New Roman" w:hAnsi="Times New Roman" w:cs="Times New Roman"/>
+          <w:sz w:val="24"/>
+          <w:szCs w:val="24"/>
+          <w:lang w:eastAsia="en-IN"/>
+        </w:rPr>
+      </w:pPr>
+      <w:r>
+        <w:rPr>
+          <w:rFonts w:ascii="Times New Roman" w:eastAsia="Times New Roman" w:hAnsi="Times New Roman" w:cs="Times New Roman"/>
+          <w:sz w:val="24"/>
+          <w:szCs w:val="24"/>
+          <w:lang w:eastAsia="en-IN"/>
+        </w:rPr>
+        <w:pict w14:anchorId="6E0E60F1">
+          <v:rect id="_x0000_i1068" style="width:0;height:1.5pt" o:hralign="center" o:hrstd="t" o:hr="t" fillcolor="#a0a0a0" stroked="f"/>
+        </w:pict>
+      </w:r>
+    </w:p>
+    <w:p>
+      <w:pPr>
+        <w:spacing w:after="0" w:line="240" w:lineRule="auto"/>
+        <w:rPr>
+          <w:rFonts w:ascii="Times New Roman" w:eastAsia="Times New Roman" w:hAnsi="Times New Roman" w:cs="Times New Roman"/>
+          <w:sz w:val="24"/>
+          <w:szCs w:val="24"/>
+          <w:lang w:eastAsia="en-IN"/>
+        </w:rPr>
+      </w:pPr>
+    </w:p>
+    <w:p>
+      <w:pPr>
+        <w:spacing w:after="0" w:line="240" w:lineRule="auto"/>
+        <w:rPr>
+          <w:rFonts w:ascii="Times New Roman" w:eastAsia="Times New Roman" w:hAnsi="Times New Roman" w:cs="Times New Roman"/>
+          <w:sz w:val="24"/>
+          <w:szCs w:val="24"/>
+          <w:lang w:eastAsia="en-IN"/>
+        </w:rPr>
+      </w:pPr>
+      <w:r>
+        <w:rPr>
+          <w:rFonts w:ascii="Times New Roman" w:eastAsia="Times New Roman" w:hAnsi="Times New Roman" w:cs="Times New Roman"/>
+          <w:sz w:val="24"/>
+          <w:szCs w:val="24"/>
+          <w:lang w:eastAsia="en-IN"/>
+        </w:rPr>
+        <w:lastRenderedPageBreak/>
+        <w:t>(</w:t>
+      </w:r>
+      <w:proofErr w:type="spellStart"/>
+      <w:r>
+        <w:rPr>
+          <w:rFonts w:ascii="Times New Roman" w:eastAsia="Times New Roman" w:hAnsi="Times New Roman" w:cs="Times New Roman"/>
+          <w:sz w:val="24"/>
+          <w:szCs w:val="24"/>
+          <w:lang w:eastAsia="en-IN"/>
+        </w:rPr>
+        <w:t>venv</w:t>
+      </w:r>
+      <w:proofErr w:type="spellEnd"/>
+      <w:r>
+        <w:rPr>
+          <w:rFonts w:ascii="Times New Roman" w:eastAsia="Times New Roman" w:hAnsi="Times New Roman" w:cs="Times New Roman"/>
+          <w:sz w:val="24"/>
+          <w:szCs w:val="24"/>
+          <w:lang w:eastAsia="en-IN"/>
+        </w:rPr>
+        <w:t>) PS C:\Users\hp\Documents\Austria\titanic-ml-api&gt; git config --global user.name "</w:t>
+      </w:r>
+      <w:proofErr w:type="spellStart"/>
+      <w:r>
+        <w:rPr>
+          <w:rFonts w:ascii="Times New Roman" w:eastAsia="Times New Roman" w:hAnsi="Times New Roman" w:cs="Times New Roman"/>
+          <w:sz w:val="24"/>
+          <w:szCs w:val="24"/>
+          <w:lang w:eastAsia="en-IN"/>
+        </w:rPr>
+        <w:t>Parinita</w:t>
+      </w:r>
+      <w:proofErr w:type="spellEnd"/>
+      <w:r>
+        <w:rPr>
+          <w:rFonts w:ascii="Times New Roman" w:eastAsia="Times New Roman" w:hAnsi="Times New Roman" w:cs="Times New Roman"/>
+          <w:sz w:val="24"/>
+          <w:szCs w:val="24"/>
+          <w:lang w:eastAsia="en-IN"/>
+        </w:rPr>
+        <w:t>-Jain"</w:t>
+      </w:r>
+    </w:p>
+    <w:p>
+      <w:pPr>
+        <w:spacing w:after="0" w:line="240" w:lineRule="auto"/>
+        <w:rPr>
+          <w:rFonts w:ascii="Times New Roman" w:eastAsia="Times New Roman" w:hAnsi="Times New Roman" w:cs="Times New Roman"/>
+          <w:sz w:val="24"/>
+          <w:szCs w:val="24"/>
+          <w:lang w:eastAsia="en-IN"/>
+        </w:rPr>
+      </w:pPr>
+      <w:r>
+        <w:rPr>
+          <w:rFonts w:ascii="Times New Roman" w:eastAsia="Times New Roman" w:hAnsi="Times New Roman" w:cs="Times New Roman"/>
+          <w:sz w:val="24"/>
+          <w:szCs w:val="24"/>
+          <w:lang w:eastAsia="en-IN"/>
+        </w:rPr>
+        <w:t>(</w:t>
+      </w:r>
+      <w:proofErr w:type="spellStart"/>
+      <w:r>
+        <w:rPr>
+          <w:rFonts w:ascii="Times New Roman" w:eastAsia="Times New Roman" w:hAnsi="Times New Roman" w:cs="Times New Roman"/>
+          <w:sz w:val="24"/>
+          <w:szCs w:val="24"/>
+          <w:lang w:eastAsia="en-IN"/>
+        </w:rPr>
+        <w:t>venv</w:t>
+      </w:r>
+      <w:proofErr w:type="spellEnd"/>
+      <w:r>
+        <w:rPr>
+          <w:rFonts w:ascii="Times New Roman" w:eastAsia="Times New Roman" w:hAnsi="Times New Roman" w:cs="Times New Roman"/>
+          <w:sz w:val="24"/>
+          <w:szCs w:val="24"/>
+          <w:lang w:eastAsia="en-IN"/>
+        </w:rPr>
+        <w:t xml:space="preserve">) PS C:\Users\hp\Documents\Austria\titanic-ml-api&gt; git config --global </w:t>
+      </w:r>
+      <w:proofErr w:type="spellStart"/>
+      <w:proofErr w:type="gramStart"/>
+      <w:r>
+        <w:rPr>
+          <w:rFonts w:ascii="Times New Roman" w:eastAsia="Times New Roman" w:hAnsi="Times New Roman" w:cs="Times New Roman"/>
+          <w:sz w:val="24"/>
+          <w:szCs w:val="24"/>
+          <w:lang w:eastAsia="en-IN"/>
+        </w:rPr>
+        <w:t>user.email</w:t>
+      </w:r>
+      <w:proofErr w:type="spellEnd"/>
+      <w:proofErr w:type="gramEnd"/>
+      <w:r>
+        <w:rPr>
+          <w:rFonts w:ascii="Times New Roman" w:eastAsia="Times New Roman" w:hAnsi="Times New Roman" w:cs="Times New Roman"/>
+          <w:sz w:val="24"/>
+          <w:szCs w:val="24"/>
+          <w:lang w:eastAsia="en-IN"/>
+        </w:rPr>
+        <w:t xml:space="preserve"> </w:t>
+      </w:r>
+      <w:hyperlink r:id="rId7" w:history="1">
+        <w:r>
+          <w:rPr>
+            <w:rStyle w:val="Hyperlink"/>
+            <w:rFonts w:ascii="Times New Roman" w:eastAsia="Times New Roman" w:hAnsi="Times New Roman" w:cs="Times New Roman"/>
+            <w:sz w:val="24"/>
+            <w:szCs w:val="24"/>
+            <w:lang w:eastAsia="en-IN"/>
+          </w:rPr>
+          <w:t>parinita.jain14@yahoo.com</w:t>
+        </w:r>
+      </w:hyperlink>
+    </w:p>
+    <w:p>
+      <w:pPr>
+        <w:pBdr>
+          <w:bottom w:val="single" w:sz="6" w:space="1" w:color="auto"/>
+        </w:pBdr>
+        <w:spacing w:after="0" w:line="240" w:lineRule="auto"/>
+        <w:rPr>
+          <w:rFonts w:ascii="Times New Roman" w:eastAsia="Times New Roman" w:hAnsi="Times New Roman" w:cs="Times New Roman"/>
+          <w:sz w:val="24"/>
+          <w:szCs w:val="24"/>
+          <w:lang w:eastAsia="en-IN"/>
+        </w:rPr>
+      </w:pPr>
+    </w:p>
+    <w:p>
+      <w:pPr>
+        <w:spacing w:after="0" w:line="240" w:lineRule="auto"/>
+        <w:rPr>
+          <w:rFonts w:ascii="Times New Roman" w:eastAsia="Times New Roman" w:hAnsi="Times New Roman" w:cs="Times New Roman"/>
+          <w:sz w:val="24"/>
+          <w:szCs w:val="24"/>
+          <w:lang w:eastAsia="en-IN"/>
+        </w:rPr>
+      </w:pPr>
+      <w:r>
+        <w:rPr>
+          <w:rFonts w:ascii="Times New Roman" w:eastAsia="Times New Roman" w:hAnsi="Times New Roman" w:cs="Times New Roman"/>
+          <w:sz w:val="24"/>
+          <w:szCs w:val="24"/>
+          <w:lang w:eastAsia="en-IN"/>
+        </w:rPr>
+        <w:t>(</w:t>
+      </w:r>
+      <w:proofErr w:type="spellStart"/>
+      <w:r>
+        <w:rPr>
+          <w:rFonts w:ascii="Times New Roman" w:eastAsia="Times New Roman" w:hAnsi="Times New Roman" w:cs="Times New Roman"/>
+          <w:sz w:val="24"/>
+          <w:szCs w:val="24"/>
+          <w:lang w:eastAsia="en-IN"/>
+        </w:rPr>
+        <w:t>venv</w:t>
+      </w:r>
+      <w:proofErr w:type="spellEnd"/>
+      <w:r>
+        <w:rPr>
+          <w:rFonts w:ascii="Times New Roman" w:eastAsia="Times New Roman" w:hAnsi="Times New Roman" w:cs="Times New Roman"/>
+          <w:sz w:val="24"/>
+          <w:szCs w:val="24"/>
+          <w:lang w:eastAsia="en-IN"/>
+        </w:rPr>
+        <w:t>) PS C:\Users\hp\Documents\Austria\titanic-ml-api&gt; git config --global --list</w:t>
+      </w:r>
+    </w:p>
+    <w:p>
+      <w:pPr>
+        <w:spacing w:after="0" w:line="240" w:lineRule="auto"/>
+        <w:rPr>
+          <w:rFonts w:ascii="Times New Roman" w:eastAsia="Times New Roman" w:hAnsi="Times New Roman" w:cs="Times New Roman"/>
+          <w:sz w:val="24"/>
+          <w:szCs w:val="24"/>
+          <w:lang w:eastAsia="en-IN"/>
+        </w:rPr>
+      </w:pPr>
+      <w:r>
+        <w:rPr>
+          <w:rFonts w:ascii="Times New Roman" w:eastAsia="Times New Roman" w:hAnsi="Times New Roman" w:cs="Times New Roman"/>
+          <w:sz w:val="24"/>
+          <w:szCs w:val="24"/>
+          <w:lang w:eastAsia="en-IN"/>
+        </w:rPr>
+        <w:t>user.name=</w:t>
+      </w:r>
+      <w:proofErr w:type="spellStart"/>
+      <w:r>
+        <w:rPr>
+          <w:rFonts w:ascii="Times New Roman" w:eastAsia="Times New Roman" w:hAnsi="Times New Roman" w:cs="Times New Roman"/>
+          <w:sz w:val="24"/>
+          <w:szCs w:val="24"/>
+          <w:lang w:eastAsia="en-IN"/>
+        </w:rPr>
+        <w:t>Parinita</w:t>
+      </w:r>
+      <w:proofErr w:type="spellEnd"/>
+      <w:r>
+        <w:rPr>
+          <w:rFonts w:ascii="Times New Roman" w:eastAsia="Times New Roman" w:hAnsi="Times New Roman" w:cs="Times New Roman"/>
+          <w:sz w:val="24"/>
+          <w:szCs w:val="24"/>
+          <w:lang w:eastAsia="en-IN"/>
+        </w:rPr>
+        <w:t>-Jain</w:t>
+      </w:r>
+    </w:p>
+    <w:p>
+      <w:pPr>
+        <w:pBdr>
+          <w:bottom w:val="single" w:sz="6" w:space="1" w:color="auto"/>
+        </w:pBdr>
+        <w:spacing w:after="0" w:line="240" w:lineRule="auto"/>
+        <w:rPr>
+          <w:rFonts w:ascii="Times New Roman" w:eastAsia="Times New Roman" w:hAnsi="Times New Roman" w:cs="Times New Roman"/>
+          <w:sz w:val="24"/>
+          <w:szCs w:val="24"/>
+          <w:lang w:eastAsia="en-IN"/>
+        </w:rPr>
+      </w:pPr>
+      <w:hyperlink r:id="rId8" w:history="1">
+        <w:r>
+          <w:rPr>
+            <w:rStyle w:val="Hyperlink"/>
+            <w:rFonts w:ascii="Times New Roman" w:eastAsia="Times New Roman" w:hAnsi="Times New Roman" w:cs="Times New Roman"/>
+            <w:sz w:val="24"/>
+            <w:szCs w:val="24"/>
+            <w:lang w:eastAsia="en-IN"/>
+          </w:rPr>
+          <w:t>user.email=parinita.jain14@yahoo.com</w:t>
+        </w:r>
+      </w:hyperlink>
+    </w:p>
+    <w:p>
+      <w:pPr>
+        <w:spacing w:after="0" w:line="240" w:lineRule="auto"/>
+        <w:rPr>
+          <w:rFonts w:ascii="Times New Roman" w:eastAsia="Times New Roman" w:hAnsi="Times New Roman" w:cs="Times New Roman"/>
+          <w:sz w:val="24"/>
+          <w:szCs w:val="24"/>
+          <w:lang w:eastAsia="en-IN"/>
+        </w:rPr>
+      </w:pPr>
+    </w:p>
+    <w:p>
+      <w:pPr>
+        <w:spacing w:after="0" w:line="240" w:lineRule="auto"/>
+        <w:rPr>
+          <w:rFonts w:ascii="Times New Roman" w:eastAsia="Times New Roman" w:hAnsi="Times New Roman" w:cs="Times New Roman"/>
+          <w:sz w:val="24"/>
+          <w:szCs w:val="24"/>
+          <w:lang w:eastAsia="en-IN"/>
+        </w:rPr>
+      </w:pPr>
+      <w:r>
+        <w:rPr>
+          <w:rFonts w:ascii="Times New Roman" w:eastAsia="Times New Roman" w:hAnsi="Times New Roman" w:cs="Times New Roman"/>
+          <w:sz w:val="24"/>
+          <w:szCs w:val="24"/>
+          <w:lang w:eastAsia="en-IN"/>
+        </w:rPr>
+        <w:t>(</w:t>
+      </w:r>
+      <w:proofErr w:type="spellStart"/>
+      <w:r>
+        <w:rPr>
+          <w:rFonts w:ascii="Times New Roman" w:eastAsia="Times New Roman" w:hAnsi="Times New Roman" w:cs="Times New Roman"/>
+          <w:sz w:val="24"/>
+          <w:szCs w:val="24"/>
+          <w:lang w:eastAsia="en-IN"/>
+        </w:rPr>
+        <w:t>venv</w:t>
+      </w:r>
+      <w:proofErr w:type="spellEnd"/>
+      <w:r>
+        <w:rPr>
+          <w:rFonts w:ascii="Times New Roman" w:eastAsia="Times New Roman" w:hAnsi="Times New Roman" w:cs="Times New Roman"/>
+          <w:sz w:val="24"/>
+          <w:szCs w:val="24"/>
+          <w:lang w:eastAsia="en-IN"/>
+        </w:rPr>
+        <w:t xml:space="preserve">) PS C:\Users\hp\Documents\Austria\titanic-ml-api&gt; git </w:t>
+      </w:r>
+      <w:proofErr w:type="gramStart"/>
+      <w:r>
+        <w:rPr>
+          <w:rFonts w:ascii="Times New Roman" w:eastAsia="Times New Roman" w:hAnsi="Times New Roman" w:cs="Times New Roman"/>
+          <w:sz w:val="24"/>
+          <w:szCs w:val="24"/>
+          <w:lang w:eastAsia="en-IN"/>
+        </w:rPr>
+        <w:t>add .</w:t>
+      </w:r>
+      <w:proofErr w:type="gramEnd"/>
+    </w:p>
+    <w:p>
+      <w:pPr>
+        <w:spacing w:after="0" w:line="240" w:lineRule="auto"/>
+        <w:rPr>
+          <w:rFonts w:ascii="Times New Roman" w:eastAsia="Times New Roman" w:hAnsi="Times New Roman" w:cs="Times New Roman"/>
+          <w:sz w:val="24"/>
+          <w:szCs w:val="24"/>
+          <w:lang w:eastAsia="en-IN"/>
+        </w:rPr>
+      </w:pPr>
+      <w:r>
+        <w:rPr>
+          <w:rFonts w:ascii="Times New Roman" w:eastAsia="Times New Roman" w:hAnsi="Times New Roman" w:cs="Times New Roman"/>
+          <w:sz w:val="24"/>
+          <w:szCs w:val="24"/>
+          <w:lang w:eastAsia="en-IN"/>
+        </w:rPr>
+        <w:t>(</w:t>
+      </w:r>
+      <w:proofErr w:type="spellStart"/>
+      <w:r>
+        <w:rPr>
+          <w:rFonts w:ascii="Times New Roman" w:eastAsia="Times New Roman" w:hAnsi="Times New Roman" w:cs="Times New Roman"/>
+          <w:sz w:val="24"/>
+          <w:szCs w:val="24"/>
+          <w:lang w:eastAsia="en-IN"/>
+        </w:rPr>
+        <w:t>venv</w:t>
+      </w:r>
+      <w:proofErr w:type="spellEnd"/>
+      <w:r>
+        <w:rPr>
+          <w:rFonts w:ascii="Times New Roman" w:eastAsia="Times New Roman" w:hAnsi="Times New Roman" w:cs="Times New Roman"/>
+          <w:sz w:val="24"/>
+          <w:szCs w:val="24"/>
+          <w:lang w:eastAsia="en-IN"/>
+        </w:rPr>
+        <w:t>) PS C:\Users\hp\Documents\Austria\titanic-ml-api&gt; git commit -m "Initial commit"</w:t>
+      </w:r>
+    </w:p>
+    <w:p>
+      <w:pPr>
+        <w:pBdr>
+          <w:bottom w:val="single" w:sz="6" w:space="1" w:color="auto"/>
+        </w:pBdr>
+        <w:spacing w:after="0" w:line="240" w:lineRule="auto"/>
+        <w:rPr>
+          <w:rFonts w:ascii="Times New Roman" w:eastAsia="Times New Roman" w:hAnsi="Times New Roman" w:cs="Times New Roman"/>
+          <w:sz w:val="24"/>
+          <w:szCs w:val="24"/>
+          <w:lang w:eastAsia="en-IN"/>
+        </w:rPr>
+      </w:pPr>
+    </w:p>
+    <w:p>
+      <w:pPr>
+        <w:spacing w:before="100" w:beforeAutospacing="1" w:after="100" w:afterAutospacing="1" w:line="240" w:lineRule="auto"/>
+        <w:outlineLvl w:val="0"/>
+        <w:rPr>
+          <w:rFonts w:ascii="Times New Roman" w:eastAsia="Times New Roman" w:hAnsi="Times New Roman" w:cs="Times New Roman"/>
+          <w:sz w:val="24"/>
+          <w:szCs w:val="24"/>
+          <w:lang w:eastAsia="en-IN"/>
+        </w:rPr>
+      </w:pPr>
+      <w:r>
+        <w:rPr>
+          <w:rFonts w:ascii="Times New Roman" w:eastAsia="Times New Roman" w:hAnsi="Times New Roman" w:cs="Times New Roman"/>
+          <w:sz w:val="24"/>
+          <w:szCs w:val="24"/>
+          <w:lang w:eastAsia="en-IN"/>
+        </w:rPr>
+        <w:t>(</w:t>
+      </w:r>
+      <w:proofErr w:type="spellStart"/>
+      <w:r>
+        <w:rPr>
+          <w:rFonts w:ascii="Times New Roman" w:eastAsia="Times New Roman" w:hAnsi="Times New Roman" w:cs="Times New Roman"/>
+          <w:sz w:val="24"/>
+          <w:szCs w:val="24"/>
+          <w:lang w:eastAsia="en-IN"/>
+        </w:rPr>
+        <w:t>venv</w:t>
+      </w:r>
+      <w:proofErr w:type="spellEnd"/>
+      <w:r>
+        <w:rPr>
+          <w:rFonts w:ascii="Times New Roman" w:eastAsia="Times New Roman" w:hAnsi="Times New Roman" w:cs="Times New Roman"/>
+          <w:sz w:val="24"/>
+          <w:szCs w:val="24"/>
+          <w:lang w:eastAsia="en-IN"/>
+        </w:rPr>
+        <w:t xml:space="preserve">) PS C:\Users\hp\Documents\Austria\titanic-ml-api&gt; git branch -M main    </w:t>
+      </w:r>
+    </w:p>
+    <w:p>
+      <w:pPr>
+        <w:spacing w:before="100" w:beforeAutospacing="1" w:after="100" w:afterAutospacing="1" w:line="240" w:lineRule="auto"/>
+        <w:outlineLvl w:val="0"/>
+        <w:rPr>
+          <w:rFonts w:ascii="Times New Roman" w:eastAsia="Times New Roman" w:hAnsi="Times New Roman" w:cs="Times New Roman"/>
+          <w:sz w:val="24"/>
+          <w:szCs w:val="24"/>
+          <w:lang w:eastAsia="en-IN"/>
+        </w:rPr>
+      </w:pPr>
+      <w:r>
+        <w:rPr>
+          <w:rFonts w:ascii="Times New Roman" w:eastAsia="Times New Roman" w:hAnsi="Times New Roman" w:cs="Times New Roman"/>
+          <w:sz w:val="24"/>
+          <w:szCs w:val="24"/>
+          <w:lang w:eastAsia="en-IN"/>
+        </w:rPr>
+        <w:t xml:space="preserve">Now create repository in </w:t>
+      </w:r>
+      <w:proofErr w:type="spellStart"/>
+      <w:r>
+        <w:rPr>
+          <w:rFonts w:ascii="Times New Roman" w:eastAsia="Times New Roman" w:hAnsi="Times New Roman" w:cs="Times New Roman"/>
+          <w:sz w:val="24"/>
+          <w:szCs w:val="24"/>
+          <w:lang w:eastAsia="en-IN"/>
+        </w:rPr>
+        <w:t>github</w:t>
+      </w:r>
+      <w:proofErr w:type="spellEnd"/>
+      <w:r>
+        <w:rPr>
+          <w:rFonts w:ascii="Times New Roman" w:eastAsia="Times New Roman" w:hAnsi="Times New Roman" w:cs="Times New Roman"/>
+          <w:sz w:val="24"/>
+          <w:szCs w:val="24"/>
+          <w:lang w:eastAsia="en-IN"/>
+        </w:rPr>
+        <w:t xml:space="preserve"> account. Then execute -</w:t>
+      </w:r>
+      <w:r>
+        <w:rPr>
+          <w:rFonts w:ascii="Times New Roman" w:eastAsia="Times New Roman" w:hAnsi="Times New Roman" w:cs="Times New Roman"/>
+          <w:sz w:val="24"/>
+          <w:szCs w:val="24"/>
+          <w:lang w:eastAsia="en-IN"/>
+        </w:rPr>
+        <w:t xml:space="preserve">  </w:t>
+      </w:r>
+    </w:p>
+    <w:p>
+      <w:pPr>
+        <w:spacing w:before="100" w:beforeAutospacing="1" w:after="100" w:afterAutospacing="1" w:line="240" w:lineRule="auto"/>
+        <w:outlineLvl w:val="0"/>
+        <w:rPr>
+          <w:rFonts w:ascii="Times New Roman" w:eastAsia="Times New Roman" w:hAnsi="Times New Roman" w:cs="Times New Roman"/>
+          <w:sz w:val="24"/>
+          <w:szCs w:val="24"/>
+          <w:lang w:eastAsia="en-IN"/>
+        </w:rPr>
+      </w:pPr>
+      <w:r>
+        <w:rPr>
+          <w:rFonts w:ascii="Times New Roman" w:eastAsia="Times New Roman" w:hAnsi="Times New Roman" w:cs="Times New Roman"/>
+          <w:sz w:val="24"/>
+          <w:szCs w:val="24"/>
+          <w:lang w:eastAsia="en-IN"/>
+        </w:rPr>
+        <w:t>(</w:t>
+      </w:r>
+      <w:proofErr w:type="spellStart"/>
+      <w:r>
+        <w:rPr>
+          <w:rFonts w:ascii="Times New Roman" w:eastAsia="Times New Roman" w:hAnsi="Times New Roman" w:cs="Times New Roman"/>
+          <w:sz w:val="24"/>
+          <w:szCs w:val="24"/>
+          <w:lang w:eastAsia="en-IN"/>
+        </w:rPr>
+        <w:t>venv</w:t>
+      </w:r>
+      <w:proofErr w:type="spellEnd"/>
+      <w:r>
+        <w:rPr>
+          <w:rFonts w:ascii="Times New Roman" w:eastAsia="Times New Roman" w:hAnsi="Times New Roman" w:cs="Times New Roman"/>
+          <w:sz w:val="24"/>
+          <w:szCs w:val="24"/>
+          <w:lang w:eastAsia="en-IN"/>
+        </w:rPr>
+        <w:t>) PS C:\Users\hp\Documents\Austria\titanic-ml-api&gt; git remote add origin https://github.com/Parinita-Jain/titanic-ml-api.git</w:t>
+      </w:r>
+    </w:p>
+    <w:p>
+      <w:pPr>
+        <w:spacing w:before="100" w:beforeAutospacing="1" w:after="100" w:afterAutospacing="1" w:line="240" w:lineRule="auto"/>
+        <w:outlineLvl w:val="0"/>
+        <w:rPr>
+          <w:rFonts w:ascii="Times New Roman" w:eastAsia="Times New Roman" w:hAnsi="Times New Roman" w:cs="Times New Roman"/>
+          <w:sz w:val="24"/>
+          <w:szCs w:val="24"/>
+          <w:lang w:eastAsia="en-IN"/>
+        </w:rPr>
+      </w:pPr>
+      <w:r>
+        <w:rPr>
+          <w:rFonts w:ascii="Times New Roman" w:eastAsia="Times New Roman" w:hAnsi="Times New Roman" w:cs="Times New Roman"/>
+          <w:sz w:val="24"/>
+          <w:szCs w:val="24"/>
+          <w:lang w:eastAsia="en-IN"/>
+        </w:rPr>
+        <w:t>(</w:t>
+      </w:r>
+      <w:proofErr w:type="spellStart"/>
+      <w:r>
+        <w:rPr>
+          <w:rFonts w:ascii="Times New Roman" w:eastAsia="Times New Roman" w:hAnsi="Times New Roman" w:cs="Times New Roman"/>
+          <w:sz w:val="24"/>
+          <w:szCs w:val="24"/>
+          <w:lang w:eastAsia="en-IN"/>
+        </w:rPr>
+        <w:t>venv</w:t>
+      </w:r>
+      <w:proofErr w:type="spellEnd"/>
+      <w:r>
+        <w:rPr>
+          <w:rFonts w:ascii="Times New Roman" w:eastAsia="Times New Roman" w:hAnsi="Times New Roman" w:cs="Times New Roman"/>
+          <w:sz w:val="24"/>
+          <w:szCs w:val="24"/>
+          <w:lang w:eastAsia="en-IN"/>
+        </w:rPr>
+        <w:t>) PS C:\Users\hp\Documents\Austria\titanic-ml-api&gt; git push -u origin main</w:t>
+      </w:r>
+    </w:p>
+    <w:p>
+      <w:pPr>
+        <w:pBdr>
+          <w:bottom w:val="single" w:sz="6" w:space="1" w:color="auto"/>
+        </w:pBdr>
+        <w:tabs>
+          <w:tab w:val="left" w:pos="916"/>
+          <w:tab w:val="left" w:pos="1832"/>
+          <w:tab w:val="left" w:pos="2748"/>
+          <w:tab w:val="left" w:pos="3664"/>
+          <w:tab w:val="left" w:pos="4580"/>
+          <w:tab w:val="left" w:pos="5496"/>
+          <w:tab w:val="left" w:pos="6412"/>
+          <w:tab w:val="left" w:pos="7328"/>
+          <w:tab w:val="left" w:pos="8244"/>
+          <w:tab w:val="left" w:pos="9160"/>
+          <w:tab w:val="left" w:pos="10076"/>
+          <w:tab w:val="left" w:pos="10992"/>
+          <w:tab w:val="left" w:pos="11908"/>
+          <w:tab w:val="left" w:pos="12824"/>
+          <w:tab w:val="left" w:pos="13740"/>
+          <w:tab w:val="left" w:pos="14656"/>
+        </w:tabs>
+        <w:spacing w:after="0" w:line="240" w:lineRule="auto"/>
+        <w:rPr>
+          <w:rFonts w:ascii="Courier New" w:eastAsia="Times New Roman" w:hAnsi="Courier New" w:cs="Courier New"/>
+          <w:sz w:val="20"/>
+          <w:szCs w:val="20"/>
+          <w:lang w:eastAsia="en-IN"/>
+        </w:rPr>
+      </w:pPr>
+    </w:p>
+    <w:p>
+      <w:pPr>
+        <w:tabs>
+          <w:tab w:val="left" w:pos="916"/>
+          <w:tab w:val="left" w:pos="1832"/>
+          <w:tab w:val="left" w:pos="2748"/>
+          <w:tab w:val="left" w:pos="3664"/>
+          <w:tab w:val="left" w:pos="4580"/>
+          <w:tab w:val="left" w:pos="5496"/>
+          <w:tab w:val="left" w:pos="6412"/>
+          <w:tab w:val="left" w:pos="7328"/>
+          <w:tab w:val="left" w:pos="8244"/>
+          <w:tab w:val="left" w:pos="9160"/>
+          <w:tab w:val="left" w:pos="10076"/>
+          <w:tab w:val="left" w:pos="10992"/>
+          <w:tab w:val="left" w:pos="11908"/>
+          <w:tab w:val="left" w:pos="12824"/>
+          <w:tab w:val="left" w:pos="13740"/>
+          <w:tab w:val="left" w:pos="14656"/>
+        </w:tabs>
+        <w:spacing w:after="0" w:line="240" w:lineRule="auto"/>
+        <w:rPr>
+          <w:rFonts w:ascii="Courier New" w:eastAsia="Times New Roman" w:hAnsi="Courier New" w:cs="Courier New"/>
+          <w:sz w:val="20"/>
+          <w:szCs w:val="20"/>
+          <w:lang w:eastAsia="en-IN"/>
+        </w:rPr>
+      </w:pPr>
+    </w:p>
+    <w:p>
+      <w:pPr>
+        <w:tabs>
+          <w:tab w:val="left" w:pos="916"/>
+          <w:tab w:val="left" w:pos="1832"/>
+          <w:tab w:val="left" w:pos="2748"/>
+          <w:tab w:val="left" w:pos="3664"/>
+          <w:tab w:val="left" w:pos="4580"/>
+          <w:tab w:val="left" w:pos="5496"/>
+          <w:tab w:val="left" w:pos="6412"/>
+          <w:tab w:val="left" w:pos="7328"/>
+          <w:tab w:val="left" w:pos="8244"/>
+          <w:tab w:val="left" w:pos="9160"/>
+          <w:tab w:val="left" w:pos="10076"/>
+          <w:tab w:val="left" w:pos="10992"/>
+          <w:tab w:val="left" w:pos="11908"/>
+          <w:tab w:val="left" w:pos="12824"/>
+          <w:tab w:val="left" w:pos="13740"/>
+          <w:tab w:val="left" w:pos="14656"/>
+        </w:tabs>
+        <w:spacing w:after="0" w:line="240" w:lineRule="auto"/>
+        <w:rPr>
+          <w:rFonts w:ascii="Courier New" w:eastAsia="Times New Roman" w:hAnsi="Courier New" w:cs="Courier New"/>
+          <w:sz w:val="20"/>
+          <w:szCs w:val="20"/>
+          <w:lang w:eastAsia="en-IN"/>
+        </w:rPr>
+      </w:pPr>
+    </w:p>
+    <w:p>
+      <w:r>
+        <w:t xml:space="preserve">ok now </w:t>
+      </w:r>
+      <w:proofErr w:type="spellStart"/>
+      <w:r>
+        <w:t>i</w:t>
+      </w:r>
+      <w:proofErr w:type="spellEnd"/>
+      <w:r>
+        <w:t xml:space="preserve"> can see in my </w:t>
+      </w:r>
+      <w:proofErr w:type="spellStart"/>
+      <w:r>
+        <w:t>github</w:t>
+      </w:r>
+      <w:proofErr w:type="spellEnd"/>
+      <w:r>
+        <w:t xml:space="preserve"> repository different files. Next what should </w:t>
+      </w:r>
+      <w:proofErr w:type="spellStart"/>
+      <w:r>
+        <w:t>i</w:t>
+      </w:r>
+      <w:proofErr w:type="spellEnd"/>
+      <w:r>
+        <w:t xml:space="preserve"> do?</w:t>
+      </w:r>
+    </w:p>
+    <w:p>
+      <w:pPr>
+        <w:pStyle w:val="NormalWeb"/>
+      </w:pPr>
+      <w:r>
+        <w:t xml:space="preserve">Excellent </w:t>
+      </w:r>
+      <w:r>
+        <w:rPr>
+          <w:rFonts w:ascii="Segoe UI Emoji" w:hAnsi="Segoe UI Emoji" w:cs="Segoe UI Emoji"/>
+        </w:rPr>
+        <w:t>🎉</w:t>
+      </w:r>
+      <w:r>
+        <w:br/>
+        <w:t>You’ve already crossed the hardest beginner setup part.</w:t>
+      </w:r>
+    </w:p>
+    <w:p>
+      <w:pPr>
+        <w:pStyle w:val="NormalWeb"/>
+      </w:pPr>
+      <w:r>
+        <w:t xml:space="preserve">Right </w:t>
+      </w:r>
+      <w:proofErr w:type="gramStart"/>
+      <w:r>
+        <w:t>now</w:t>
+      </w:r>
+      <w:proofErr w:type="gramEnd"/>
+      <w:r>
+        <w:t xml:space="preserve"> you have:</w:t>
+      </w:r>
+    </w:p>
+    <w:p>
+      <w:pPr>
+        <w:pStyle w:val="NormalWeb"/>
+      </w:pPr>
+      <w:r>
+        <w:rPr>
+          <w:rFonts w:ascii="Segoe UI Emoji" w:hAnsi="Segoe UI Emoji" w:cs="Segoe UI Emoji"/>
+        </w:rPr>
+        <w:t>✔</w:t>
+      </w:r>
+      <w:r>
+        <w:t xml:space="preserve"> Git installed</w:t>
+      </w:r>
+      <w:r>
+        <w:br/>
+      </w:r>
+      <w:r>
+        <w:rPr>
+          <w:rFonts w:ascii="Segoe UI Emoji" w:hAnsi="Segoe UI Emoji" w:cs="Segoe UI Emoji"/>
+        </w:rPr>
+        <w:t>✔</w:t>
+      </w:r>
+      <w:r>
+        <w:t xml:space="preserve"> GitHub repository connected</w:t>
+      </w:r>
+      <w:r>
+        <w:br/>
+      </w:r>
+      <w:r>
+        <w:rPr>
+          <w:rFonts w:ascii="Segoe UI Emoji" w:hAnsi="Segoe UI Emoji" w:cs="Segoe UI Emoji"/>
+        </w:rPr>
+        <w:t>✔</w:t>
+      </w:r>
+      <w:r>
+        <w:t xml:space="preserve"> Project pushed successfully</w:t>
+      </w:r>
+      <w:r>
+        <w:br/>
+      </w:r>
+      <w:r>
+        <w:rPr>
+          <w:rFonts w:ascii="Segoe UI Emoji" w:hAnsi="Segoe UI Emoji" w:cs="Segoe UI Emoji"/>
+        </w:rPr>
+        <w:t>✔</w:t>
+      </w:r>
+      <w:r>
+        <w:t xml:space="preserve"> Version control working</w:t>
+      </w:r>
+    </w:p>
+    <w:p>
+      <w:pPr>
+        <w:pStyle w:val="NormalWeb"/>
+      </w:pPr>
+      <w:r>
+        <w:t xml:space="preserve">Now we’ll turn this into a </w:t>
+      </w:r>
+      <w:r>
+        <w:rPr>
+          <w:rStyle w:val="Strong"/>
+        </w:rPr>
+        <w:t>professional ML portfolio project</w:t>
+      </w:r>
+      <w:r>
+        <w:t xml:space="preserve"> recruiters will actually notice.</w:t>
+      </w:r>
+    </w:p>
+    <w:p>
+      <w:r>
+        <w:pict w14:anchorId="46904114">
+          <v:rect id="_x0000_i1074" style="width:0;height:1.5pt" o:hralign="center" o:hrstd="t" o:hr="t" fillcolor="#a0a0a0" stroked="f"/>
+        </w:pict>
+      </w:r>
+    </w:p>
+    <w:p>
+      <w:pPr>
+        <w:pStyle w:val="Heading1"/>
+      </w:pPr>
+      <w:r>
+        <w:rPr>
+          <w:rFonts w:ascii="Segoe UI Emoji" w:hAnsi="Segoe UI Emoji" w:cs="Segoe UI Emoji"/>
+        </w:rPr>
+        <w:t>🚀</w:t>
+      </w:r>
+      <w:r>
+        <w:t xml:space="preserve"> YOUR NEXT ROADMAP (IMPORTANT)</w:t>
+      </w:r>
+    </w:p>
+    <w:p>
+      <w:pPr>
+        <w:pStyle w:val="NormalWeb"/>
+      </w:pPr>
+      <w:r>
+        <w:t>We’ll do this in order:</w:t>
+      </w:r>
+    </w:p>
+    <w:p>
+      <w:pPr>
+        <w:pStyle w:val="Heading2"/>
+      </w:pPr>
+      <w:r>
+        <w:rPr>
+          <w:rFonts w:ascii="Segoe UI Emoji" w:hAnsi="Segoe UI Emoji" w:cs="Segoe UI Emoji"/>
+        </w:rPr>
+        <w:lastRenderedPageBreak/>
+        <w:t>✅</w:t>
+      </w:r>
+      <w:r>
+        <w:t xml:space="preserve"> STEP 1 — Verify CI/CD is running</w:t>
+      </w:r>
+    </w:p>
+    <w:p>
+      <w:pPr>
+        <w:pStyle w:val="Heading2"/>
+      </w:pPr>
+      <w:r>
+        <w:rPr>
+          <w:rFonts w:ascii="Segoe UI Emoji" w:hAnsi="Segoe UI Emoji" w:cs="Segoe UI Emoji"/>
+        </w:rPr>
+        <w:t>✅</w:t>
+      </w:r>
+      <w:r>
+        <w:t xml:space="preserve"> STEP 2 — Add professional README</w:t>
+      </w:r>
+    </w:p>
+    <w:p>
+      <w:pPr>
+        <w:pStyle w:val="Heading2"/>
+      </w:pPr>
+      <w:r>
+        <w:rPr>
+          <w:rFonts w:ascii="Segoe UI Emoji" w:hAnsi="Segoe UI Emoji" w:cs="Segoe UI Emoji"/>
+        </w:rPr>
+        <w:t>✅</w:t>
+      </w:r>
+      <w:r>
+        <w:t xml:space="preserve"> STEP 3 — Add API testing</w:t>
+      </w:r>
+    </w:p>
+    <w:p>
+      <w:pPr>
+        <w:pStyle w:val="Heading2"/>
+      </w:pPr>
+      <w:r>
+        <w:rPr>
+          <w:rFonts w:ascii="Segoe UI Emoji" w:hAnsi="Segoe UI Emoji" w:cs="Segoe UI Emoji"/>
+        </w:rPr>
+        <w:t>✅</w:t>
+      </w:r>
+      <w:r>
+        <w:t xml:space="preserve"> STEP 4 — Deploy project FREE</w:t>
+      </w:r>
+    </w:p>
+    <w:p>
+      <w:pPr>
+        <w:pStyle w:val="Heading2"/>
+      </w:pPr>
+      <w:r>
+        <w:rPr>
+          <w:rFonts w:ascii="Segoe UI Emoji" w:hAnsi="Segoe UI Emoji" w:cs="Segoe UI Emoji"/>
+        </w:rPr>
+        <w:t>✅</w:t>
+      </w:r>
+      <w:r>
+        <w:t xml:space="preserve"> STEP 5 — Add project to resume</w:t>
+      </w:r>
+    </w:p>
+    <w:p>
+      <w:r>
+        <w:pict w14:anchorId="271D828B">
+          <v:rect id="_x0000_i1075" style="width:0;height:1.5pt" o:hralign="center" o:hrstd="t" o:hr="t" fillcolor="#a0a0a0" stroked="f"/>
+        </w:pict>
+      </w:r>
+    </w:p>
+    <w:p>
+      <w:pPr>
+        <w:pStyle w:val="Heading1"/>
+      </w:pPr>
+      <w:r>
+        <w:rPr>
+          <w:rFonts w:ascii="Segoe UI Emoji" w:hAnsi="Segoe UI Emoji" w:cs="Segoe UI Emoji"/>
+        </w:rPr>
+        <w:t>🚀</w:t>
+      </w:r>
+      <w:r>
+        <w:t xml:space="preserve"> STEP 1 — CHECK GITHUB ACTIONS (CI/CD)</w:t>
+      </w:r>
+    </w:p>
+    <w:p>
+      <w:pPr>
+        <w:pStyle w:val="NormalWeb"/>
+      </w:pPr>
+      <w:r>
+        <w:t>Go to your repo:</w:t>
+      </w:r>
+    </w:p>
+    <w:p>
+      <w:pPr>
+        <w:pStyle w:val="HTMLPreformatted"/>
+      </w:pPr>
+      <w:r>
+        <w:rPr>
+          <w:rStyle w:val="HTMLCode"/>
+        </w:rPr>
+        <w:t>GitHub → Actions tab</w:t>
+      </w:r>
+    </w:p>
+    <w:p>
+      <w:pPr>
+        <w:pStyle w:val="NormalWeb"/>
+      </w:pPr>
+      <w:r>
+        <w:t>You should see:</w:t>
+      </w:r>
+    </w:p>
+    <w:p>
+      <w:pPr>
+        <w:pStyle w:val="HTMLPreformatted"/>
+      </w:pPr>
+      <w:r>
+        <w:rPr>
+          <w:rStyle w:val="HTMLCode"/>
+        </w:rPr>
+        <w:t>Titanic ML CI/CD</w:t>
+      </w:r>
+    </w:p>
+    <w:p>
+      <w:r>
+        <w:pict w14:anchorId="3225E603">
+          <v:rect id="_x0000_i1076" style="width:0;height:1.5pt" o:hralign="center" o:hrstd="t" o:hr="t" fillcolor="#a0a0a0" stroked="f"/>
+        </w:pict>
+      </w:r>
+    </w:p>
+    <w:p>
+      <w:pPr>
+        <w:pStyle w:val="Heading2"/>
+      </w:pPr>
+      <w:r>
+        <w:rPr>
+          <w:rFonts w:ascii="Segoe UI Emoji" w:hAnsi="Segoe UI Emoji" w:cs="Segoe UI Emoji"/>
+        </w:rPr>
+        <w:t>🟢</w:t>
+      </w:r>
+      <w:r>
+        <w:t xml:space="preserve"> If GREEN TICK appears</w:t>
+      </w:r>
+    </w:p>
+    <w:p>
+      <w:pPr>
+        <w:pStyle w:val="NormalWeb"/>
+      </w:pPr>
+      <w:r>
+        <w:rPr>
+          <w:rFonts w:ascii="Segoe UI Emoji" w:hAnsi="Segoe UI Emoji" w:cs="Segoe UI Emoji"/>
+        </w:rPr>
+        <w:t>✔</w:t>
+      </w:r>
+      <w:r>
+        <w:t xml:space="preserve"> CI/CD working perfectly</w:t>
+      </w:r>
+    </w:p>
+    <w:p>
+      <w:r>
+        <w:pict w14:anchorId="72F5E0EC">
+          <v:rect id="_x0000_i1077" style="width:0;height:1.5pt" o:hralign="center" o:hrstd="t" o:hr="t" fillcolor="#a0a0a0" stroked="f"/>
+        </w:pict>
+      </w:r>
+    </w:p>
+    <w:p>
+      <w:pPr>
+        <w:pStyle w:val="Heading2"/>
+      </w:pPr>
+      <w:r>
+        <w:rPr>
+          <w:rFonts w:ascii="Segoe UI Emoji" w:hAnsi="Segoe UI Emoji" w:cs="Segoe UI Emoji"/>
+        </w:rPr>
+        <w:t>🔴</w:t>
+      </w:r>
+      <w:r>
+        <w:t xml:space="preserve"> If RED CROSS appears</w:t>
+      </w:r>
+    </w:p>
+    <w:p>
+      <w:pPr>
+        <w:pStyle w:val="NormalWeb"/>
+      </w:pPr>
+      <w:r>
+        <w:t>Click workflow → copy error → send me screenshot/text.</w:t>
+      </w:r>
+    </w:p>
+    <w:p>
+      <w:pPr>
+        <w:pStyle w:val="NormalWeb"/>
+      </w:pPr>
+      <w:r>
+        <w:t>I’ll fix it.</w:t>
+      </w:r>
+    </w:p>
+    <w:p>
+      <w:pPr>
+        <w:tabs>
+          <w:tab w:val="left" w:pos="916"/>
+          <w:tab w:val="left" w:pos="1832"/>
+          <w:tab w:val="left" w:pos="2748"/>
+          <w:tab w:val="left" w:pos="3664"/>
+          <w:tab w:val="left" w:pos="4580"/>
+          <w:tab w:val="left" w:pos="5496"/>
+          <w:tab w:val="left" w:pos="6412"/>
+          <w:tab w:val="left" w:pos="7328"/>
+          <w:tab w:val="left" w:pos="8244"/>
+          <w:tab w:val="left" w:pos="9160"/>
+          <w:tab w:val="left" w:pos="10076"/>
+          <w:tab w:val="left" w:pos="10992"/>
+          <w:tab w:val="left" w:pos="11908"/>
+          <w:tab w:val="left" w:pos="12824"/>
+          <w:tab w:val="left" w:pos="13740"/>
+          <w:tab w:val="left" w:pos="14656"/>
+        </w:tabs>
+        <w:spacing w:after="0" w:line="240" w:lineRule="auto"/>
+        <w:rPr>
+          <w:rFonts w:ascii="Courier New" w:eastAsia="Times New Roman" w:hAnsi="Courier New" w:cs="Courier New"/>
+          <w:sz w:val="20"/>
+          <w:szCs w:val="20"/>
+          <w:lang w:eastAsia="en-IN"/>
+        </w:rPr>
+      </w:pPr>
+      <w:r>
+        <w:rPr>
+          <w:rFonts w:ascii="Courier New" w:eastAsia="Times New Roman" w:hAnsi="Courier New" w:cs="Courier New"/>
+          <w:sz w:val="20"/>
+          <w:szCs w:val="20"/>
+          <w:lang w:eastAsia="en-IN"/>
+        </w:rPr>
+        <w:t>I got red cross ---</w:t>
+      </w:r>
+    </w:p>
+    <w:p>
+      <w:pPr>
+        <w:spacing w:before="100" w:beforeAutospacing="1" w:after="100" w:afterAutospacing="1" w:line="240" w:lineRule="auto"/>
+        <w:rPr>
+          <w:rFonts w:ascii="Times New Roman" w:eastAsia="Times New Roman" w:hAnsi="Times New Roman" w:cs="Times New Roman"/>
+          <w:sz w:val="24"/>
+          <w:szCs w:val="24"/>
+          <w:lang w:eastAsia="en-IN"/>
+        </w:rPr>
+      </w:pPr>
+      <w:r>
+        <w:rPr>
+          <w:rFonts w:ascii="Times New Roman" w:eastAsia="Times New Roman" w:hAnsi="Times New Roman" w:cs="Times New Roman"/>
+          <w:sz w:val="24"/>
+          <w:szCs w:val="24"/>
+          <w:lang w:eastAsia="en-IN"/>
+        </w:rPr>
+        <w:t>Your GitHub Actions runner is using:</w:t>
+      </w:r>
+    </w:p>
+    <w:p>
+      <w:pPr>
+        <w:tabs>
+          <w:tab w:val="left" w:pos="916"/>
+          <w:tab w:val="left" w:pos="1832"/>
+          <w:tab w:val="left" w:pos="2748"/>
+          <w:tab w:val="left" w:pos="3664"/>
+          <w:tab w:val="left" w:pos="4580"/>
+          <w:tab w:val="left" w:pos="5496"/>
+          <w:tab w:val="left" w:pos="6412"/>
+          <w:tab w:val="left" w:pos="7328"/>
+          <w:tab w:val="left" w:pos="8244"/>
+          <w:tab w:val="left" w:pos="9160"/>
+          <w:tab w:val="left" w:pos="10076"/>
+          <w:tab w:val="left" w:pos="10992"/>
+          <w:tab w:val="left" w:pos="11908"/>
+          <w:tab w:val="left" w:pos="12824"/>
+          <w:tab w:val="left" w:pos="13740"/>
+          <w:tab w:val="left" w:pos="14656"/>
+        </w:tabs>
+        <w:spacing w:after="0" w:line="240" w:lineRule="auto"/>
+        <w:rPr>
+          <w:rFonts w:ascii="Courier New" w:eastAsia="Times New Roman" w:hAnsi="Courier New" w:cs="Courier New"/>
+          <w:sz w:val="20"/>
+          <w:szCs w:val="20"/>
+          <w:lang w:eastAsia="en-IN"/>
+        </w:rPr>
+      </w:pPr>
+      <w:r>
+        <w:rPr>
+          <w:rFonts w:ascii="Courier New" w:eastAsia="Times New Roman" w:hAnsi="Courier New" w:cs="Courier New"/>
+          <w:sz w:val="20"/>
+          <w:szCs w:val="20"/>
+          <w:lang w:eastAsia="en-IN"/>
+        </w:rPr>
+        <w:t>Python 3.10</w:t>
+      </w:r>
+    </w:p>
+    <w:p>
+      <w:pPr>
+        <w:spacing w:before="100" w:beforeAutospacing="1" w:after="100" w:afterAutospacing="1" w:line="240" w:lineRule="auto"/>
+        <w:rPr>
+          <w:rFonts w:ascii="Times New Roman" w:eastAsia="Times New Roman" w:hAnsi="Times New Roman" w:cs="Times New Roman"/>
+          <w:sz w:val="24"/>
+          <w:szCs w:val="24"/>
+          <w:lang w:eastAsia="en-IN"/>
+        </w:rPr>
+      </w:pPr>
+      <w:r>
+        <w:rPr>
+          <w:rFonts w:ascii="Times New Roman" w:eastAsia="Times New Roman" w:hAnsi="Times New Roman" w:cs="Times New Roman"/>
+          <w:sz w:val="24"/>
+          <w:szCs w:val="24"/>
+          <w:lang w:eastAsia="en-IN"/>
+        </w:rPr>
+        <w:t xml:space="preserve">But your </w:t>
+      </w:r>
+      <w:r>
+        <w:rPr>
+          <w:rFonts w:ascii="Courier New" w:eastAsia="Times New Roman" w:hAnsi="Courier New" w:cs="Courier New"/>
+          <w:sz w:val="20"/>
+          <w:szCs w:val="20"/>
+          <w:lang w:eastAsia="en-IN"/>
+        </w:rPr>
+        <w:t>requirements.txt</w:t>
+      </w:r>
+      <w:r>
+        <w:rPr>
+          <w:rFonts w:ascii="Times New Roman" w:eastAsia="Times New Roman" w:hAnsi="Times New Roman" w:cs="Times New Roman"/>
+          <w:sz w:val="24"/>
+          <w:szCs w:val="24"/>
+          <w:lang w:eastAsia="en-IN"/>
+        </w:rPr>
+        <w:t xml:space="preserve"> contains:</w:t>
+      </w:r>
+    </w:p>
+    <w:p>
+      <w:pPr>
+        <w:tabs>
+          <w:tab w:val="left" w:pos="916"/>
+          <w:tab w:val="left" w:pos="1832"/>
+          <w:tab w:val="left" w:pos="2748"/>
+          <w:tab w:val="left" w:pos="3664"/>
+          <w:tab w:val="left" w:pos="4580"/>
+          <w:tab w:val="left" w:pos="5496"/>
+          <w:tab w:val="left" w:pos="6412"/>
+          <w:tab w:val="left" w:pos="7328"/>
+          <w:tab w:val="left" w:pos="8244"/>
+          <w:tab w:val="left" w:pos="9160"/>
+          <w:tab w:val="left" w:pos="10076"/>
+          <w:tab w:val="left" w:pos="10992"/>
+          <w:tab w:val="left" w:pos="11908"/>
+          <w:tab w:val="left" w:pos="12824"/>
+          <w:tab w:val="left" w:pos="13740"/>
+          <w:tab w:val="left" w:pos="14656"/>
+        </w:tabs>
+        <w:spacing w:after="0" w:line="240" w:lineRule="auto"/>
+        <w:rPr>
+          <w:rFonts w:ascii="Courier New" w:eastAsia="Times New Roman" w:hAnsi="Courier New" w:cs="Courier New"/>
+          <w:sz w:val="20"/>
+          <w:szCs w:val="20"/>
+          <w:lang w:eastAsia="en-IN"/>
+        </w:rPr>
+      </w:pPr>
+      <w:proofErr w:type="spellStart"/>
+      <w:r>
+        <w:rPr>
+          <w:rFonts w:ascii="Courier New" w:eastAsia="Times New Roman" w:hAnsi="Courier New" w:cs="Courier New"/>
+          <w:sz w:val="20"/>
+          <w:szCs w:val="20"/>
+          <w:lang w:eastAsia="en-IN"/>
+        </w:rPr>
+        <w:t>contourpy</w:t>
+      </w:r>
+      <w:proofErr w:type="spellEnd"/>
+      <w:r>
+        <w:rPr>
+          <w:rFonts w:ascii="Courier New" w:eastAsia="Times New Roman" w:hAnsi="Courier New" w:cs="Courier New"/>
+          <w:sz w:val="20"/>
+          <w:szCs w:val="20"/>
+          <w:lang w:eastAsia="en-IN"/>
+        </w:rPr>
+        <w:t>==1.3.3</w:t>
+      </w:r>
+    </w:p>
+    <w:p>
+      <w:pPr>
+        <w:spacing w:before="100" w:beforeAutospacing="1" w:after="100" w:afterAutospacing="1" w:line="240" w:lineRule="auto"/>
+        <w:rPr>
+          <w:rFonts w:ascii="Times New Roman" w:eastAsia="Times New Roman" w:hAnsi="Times New Roman" w:cs="Times New Roman"/>
+          <w:sz w:val="24"/>
+          <w:szCs w:val="24"/>
+          <w:lang w:eastAsia="en-IN"/>
+        </w:rPr>
+      </w:pPr>
+      <w:r>
+        <w:rPr>
+          <w:rFonts w:ascii="Times New Roman" w:eastAsia="Times New Roman" w:hAnsi="Times New Roman" w:cs="Times New Roman"/>
+          <w:sz w:val="24"/>
+          <w:szCs w:val="24"/>
+          <w:lang w:eastAsia="en-IN"/>
+        </w:rPr>
+        <w:t>And that version requires:</w:t>
+      </w:r>
+    </w:p>
+    <w:p>
+      <w:pPr>
+        <w:tabs>
+          <w:tab w:val="left" w:pos="916"/>
+          <w:tab w:val="left" w:pos="1832"/>
+          <w:tab w:val="left" w:pos="2748"/>
+          <w:tab w:val="left" w:pos="3664"/>
+          <w:tab w:val="left" w:pos="4580"/>
+          <w:tab w:val="left" w:pos="5496"/>
+          <w:tab w:val="left" w:pos="6412"/>
+          <w:tab w:val="left" w:pos="7328"/>
+          <w:tab w:val="left" w:pos="8244"/>
+          <w:tab w:val="left" w:pos="9160"/>
+          <w:tab w:val="left" w:pos="10076"/>
+          <w:tab w:val="left" w:pos="10992"/>
+          <w:tab w:val="left" w:pos="11908"/>
+          <w:tab w:val="left" w:pos="12824"/>
+          <w:tab w:val="left" w:pos="13740"/>
+          <w:tab w:val="left" w:pos="14656"/>
+        </w:tabs>
+        <w:spacing w:after="0" w:line="240" w:lineRule="auto"/>
+        <w:rPr>
+          <w:rFonts w:ascii="Courier New" w:eastAsia="Times New Roman" w:hAnsi="Courier New" w:cs="Courier New"/>
+          <w:sz w:val="20"/>
+          <w:szCs w:val="20"/>
+          <w:lang w:eastAsia="en-IN"/>
+        </w:rPr>
+      </w:pPr>
+      <w:r>
+        <w:rPr>
+          <w:rFonts w:ascii="Courier New" w:eastAsia="Times New Roman" w:hAnsi="Courier New" w:cs="Courier New"/>
+          <w:sz w:val="20"/>
+          <w:szCs w:val="20"/>
+          <w:lang w:eastAsia="en-IN"/>
+        </w:rPr>
+        <w:t>Python &gt;= 3.11</w:t>
+      </w:r>
+    </w:p>
+    <w:p>
+      <w:pPr>
+        <w:spacing w:before="100" w:beforeAutospacing="1" w:after="100" w:afterAutospacing="1" w:line="240" w:lineRule="auto"/>
+        <w:rPr>
+          <w:rFonts w:ascii="Times New Roman" w:eastAsia="Times New Roman" w:hAnsi="Times New Roman" w:cs="Times New Roman"/>
+          <w:sz w:val="24"/>
+          <w:szCs w:val="24"/>
+          <w:lang w:eastAsia="en-IN"/>
+        </w:rPr>
+      </w:pPr>
+      <w:proofErr w:type="gramStart"/>
+      <w:r>
+        <w:rPr>
+          <w:rFonts w:ascii="Times New Roman" w:eastAsia="Times New Roman" w:hAnsi="Times New Roman" w:cs="Times New Roman"/>
+          <w:sz w:val="24"/>
+          <w:szCs w:val="24"/>
+          <w:lang w:eastAsia="en-IN"/>
+        </w:rPr>
+        <w:t>So</w:t>
+      </w:r>
+      <w:proofErr w:type="gramEnd"/>
+      <w:r>
+        <w:rPr>
+          <w:rFonts w:ascii="Times New Roman" w:eastAsia="Times New Roman" w:hAnsi="Times New Roman" w:cs="Times New Roman"/>
+          <w:sz w:val="24"/>
+          <w:szCs w:val="24"/>
+          <w:lang w:eastAsia="en-IN"/>
+        </w:rPr>
+        <w:t xml:space="preserve"> CI/CD fails.</w:t>
+      </w:r>
+    </w:p>
+    <w:p>
+      <w:pPr>
+        <w:spacing w:after="0" w:line="240" w:lineRule="auto"/>
+        <w:rPr>
+          <w:rFonts w:ascii="Times New Roman" w:eastAsia="Times New Roman" w:hAnsi="Times New Roman" w:cs="Times New Roman"/>
+          <w:sz w:val="24"/>
+          <w:szCs w:val="24"/>
+          <w:lang w:eastAsia="en-IN"/>
+        </w:rPr>
+      </w:pPr>
+      <w:r>
+        <w:rPr>
+          <w:rFonts w:ascii="Times New Roman" w:eastAsia="Times New Roman" w:hAnsi="Times New Roman" w:cs="Times New Roman"/>
+          <w:sz w:val="24"/>
+          <w:szCs w:val="24"/>
+          <w:lang w:eastAsia="en-IN"/>
+        </w:rPr>
+        <w:lastRenderedPageBreak/>
+        <w:pict w14:anchorId="59A320E6">
+          <v:rect id="_x0000_i1082" style="width:0;height:1.5pt" o:hralign="center" o:hrstd="t" o:hr="t" fillcolor="#a0a0a0" stroked="f"/>
+        </w:pict>
+      </w:r>
+    </w:p>
+    <w:p>
+      <w:pPr>
+        <w:spacing w:before="100" w:beforeAutospacing="1" w:after="100" w:afterAutospacing="1" w:line="240" w:lineRule="auto"/>
+        <w:outlineLvl w:val="0"/>
+        <w:rPr>
+          <w:rFonts w:ascii="Times New Roman" w:eastAsia="Times New Roman" w:hAnsi="Times New Roman" w:cs="Times New Roman"/>
+          <w:b/>
+          <w:bCs/>
+          <w:kern w:val="36"/>
+          <w:sz w:val="48"/>
+          <w:szCs w:val="48"/>
+          <w:lang w:eastAsia="en-IN"/>
+        </w:rPr>
+      </w:pPr>
+      <w:r>
+        <w:rPr>
+          <w:rFonts w:ascii="Segoe UI Emoji" w:eastAsia="Times New Roman" w:hAnsi="Segoe UI Emoji" w:cs="Segoe UI Emoji"/>
+          <w:b/>
+          <w:bCs/>
+          <w:kern w:val="36"/>
+          <w:sz w:val="48"/>
+          <w:szCs w:val="48"/>
+          <w:lang w:eastAsia="en-IN"/>
+        </w:rPr>
+        <w:t>🚀</w:t>
+      </w:r>
+      <w:r>
+        <w:rPr>
+          <w:rFonts w:ascii="Times New Roman" w:eastAsia="Times New Roman" w:hAnsi="Times New Roman" w:cs="Times New Roman"/>
+          <w:b/>
+          <w:bCs/>
+          <w:kern w:val="36"/>
+          <w:sz w:val="48"/>
+          <w:szCs w:val="48"/>
+          <w:lang w:eastAsia="en-IN"/>
+        </w:rPr>
+        <w:t xml:space="preserve"> SIMPLE FIX (VERY EASY)</w:t>
+      </w:r>
+    </w:p>
+    <w:p>
+      <w:pPr>
+        <w:spacing w:before="100" w:beforeAutospacing="1" w:after="100" w:afterAutospacing="1" w:line="240" w:lineRule="auto"/>
+        <w:rPr>
+          <w:rFonts w:ascii="Times New Roman" w:eastAsia="Times New Roman" w:hAnsi="Times New Roman" w:cs="Times New Roman"/>
+          <w:sz w:val="24"/>
+          <w:szCs w:val="24"/>
+          <w:lang w:eastAsia="en-IN"/>
+        </w:rPr>
+      </w:pPr>
+      <w:r>
+        <w:rPr>
+          <w:rFonts w:ascii="Times New Roman" w:eastAsia="Times New Roman" w:hAnsi="Times New Roman" w:cs="Times New Roman"/>
+          <w:sz w:val="24"/>
+          <w:szCs w:val="24"/>
+          <w:lang w:eastAsia="en-IN"/>
+        </w:rPr>
+        <w:t>We will install a compatible version.</w:t>
+      </w:r>
+    </w:p>
+    <w:p>
+      <w:pPr>
+        <w:spacing w:after="0" w:line="240" w:lineRule="auto"/>
+        <w:rPr>
+          <w:rFonts w:ascii="Times New Roman" w:eastAsia="Times New Roman" w:hAnsi="Times New Roman" w:cs="Times New Roman"/>
+          <w:sz w:val="24"/>
+          <w:szCs w:val="24"/>
+          <w:lang w:eastAsia="en-IN"/>
+        </w:rPr>
+      </w:pPr>
+      <w:r>
+        <w:rPr>
+          <w:rFonts w:ascii="Times New Roman" w:eastAsia="Times New Roman" w:hAnsi="Times New Roman" w:cs="Times New Roman"/>
+          <w:sz w:val="24"/>
+          <w:szCs w:val="24"/>
+          <w:lang w:eastAsia="en-IN"/>
+        </w:rPr>
+        <w:pict w14:anchorId="6231FA02">
+          <v:rect id="_x0000_i1083" style="width:0;height:1.5pt" o:hralign="center" o:hrstd="t" o:hr="t" fillcolor="#a0a0a0" stroked="f"/>
+        </w:pict>
+      </w:r>
+    </w:p>
+    <w:p>
+      <w:pPr>
+        <w:spacing w:before="100" w:beforeAutospacing="1" w:after="100" w:afterAutospacing="1" w:line="240" w:lineRule="auto"/>
+        <w:outlineLvl w:val="0"/>
+        <w:rPr>
+          <w:rFonts w:ascii="Times New Roman" w:eastAsia="Times New Roman" w:hAnsi="Times New Roman" w:cs="Times New Roman"/>
+          <w:b/>
+          <w:bCs/>
+          <w:kern w:val="36"/>
+          <w:sz w:val="48"/>
+          <w:szCs w:val="48"/>
+          <w:lang w:eastAsia="en-IN"/>
+        </w:rPr>
+      </w:pPr>
+      <w:r>
+        <w:rPr>
+          <w:rFonts w:ascii="Segoe UI Emoji" w:eastAsia="Times New Roman" w:hAnsi="Segoe UI Emoji" w:cs="Segoe UI Emoji"/>
+          <w:b/>
+          <w:bCs/>
+          <w:kern w:val="36"/>
+          <w:sz w:val="48"/>
+          <w:szCs w:val="48"/>
+          <w:lang w:eastAsia="en-IN"/>
+        </w:rPr>
+        <w:t>🚀</w:t>
+      </w:r>
+      <w:r>
+        <w:rPr>
+          <w:rFonts w:ascii="Times New Roman" w:eastAsia="Times New Roman" w:hAnsi="Times New Roman" w:cs="Times New Roman"/>
+          <w:b/>
+          <w:bCs/>
+          <w:kern w:val="36"/>
+          <w:sz w:val="48"/>
+          <w:szCs w:val="48"/>
+          <w:lang w:eastAsia="en-IN"/>
+        </w:rPr>
+        <w:t xml:space="preserve"> STEP 1 — Open requirements.txt</w:t>
+      </w:r>
+    </w:p>
+    <w:p>
+      <w:pPr>
+        <w:spacing w:before="100" w:beforeAutospacing="1" w:after="100" w:afterAutospacing="1" w:line="240" w:lineRule="auto"/>
+        <w:rPr>
+          <w:rFonts w:ascii="Times New Roman" w:eastAsia="Times New Roman" w:hAnsi="Times New Roman" w:cs="Times New Roman"/>
+          <w:sz w:val="24"/>
+          <w:szCs w:val="24"/>
+          <w:lang w:eastAsia="en-IN"/>
+        </w:rPr>
+      </w:pPr>
+      <w:r>
+        <w:rPr>
+          <w:rFonts w:ascii="Times New Roman" w:eastAsia="Times New Roman" w:hAnsi="Times New Roman" w:cs="Times New Roman"/>
+          <w:sz w:val="24"/>
+          <w:szCs w:val="24"/>
+          <w:lang w:eastAsia="en-IN"/>
+        </w:rPr>
+        <w:t>In VS Code:</w:t>
+      </w:r>
+    </w:p>
+    <w:p>
+      <w:pPr>
+        <w:spacing w:before="100" w:beforeAutospacing="1" w:after="100" w:afterAutospacing="1" w:line="240" w:lineRule="auto"/>
+        <w:rPr>
+          <w:rFonts w:ascii="Times New Roman" w:eastAsia="Times New Roman" w:hAnsi="Times New Roman" w:cs="Times New Roman"/>
+          <w:sz w:val="24"/>
+          <w:szCs w:val="24"/>
+          <w:lang w:eastAsia="en-IN"/>
+        </w:rPr>
+      </w:pPr>
+      <w:r>
+        <w:rPr>
+          <w:rFonts w:ascii="Times New Roman" w:eastAsia="Times New Roman" w:hAnsi="Times New Roman" w:cs="Times New Roman"/>
+          <w:sz w:val="24"/>
+          <w:szCs w:val="24"/>
+          <w:lang w:eastAsia="en-IN"/>
+        </w:rPr>
+        <w:t>Open:</w:t>
+      </w:r>
+    </w:p>
+    <w:p>
+      <w:pPr>
+        <w:tabs>
+          <w:tab w:val="left" w:pos="916"/>
+          <w:tab w:val="left" w:pos="1832"/>
+          <w:tab w:val="left" w:pos="2748"/>
+          <w:tab w:val="left" w:pos="3664"/>
+          <w:tab w:val="left" w:pos="4580"/>
+          <w:tab w:val="left" w:pos="5496"/>
+          <w:tab w:val="left" w:pos="6412"/>
+          <w:tab w:val="left" w:pos="7328"/>
+          <w:tab w:val="left" w:pos="8244"/>
+          <w:tab w:val="left" w:pos="9160"/>
+          <w:tab w:val="left" w:pos="10076"/>
+          <w:tab w:val="left" w:pos="10992"/>
+          <w:tab w:val="left" w:pos="11908"/>
+          <w:tab w:val="left" w:pos="12824"/>
+          <w:tab w:val="left" w:pos="13740"/>
+          <w:tab w:val="left" w:pos="14656"/>
+        </w:tabs>
+        <w:spacing w:after="0" w:line="240" w:lineRule="auto"/>
+        <w:rPr>
+          <w:rFonts w:ascii="Courier New" w:eastAsia="Times New Roman" w:hAnsi="Courier New" w:cs="Courier New"/>
+          <w:sz w:val="20"/>
+          <w:szCs w:val="20"/>
+          <w:lang w:eastAsia="en-IN"/>
+        </w:rPr>
+      </w:pPr>
+      <w:r>
+        <w:rPr>
+          <w:rFonts w:ascii="Courier New" w:eastAsia="Times New Roman" w:hAnsi="Courier New" w:cs="Courier New"/>
+          <w:sz w:val="20"/>
+          <w:szCs w:val="20"/>
+          <w:lang w:eastAsia="en-IN"/>
+        </w:rPr>
+        <w:t>requirements.txt</w:t>
+      </w:r>
+    </w:p>
+    <w:p>
+      <w:pPr>
+        <w:spacing w:before="100" w:beforeAutospacing="1" w:after="100" w:afterAutospacing="1" w:line="240" w:lineRule="auto"/>
+        <w:rPr>
+          <w:rFonts w:ascii="Times New Roman" w:eastAsia="Times New Roman" w:hAnsi="Times New Roman" w:cs="Times New Roman"/>
+          <w:sz w:val="24"/>
+          <w:szCs w:val="24"/>
+          <w:lang w:eastAsia="en-IN"/>
+        </w:rPr>
+      </w:pPr>
+      <w:r>
+        <w:rPr>
+          <w:rFonts w:ascii="Times New Roman" w:eastAsia="Times New Roman" w:hAnsi="Times New Roman" w:cs="Times New Roman"/>
+          <w:sz w:val="24"/>
+          <w:szCs w:val="24"/>
+          <w:lang w:eastAsia="en-IN"/>
+        </w:rPr>
+        <w:t>Find:</w:t>
+      </w:r>
+    </w:p>
+    <w:p>
+      <w:pPr>
+        <w:tabs>
+          <w:tab w:val="left" w:pos="916"/>
+          <w:tab w:val="left" w:pos="1832"/>
+          <w:tab w:val="left" w:pos="2748"/>
+          <w:tab w:val="left" w:pos="3664"/>
+          <w:tab w:val="left" w:pos="4580"/>
+          <w:tab w:val="left" w:pos="5496"/>
+          <w:tab w:val="left" w:pos="6412"/>
+          <w:tab w:val="left" w:pos="7328"/>
+          <w:tab w:val="left" w:pos="8244"/>
+          <w:tab w:val="left" w:pos="9160"/>
+          <w:tab w:val="left" w:pos="10076"/>
+          <w:tab w:val="left" w:pos="10992"/>
+          <w:tab w:val="left" w:pos="11908"/>
+          <w:tab w:val="left" w:pos="12824"/>
+          <w:tab w:val="left" w:pos="13740"/>
+          <w:tab w:val="left" w:pos="14656"/>
+        </w:tabs>
+        <w:spacing w:after="0" w:line="240" w:lineRule="auto"/>
+        <w:rPr>
+          <w:rFonts w:ascii="Courier New" w:eastAsia="Times New Roman" w:hAnsi="Courier New" w:cs="Courier New"/>
+          <w:sz w:val="20"/>
+          <w:szCs w:val="20"/>
+          <w:lang w:eastAsia="en-IN"/>
+        </w:rPr>
+      </w:pPr>
+      <w:proofErr w:type="spellStart"/>
+      <w:r>
+        <w:rPr>
+          <w:rFonts w:ascii="Courier New" w:eastAsia="Times New Roman" w:hAnsi="Courier New" w:cs="Courier New"/>
+          <w:sz w:val="20"/>
+          <w:szCs w:val="20"/>
+          <w:lang w:eastAsia="en-IN"/>
+        </w:rPr>
+        <w:t>contourpy</w:t>
+      </w:r>
+      <w:proofErr w:type="spellEnd"/>
+      <w:r>
+        <w:rPr>
+          <w:rFonts w:ascii="Courier New" w:eastAsia="Times New Roman" w:hAnsi="Courier New" w:cs="Courier New"/>
+          <w:sz w:val="20"/>
+          <w:szCs w:val="20"/>
+          <w:lang w:eastAsia="en-IN"/>
+        </w:rPr>
+        <w:t>==1.3.3</w:t>
+      </w:r>
+    </w:p>
+    <w:p>
+      <w:pPr>
+        <w:spacing w:before="100" w:beforeAutospacing="1" w:after="100" w:afterAutospacing="1" w:line="240" w:lineRule="auto"/>
+        <w:rPr>
+          <w:rFonts w:ascii="Times New Roman" w:eastAsia="Times New Roman" w:hAnsi="Times New Roman" w:cs="Times New Roman"/>
+          <w:sz w:val="24"/>
+          <w:szCs w:val="24"/>
+          <w:lang w:eastAsia="en-IN"/>
+        </w:rPr>
+      </w:pPr>
+      <w:r>
+        <w:rPr>
+          <w:rFonts w:ascii="Times New Roman" w:eastAsia="Times New Roman" w:hAnsi="Times New Roman" w:cs="Times New Roman"/>
+          <w:sz w:val="24"/>
+          <w:szCs w:val="24"/>
+          <w:lang w:eastAsia="en-IN"/>
+        </w:rPr>
+        <w:t>Replace with:</w:t>
+      </w:r>
+    </w:p>
+    <w:p>
+      <w:pPr>
+        <w:tabs>
+          <w:tab w:val="left" w:pos="916"/>
+          <w:tab w:val="left" w:pos="1832"/>
+          <w:tab w:val="left" w:pos="2748"/>
+          <w:tab w:val="left" w:pos="3664"/>
+          <w:tab w:val="left" w:pos="4580"/>
+          <w:tab w:val="left" w:pos="5496"/>
+          <w:tab w:val="left" w:pos="6412"/>
+          <w:tab w:val="left" w:pos="7328"/>
+          <w:tab w:val="left" w:pos="8244"/>
+          <w:tab w:val="left" w:pos="9160"/>
+          <w:tab w:val="left" w:pos="10076"/>
+          <w:tab w:val="left" w:pos="10992"/>
+          <w:tab w:val="left" w:pos="11908"/>
+          <w:tab w:val="left" w:pos="12824"/>
+          <w:tab w:val="left" w:pos="13740"/>
+          <w:tab w:val="left" w:pos="14656"/>
+        </w:tabs>
+        <w:spacing w:after="0" w:line="240" w:lineRule="auto"/>
+        <w:rPr>
+          <w:rFonts w:ascii="Courier New" w:eastAsia="Times New Roman" w:hAnsi="Courier New" w:cs="Courier New"/>
+          <w:sz w:val="20"/>
+          <w:szCs w:val="20"/>
+          <w:lang w:eastAsia="en-IN"/>
+        </w:rPr>
+      </w:pPr>
+      <w:proofErr w:type="spellStart"/>
+      <w:r>
+        <w:rPr>
+          <w:rFonts w:ascii="Courier New" w:eastAsia="Times New Roman" w:hAnsi="Courier New" w:cs="Courier New"/>
+          <w:sz w:val="20"/>
+          <w:szCs w:val="20"/>
+          <w:lang w:eastAsia="en-IN"/>
+        </w:rPr>
+        <w:t>contourpy</w:t>
+      </w:r>
+      <w:proofErr w:type="spellEnd"/>
+      <w:r>
+        <w:rPr>
+          <w:rFonts w:ascii="Courier New" w:eastAsia="Times New Roman" w:hAnsi="Courier New" w:cs="Courier New"/>
+          <w:sz w:val="20"/>
+          <w:szCs w:val="20"/>
+          <w:lang w:eastAsia="en-IN"/>
+        </w:rPr>
+        <w:t>==1.3.2</w:t>
+      </w:r>
+    </w:p>
+    <w:p>
+      <w:pPr>
+        <w:spacing w:after="0" w:line="240" w:lineRule="auto"/>
+        <w:rPr>
+          <w:rFonts w:ascii="Times New Roman" w:eastAsia="Times New Roman" w:hAnsi="Times New Roman" w:cs="Times New Roman"/>
+          <w:sz w:val="24"/>
+          <w:szCs w:val="24"/>
+          <w:lang w:eastAsia="en-IN"/>
+        </w:rPr>
+      </w:pPr>
+      <w:r>
+        <w:rPr>
+          <w:rFonts w:ascii="Times New Roman" w:eastAsia="Times New Roman" w:hAnsi="Times New Roman" w:cs="Times New Roman"/>
+          <w:sz w:val="24"/>
+          <w:szCs w:val="24"/>
+          <w:lang w:eastAsia="en-IN"/>
+        </w:rPr>
+        <w:pict w14:anchorId="3251127E">
+          <v:rect id="_x0000_i1084" style="width:0;height:1.5pt" o:hralign="center" o:hrstd="t" o:hr="t" fillcolor="#a0a0a0" stroked="f"/>
+        </w:pict>
+      </w:r>
+    </w:p>
+    <w:p>
+      <w:pPr>
+        <w:spacing w:before="100" w:beforeAutospacing="1" w:after="100" w:afterAutospacing="1" w:line="240" w:lineRule="auto"/>
+        <w:outlineLvl w:val="0"/>
+        <w:rPr>
+          <w:rFonts w:ascii="Times New Roman" w:eastAsia="Times New Roman" w:hAnsi="Times New Roman" w:cs="Times New Roman"/>
+          <w:b/>
+          <w:bCs/>
+          <w:kern w:val="36"/>
+          <w:sz w:val="48"/>
+          <w:szCs w:val="48"/>
+          <w:lang w:eastAsia="en-IN"/>
+        </w:rPr>
+      </w:pPr>
+      <w:r>
+        <w:rPr>
+          <w:rFonts w:ascii="Segoe UI Emoji" w:eastAsia="Times New Roman" w:hAnsi="Segoe UI Emoji" w:cs="Segoe UI Emoji"/>
+          <w:b/>
+          <w:bCs/>
+          <w:kern w:val="36"/>
+          <w:sz w:val="48"/>
+          <w:szCs w:val="48"/>
+          <w:lang w:eastAsia="en-IN"/>
+        </w:rPr>
+        <w:t>🚀</w:t>
+      </w:r>
+      <w:r>
+        <w:rPr>
+          <w:rFonts w:ascii="Times New Roman" w:eastAsia="Times New Roman" w:hAnsi="Times New Roman" w:cs="Times New Roman"/>
+          <w:b/>
+          <w:bCs/>
+          <w:kern w:val="36"/>
+          <w:sz w:val="48"/>
+          <w:szCs w:val="48"/>
+          <w:lang w:eastAsia="en-IN"/>
+        </w:rPr>
+        <w:t xml:space="preserve"> STEP 2 — SAVE FILE</w:t>
+      </w:r>
+    </w:p>
+    <w:p>
+      <w:pPr>
+        <w:spacing w:before="100" w:beforeAutospacing="1" w:after="100" w:afterAutospacing="1" w:line="240" w:lineRule="auto"/>
+        <w:rPr>
+          <w:rFonts w:ascii="Times New Roman" w:eastAsia="Times New Roman" w:hAnsi="Times New Roman" w:cs="Times New Roman"/>
+          <w:sz w:val="24"/>
+          <w:szCs w:val="24"/>
+          <w:lang w:eastAsia="en-IN"/>
+        </w:rPr>
+      </w:pPr>
+      <w:r>
+        <w:rPr>
+          <w:rFonts w:ascii="Times New Roman" w:eastAsia="Times New Roman" w:hAnsi="Times New Roman" w:cs="Times New Roman"/>
+          <w:sz w:val="24"/>
+          <w:szCs w:val="24"/>
+          <w:lang w:eastAsia="en-IN"/>
+        </w:rPr>
+        <w:t>Press:</w:t>
+      </w:r>
+    </w:p>
+    <w:p>
+      <w:pPr>
+        <w:pBdr>
+          <w:bottom w:val="single" w:sz="6" w:space="1" w:color="auto"/>
+        </w:pBdr>
+        <w:tabs>
+          <w:tab w:val="left" w:pos="916"/>
+          <w:tab w:val="left" w:pos="1832"/>
+          <w:tab w:val="left" w:pos="2748"/>
+          <w:tab w:val="left" w:pos="3664"/>
+          <w:tab w:val="left" w:pos="4580"/>
+          <w:tab w:val="left" w:pos="5496"/>
+          <w:tab w:val="left" w:pos="6412"/>
+          <w:tab w:val="left" w:pos="7328"/>
+          <w:tab w:val="left" w:pos="8244"/>
+          <w:tab w:val="left" w:pos="9160"/>
+          <w:tab w:val="left" w:pos="10076"/>
+          <w:tab w:val="left" w:pos="10992"/>
+          <w:tab w:val="left" w:pos="11908"/>
+          <w:tab w:val="left" w:pos="12824"/>
+          <w:tab w:val="left" w:pos="13740"/>
+          <w:tab w:val="left" w:pos="14656"/>
+        </w:tabs>
+        <w:spacing w:after="0" w:line="240" w:lineRule="auto"/>
+        <w:rPr>
+          <w:rFonts w:ascii="Courier New" w:eastAsia="Times New Roman" w:hAnsi="Courier New" w:cs="Courier New"/>
+          <w:sz w:val="20"/>
+          <w:szCs w:val="20"/>
+          <w:lang w:eastAsia="en-IN"/>
+        </w:rPr>
+      </w:pPr>
+      <w:r>
+        <w:rPr>
+          <w:rFonts w:ascii="Courier New" w:eastAsia="Times New Roman" w:hAnsi="Courier New" w:cs="Courier New"/>
+          <w:sz w:val="20"/>
+          <w:szCs w:val="20"/>
+          <w:lang w:eastAsia="en-IN"/>
+        </w:rPr>
+        <w:t>CTRL + S</w:t>
+      </w:r>
+    </w:p>
+    <w:p>
+      <w:pPr>
+        <w:tabs>
+          <w:tab w:val="left" w:pos="916"/>
+          <w:tab w:val="left" w:pos="1832"/>
+          <w:tab w:val="left" w:pos="2748"/>
+          <w:tab w:val="left" w:pos="3664"/>
+          <w:tab w:val="left" w:pos="4580"/>
+          <w:tab w:val="left" w:pos="5496"/>
+          <w:tab w:val="left" w:pos="6412"/>
+          <w:tab w:val="left" w:pos="7328"/>
+          <w:tab w:val="left" w:pos="8244"/>
+          <w:tab w:val="left" w:pos="9160"/>
+          <w:tab w:val="left" w:pos="10076"/>
+          <w:tab w:val="left" w:pos="10992"/>
+          <w:tab w:val="left" w:pos="11908"/>
+          <w:tab w:val="left" w:pos="12824"/>
+          <w:tab w:val="left" w:pos="13740"/>
+          <w:tab w:val="left" w:pos="14656"/>
+        </w:tabs>
+        <w:spacing w:after="0" w:line="240" w:lineRule="auto"/>
+        <w:rPr>
+          <w:rFonts w:ascii="Courier New" w:eastAsia="Times New Roman" w:hAnsi="Courier New" w:cs="Courier New"/>
+          <w:sz w:val="20"/>
+          <w:szCs w:val="20"/>
+          <w:lang w:eastAsia="en-IN"/>
+        </w:rPr>
+      </w:pPr>
+      <w:r>
+        <w:rPr>
+          <w:rFonts w:ascii="Courier New" w:eastAsia="Times New Roman" w:hAnsi="Courier New" w:cs="Courier New"/>
+          <w:sz w:val="20"/>
+          <w:szCs w:val="20"/>
+          <w:lang w:eastAsia="en-IN"/>
+        </w:rPr>
+        <w:t>Gave many errors. So final requirements.txt</w:t>
+      </w:r>
+    </w:p>
+    <w:p>
+      <w:pPr>
+        <w:tabs>
+          <w:tab w:val="left" w:pos="916"/>
+          <w:tab w:val="left" w:pos="1832"/>
+          <w:tab w:val="left" w:pos="2748"/>
+          <w:tab w:val="left" w:pos="3664"/>
+          <w:tab w:val="left" w:pos="4580"/>
+          <w:tab w:val="left" w:pos="5496"/>
+          <w:tab w:val="left" w:pos="6412"/>
+          <w:tab w:val="left" w:pos="7328"/>
+          <w:tab w:val="left" w:pos="8244"/>
+          <w:tab w:val="left" w:pos="9160"/>
+          <w:tab w:val="left" w:pos="10076"/>
+          <w:tab w:val="left" w:pos="10992"/>
+          <w:tab w:val="left" w:pos="11908"/>
+          <w:tab w:val="left" w:pos="12824"/>
+          <w:tab w:val="left" w:pos="13740"/>
+          <w:tab w:val="left" w:pos="14656"/>
+        </w:tabs>
+        <w:spacing w:after="0" w:line="240" w:lineRule="auto"/>
+        <w:rPr>
+          <w:rFonts w:ascii="Courier New" w:eastAsia="Times New Roman" w:hAnsi="Courier New" w:cs="Courier New"/>
+          <w:sz w:val="20"/>
+          <w:szCs w:val="20"/>
+          <w:lang w:eastAsia="en-IN"/>
+        </w:rPr>
+      </w:pPr>
+    </w:p>
+    <w:p>
+      <w:pPr>
+        <w:shd w:val="clear" w:color="auto" w:fill="FFFFFF"/>
+        <w:spacing w:after="0" w:line="285" w:lineRule="atLeast"/>
+        <w:rPr>
+          <w:rFonts w:ascii="Consolas" w:eastAsia="Times New Roman" w:hAnsi="Consolas" w:cs="Times New Roman"/>
+          <w:color w:val="202020"/>
+          <w:sz w:val="21"/>
+          <w:szCs w:val="21"/>
+          <w:lang w:eastAsia="en-IN"/>
+        </w:rPr>
+      </w:pPr>
+      <w:proofErr w:type="spellStart"/>
+      <w:r>
+        <w:rPr>
+          <w:rFonts w:ascii="Consolas" w:eastAsia="Times New Roman" w:hAnsi="Consolas" w:cs="Times New Roman"/>
+          <w:color w:val="267F99"/>
+          <w:sz w:val="21"/>
+          <w:szCs w:val="21"/>
+          <w:lang w:eastAsia="en-IN"/>
+        </w:rPr>
+        <w:t>fastapi</w:t>
+      </w:r>
+      <w:proofErr w:type="spellEnd"/>
+      <w:r>
+        <w:rPr>
+          <w:rFonts w:ascii="Consolas" w:eastAsia="Times New Roman" w:hAnsi="Consolas" w:cs="Times New Roman"/>
+          <w:color w:val="000000"/>
+          <w:sz w:val="21"/>
+          <w:szCs w:val="21"/>
+          <w:lang w:eastAsia="en-IN"/>
+        </w:rPr>
+        <w:t>==</w:t>
+      </w:r>
+      <w:r>
+        <w:rPr>
+          <w:rFonts w:ascii="Consolas" w:eastAsia="Times New Roman" w:hAnsi="Consolas" w:cs="Times New Roman"/>
+          <w:color w:val="098658"/>
+          <w:sz w:val="21"/>
+          <w:szCs w:val="21"/>
+          <w:lang w:eastAsia="en-IN"/>
+        </w:rPr>
+        <w:t>0.116.1</w:t>
+      </w:r>
+    </w:p>
+    <w:p>
+      <w:pPr>
+        <w:shd w:val="clear" w:color="auto" w:fill="FFFFFF"/>
+        <w:spacing w:after="0" w:line="285" w:lineRule="atLeast"/>
+        <w:rPr>
+          <w:rFonts w:ascii="Consolas" w:eastAsia="Times New Roman" w:hAnsi="Consolas" w:cs="Times New Roman"/>
+          <w:color w:val="202020"/>
+          <w:sz w:val="21"/>
+          <w:szCs w:val="21"/>
+          <w:lang w:eastAsia="en-IN"/>
+        </w:rPr>
+      </w:pPr>
+      <w:proofErr w:type="spellStart"/>
+      <w:r>
+        <w:rPr>
+          <w:rFonts w:ascii="Consolas" w:eastAsia="Times New Roman" w:hAnsi="Consolas" w:cs="Times New Roman"/>
+          <w:color w:val="267F99"/>
+          <w:sz w:val="21"/>
+          <w:szCs w:val="21"/>
+          <w:lang w:eastAsia="en-IN"/>
+        </w:rPr>
+        <w:t>uvicorn</w:t>
+      </w:r>
+      <w:proofErr w:type="spellEnd"/>
+      <w:r>
+        <w:rPr>
+          <w:rFonts w:ascii="Consolas" w:eastAsia="Times New Roman" w:hAnsi="Consolas" w:cs="Times New Roman"/>
+          <w:color w:val="000000"/>
+          <w:sz w:val="21"/>
+          <w:szCs w:val="21"/>
+          <w:lang w:eastAsia="en-IN"/>
+        </w:rPr>
+        <w:t>==</w:t>
+      </w:r>
+      <w:r>
+        <w:rPr>
+          <w:rFonts w:ascii="Consolas" w:eastAsia="Times New Roman" w:hAnsi="Consolas" w:cs="Times New Roman"/>
+          <w:color w:val="098658"/>
+          <w:sz w:val="21"/>
+          <w:szCs w:val="21"/>
+          <w:lang w:eastAsia="en-IN"/>
+        </w:rPr>
+        <w:t>0.35.0</w:t>
+      </w:r>
+    </w:p>
+    <w:p>
+      <w:pPr>
+        <w:shd w:val="clear" w:color="auto" w:fill="FFFFFF"/>
+        <w:spacing w:after="0" w:line="285" w:lineRule="atLeast"/>
+        <w:rPr>
+          <w:rFonts w:ascii="Consolas" w:eastAsia="Times New Roman" w:hAnsi="Consolas" w:cs="Times New Roman"/>
+          <w:color w:val="202020"/>
+          <w:sz w:val="21"/>
+          <w:szCs w:val="21"/>
+          <w:lang w:eastAsia="en-IN"/>
+        </w:rPr>
+      </w:pPr>
+      <w:r>
+        <w:rPr>
+          <w:rFonts w:ascii="Consolas" w:eastAsia="Times New Roman" w:hAnsi="Consolas" w:cs="Times New Roman"/>
+          <w:color w:val="267F99"/>
+          <w:sz w:val="21"/>
+          <w:szCs w:val="21"/>
+          <w:lang w:eastAsia="en-IN"/>
+        </w:rPr>
+        <w:t>pandas</w:t>
+      </w:r>
+      <w:r>
+        <w:rPr>
+          <w:rFonts w:ascii="Consolas" w:eastAsia="Times New Roman" w:hAnsi="Consolas" w:cs="Times New Roman"/>
+          <w:color w:val="000000"/>
+          <w:sz w:val="21"/>
+          <w:szCs w:val="21"/>
+          <w:lang w:eastAsia="en-IN"/>
+        </w:rPr>
+        <w:t>==</w:t>
+      </w:r>
+      <w:r>
+        <w:rPr>
+          <w:rFonts w:ascii="Consolas" w:eastAsia="Times New Roman" w:hAnsi="Consolas" w:cs="Times New Roman"/>
+          <w:color w:val="098658"/>
+          <w:sz w:val="21"/>
+          <w:szCs w:val="21"/>
+          <w:lang w:eastAsia="en-IN"/>
+        </w:rPr>
+        <w:t>2.3.2</w:t>
+      </w:r>
+    </w:p>
+    <w:p>
+      <w:pPr>
+        <w:shd w:val="clear" w:color="auto" w:fill="FFFFFF"/>
+        <w:spacing w:after="0" w:line="285" w:lineRule="atLeast"/>
+        <w:rPr>
+          <w:rFonts w:ascii="Consolas" w:eastAsia="Times New Roman" w:hAnsi="Consolas" w:cs="Times New Roman"/>
+          <w:color w:val="202020"/>
+          <w:sz w:val="21"/>
+          <w:szCs w:val="21"/>
+          <w:lang w:eastAsia="en-IN"/>
+        </w:rPr>
+      </w:pPr>
+      <w:proofErr w:type="spellStart"/>
+      <w:r>
+        <w:rPr>
+          <w:rFonts w:ascii="Consolas" w:eastAsia="Times New Roman" w:hAnsi="Consolas" w:cs="Times New Roman"/>
+          <w:color w:val="267F99"/>
+          <w:sz w:val="21"/>
+          <w:szCs w:val="21"/>
+          <w:lang w:eastAsia="en-IN"/>
+        </w:rPr>
+        <w:t>numpy</w:t>
+      </w:r>
+      <w:proofErr w:type="spellEnd"/>
+      <w:r>
+        <w:rPr>
+          <w:rFonts w:ascii="Consolas" w:eastAsia="Times New Roman" w:hAnsi="Consolas" w:cs="Times New Roman"/>
+          <w:color w:val="000000"/>
+          <w:sz w:val="21"/>
+          <w:szCs w:val="21"/>
+          <w:lang w:eastAsia="en-IN"/>
+        </w:rPr>
+        <w:t>==</w:t>
+      </w:r>
+      <w:r>
+        <w:rPr>
+          <w:rFonts w:ascii="Consolas" w:eastAsia="Times New Roman" w:hAnsi="Consolas" w:cs="Times New Roman"/>
+          <w:color w:val="098658"/>
+          <w:sz w:val="21"/>
+          <w:szCs w:val="21"/>
+          <w:lang w:eastAsia="en-IN"/>
+        </w:rPr>
+        <w:t>2.2.6</w:t>
+      </w:r>
+    </w:p>
+    <w:p>
+      <w:pPr>
+        <w:shd w:val="clear" w:color="auto" w:fill="FFFFFF"/>
+        <w:spacing w:after="0" w:line="285" w:lineRule="atLeast"/>
+        <w:rPr>
+          <w:rFonts w:ascii="Consolas" w:eastAsia="Times New Roman" w:hAnsi="Consolas" w:cs="Times New Roman"/>
+          <w:color w:val="202020"/>
+          <w:sz w:val="21"/>
+          <w:szCs w:val="21"/>
+          <w:lang w:eastAsia="en-IN"/>
+        </w:rPr>
+      </w:pPr>
+      <w:r>
+        <w:rPr>
+          <w:rFonts w:ascii="Consolas" w:eastAsia="Times New Roman" w:hAnsi="Consolas" w:cs="Times New Roman"/>
+          <w:color w:val="267F99"/>
+          <w:sz w:val="21"/>
+          <w:szCs w:val="21"/>
+          <w:lang w:eastAsia="en-IN"/>
+        </w:rPr>
+        <w:t>scikit-learn</w:t>
+      </w:r>
+      <w:r>
+        <w:rPr>
+          <w:rFonts w:ascii="Consolas" w:eastAsia="Times New Roman" w:hAnsi="Consolas" w:cs="Times New Roman"/>
+          <w:color w:val="000000"/>
+          <w:sz w:val="21"/>
+          <w:szCs w:val="21"/>
+          <w:lang w:eastAsia="en-IN"/>
+        </w:rPr>
+        <w:t>==</w:t>
+      </w:r>
+      <w:r>
+        <w:rPr>
+          <w:rFonts w:ascii="Consolas" w:eastAsia="Times New Roman" w:hAnsi="Consolas" w:cs="Times New Roman"/>
+          <w:color w:val="098658"/>
+          <w:sz w:val="21"/>
+          <w:szCs w:val="21"/>
+          <w:lang w:eastAsia="en-IN"/>
+        </w:rPr>
+        <w:t>1.7.1</w:t>
+      </w:r>
+    </w:p>
+    <w:p>
+      <w:pPr>
+        <w:shd w:val="clear" w:color="auto" w:fill="FFFFFF"/>
+        <w:spacing w:after="0" w:line="285" w:lineRule="atLeast"/>
+        <w:rPr>
+          <w:rFonts w:ascii="Consolas" w:eastAsia="Times New Roman" w:hAnsi="Consolas" w:cs="Times New Roman"/>
+          <w:color w:val="202020"/>
+          <w:sz w:val="21"/>
+          <w:szCs w:val="21"/>
+          <w:lang w:eastAsia="en-IN"/>
+        </w:rPr>
+      </w:pPr>
+      <w:proofErr w:type="spellStart"/>
+      <w:r>
+        <w:rPr>
+          <w:rFonts w:ascii="Consolas" w:eastAsia="Times New Roman" w:hAnsi="Consolas" w:cs="Times New Roman"/>
+          <w:color w:val="267F99"/>
+          <w:sz w:val="21"/>
+          <w:szCs w:val="21"/>
+          <w:lang w:eastAsia="en-IN"/>
+        </w:rPr>
+        <w:t>mlflow</w:t>
+      </w:r>
+      <w:proofErr w:type="spellEnd"/>
+      <w:r>
+        <w:rPr>
+          <w:rFonts w:ascii="Consolas" w:eastAsia="Times New Roman" w:hAnsi="Consolas" w:cs="Times New Roman"/>
+          <w:color w:val="000000"/>
+          <w:sz w:val="21"/>
+          <w:szCs w:val="21"/>
+          <w:lang w:eastAsia="en-IN"/>
+        </w:rPr>
+        <w:t>==</w:t>
+      </w:r>
+      <w:r>
+        <w:rPr>
+          <w:rFonts w:ascii="Consolas" w:eastAsia="Times New Roman" w:hAnsi="Consolas" w:cs="Times New Roman"/>
+          <w:color w:val="098658"/>
+          <w:sz w:val="21"/>
+          <w:szCs w:val="21"/>
+          <w:lang w:eastAsia="en-IN"/>
+        </w:rPr>
+        <w:t>3.3.2</w:t>
+      </w:r>
+    </w:p>
+    <w:p>
+      <w:pPr>
+        <w:shd w:val="clear" w:color="auto" w:fill="FFFFFF"/>
+        <w:spacing w:after="0" w:line="285" w:lineRule="atLeast"/>
+        <w:rPr>
+          <w:rFonts w:ascii="Consolas" w:eastAsia="Times New Roman" w:hAnsi="Consolas" w:cs="Times New Roman"/>
+          <w:color w:val="202020"/>
+          <w:sz w:val="21"/>
+          <w:szCs w:val="21"/>
+          <w:lang w:eastAsia="en-IN"/>
+        </w:rPr>
+      </w:pPr>
+      <w:proofErr w:type="spellStart"/>
+      <w:r>
+        <w:rPr>
+          <w:rFonts w:ascii="Consolas" w:eastAsia="Times New Roman" w:hAnsi="Consolas" w:cs="Times New Roman"/>
+          <w:color w:val="267F99"/>
+          <w:sz w:val="21"/>
+          <w:szCs w:val="21"/>
+          <w:lang w:eastAsia="en-IN"/>
+        </w:rPr>
+        <w:t>shap</w:t>
+      </w:r>
+      <w:proofErr w:type="spellEnd"/>
+      <w:r>
+        <w:rPr>
+          <w:rFonts w:ascii="Consolas" w:eastAsia="Times New Roman" w:hAnsi="Consolas" w:cs="Times New Roman"/>
+          <w:color w:val="000000"/>
+          <w:sz w:val="21"/>
+          <w:szCs w:val="21"/>
+          <w:lang w:eastAsia="en-IN"/>
+        </w:rPr>
+        <w:t>==</w:t>
+      </w:r>
+      <w:r>
+        <w:rPr>
+          <w:rFonts w:ascii="Consolas" w:eastAsia="Times New Roman" w:hAnsi="Consolas" w:cs="Times New Roman"/>
+          <w:color w:val="098658"/>
+          <w:sz w:val="21"/>
+          <w:szCs w:val="21"/>
+          <w:lang w:eastAsia="en-IN"/>
+        </w:rPr>
+        <w:t>0.48.0</w:t>
+      </w:r>
+    </w:p>
+    <w:p>
+      <w:pPr>
+        <w:shd w:val="clear" w:color="auto" w:fill="FFFFFF"/>
+        <w:spacing w:after="0" w:line="285" w:lineRule="atLeast"/>
+        <w:rPr>
+          <w:rFonts w:ascii="Consolas" w:eastAsia="Times New Roman" w:hAnsi="Consolas" w:cs="Times New Roman"/>
+          <w:color w:val="202020"/>
+          <w:sz w:val="21"/>
+          <w:szCs w:val="21"/>
+          <w:lang w:eastAsia="en-IN"/>
+        </w:rPr>
+      </w:pPr>
+      <w:proofErr w:type="spellStart"/>
+      <w:r>
+        <w:rPr>
+          <w:rFonts w:ascii="Consolas" w:eastAsia="Times New Roman" w:hAnsi="Consolas" w:cs="Times New Roman"/>
+          <w:color w:val="267F99"/>
+          <w:sz w:val="21"/>
+          <w:szCs w:val="21"/>
+          <w:lang w:eastAsia="en-IN"/>
+        </w:rPr>
+        <w:t>pydantic</w:t>
+      </w:r>
+      <w:proofErr w:type="spellEnd"/>
+      <w:r>
+        <w:rPr>
+          <w:rFonts w:ascii="Consolas" w:eastAsia="Times New Roman" w:hAnsi="Consolas" w:cs="Times New Roman"/>
+          <w:color w:val="000000"/>
+          <w:sz w:val="21"/>
+          <w:szCs w:val="21"/>
+          <w:lang w:eastAsia="en-IN"/>
+        </w:rPr>
+        <w:t>==</w:t>
+      </w:r>
+      <w:r>
+        <w:rPr>
+          <w:rFonts w:ascii="Consolas" w:eastAsia="Times New Roman" w:hAnsi="Consolas" w:cs="Times New Roman"/>
+          <w:color w:val="098658"/>
+          <w:sz w:val="21"/>
+          <w:szCs w:val="21"/>
+          <w:lang w:eastAsia="en-IN"/>
+        </w:rPr>
+        <w:t>2.11.7</w:t>
+      </w:r>
+    </w:p>
+    <w:p>
+      <w:pPr>
+        <w:shd w:val="clear" w:color="auto" w:fill="FFFFFF"/>
+        <w:spacing w:after="0" w:line="285" w:lineRule="atLeast"/>
+        <w:rPr>
+          <w:rFonts w:ascii="Consolas" w:eastAsia="Times New Roman" w:hAnsi="Consolas" w:cs="Times New Roman"/>
+          <w:color w:val="202020"/>
+          <w:sz w:val="21"/>
+          <w:szCs w:val="21"/>
+          <w:lang w:eastAsia="en-IN"/>
+        </w:rPr>
+      </w:pPr>
+      <w:proofErr w:type="spellStart"/>
+      <w:r>
+        <w:rPr>
+          <w:rFonts w:ascii="Consolas" w:eastAsia="Times New Roman" w:hAnsi="Consolas" w:cs="Times New Roman"/>
+          <w:color w:val="267F99"/>
+          <w:sz w:val="21"/>
+          <w:szCs w:val="21"/>
+          <w:lang w:eastAsia="en-IN"/>
+        </w:rPr>
+        <w:t>pytest</w:t>
+      </w:r>
+      <w:proofErr w:type="spellEnd"/>
+      <w:r>
+        <w:rPr>
+          <w:rFonts w:ascii="Consolas" w:eastAsia="Times New Roman" w:hAnsi="Consolas" w:cs="Times New Roman"/>
+          <w:color w:val="000000"/>
+          <w:sz w:val="21"/>
+          <w:szCs w:val="21"/>
+          <w:lang w:eastAsia="en-IN"/>
+        </w:rPr>
+        <w:t>==</w:t>
+      </w:r>
+      <w:r>
+        <w:rPr>
+          <w:rFonts w:ascii="Consolas" w:eastAsia="Times New Roman" w:hAnsi="Consolas" w:cs="Times New Roman"/>
+          <w:color w:val="098658"/>
+          <w:sz w:val="21"/>
+          <w:szCs w:val="21"/>
+          <w:lang w:eastAsia="en-IN"/>
+        </w:rPr>
+        <w:t>8.4.1</w:t>
+      </w:r>
+    </w:p>
+    <w:p>
+      <w:pPr>
+        <w:shd w:val="clear" w:color="auto" w:fill="FFFFFF"/>
+        <w:spacing w:after="0" w:line="285" w:lineRule="atLeast"/>
+        <w:rPr>
+          <w:rFonts w:ascii="Consolas" w:eastAsia="Times New Roman" w:hAnsi="Consolas" w:cs="Times New Roman"/>
+          <w:color w:val="202020"/>
+          <w:sz w:val="21"/>
+          <w:szCs w:val="21"/>
+          <w:lang w:eastAsia="en-IN"/>
+        </w:rPr>
+      </w:pPr>
+      <w:r>
+        <w:rPr>
+          <w:rFonts w:ascii="Consolas" w:eastAsia="Times New Roman" w:hAnsi="Consolas" w:cs="Times New Roman"/>
+          <w:color w:val="267F99"/>
+          <w:sz w:val="21"/>
+          <w:szCs w:val="21"/>
+          <w:lang w:eastAsia="en-IN"/>
+        </w:rPr>
+        <w:t>python-multipart</w:t>
+      </w:r>
+      <w:r>
+        <w:rPr>
+          <w:rFonts w:ascii="Consolas" w:eastAsia="Times New Roman" w:hAnsi="Consolas" w:cs="Times New Roman"/>
+          <w:color w:val="000000"/>
+          <w:sz w:val="21"/>
+          <w:szCs w:val="21"/>
+          <w:lang w:eastAsia="en-IN"/>
+        </w:rPr>
+        <w:t>==</w:t>
+      </w:r>
+      <w:r>
+        <w:rPr>
+          <w:rFonts w:ascii="Consolas" w:eastAsia="Times New Roman" w:hAnsi="Consolas" w:cs="Times New Roman"/>
+          <w:color w:val="098658"/>
+          <w:sz w:val="21"/>
+          <w:szCs w:val="21"/>
+          <w:lang w:eastAsia="en-IN"/>
+        </w:rPr>
+        <w:t>0.0.20</w:t>
+      </w:r>
+    </w:p>
+    <w:p>
+      <w:pPr>
+        <w:pBdr>
+          <w:bottom w:val="single" w:sz="6" w:space="1" w:color="auto"/>
+        </w:pBdr>
+        <w:tabs>
+          <w:tab w:val="left" w:pos="916"/>
+          <w:tab w:val="left" w:pos="1832"/>
+          <w:tab w:val="left" w:pos="2748"/>
+          <w:tab w:val="left" w:pos="3664"/>
+          <w:tab w:val="left" w:pos="4580"/>
+          <w:tab w:val="left" w:pos="5496"/>
+          <w:tab w:val="left" w:pos="6412"/>
+          <w:tab w:val="left" w:pos="7328"/>
+          <w:tab w:val="left" w:pos="8244"/>
+          <w:tab w:val="left" w:pos="9160"/>
+          <w:tab w:val="left" w:pos="10076"/>
+          <w:tab w:val="left" w:pos="10992"/>
+          <w:tab w:val="left" w:pos="11908"/>
+          <w:tab w:val="left" w:pos="12824"/>
+          <w:tab w:val="left" w:pos="13740"/>
+          <w:tab w:val="left" w:pos="14656"/>
+        </w:tabs>
+        <w:spacing w:after="0" w:line="240" w:lineRule="auto"/>
+        <w:rPr>
+          <w:rFonts w:ascii="Courier New" w:eastAsia="Times New Roman" w:hAnsi="Courier New" w:cs="Courier New"/>
+          <w:sz w:val="20"/>
+          <w:szCs w:val="20"/>
+          <w:lang w:eastAsia="en-IN"/>
+        </w:rPr>
+      </w:pPr>
+    </w:p>
+    <w:p>
+      <w:pPr>
+        <w:tabs>
+          <w:tab w:val="left" w:pos="916"/>
+          <w:tab w:val="left" w:pos="1832"/>
+          <w:tab w:val="left" w:pos="2748"/>
+          <w:tab w:val="left" w:pos="3664"/>
+          <w:tab w:val="left" w:pos="4580"/>
+          <w:tab w:val="left" w:pos="5496"/>
+          <w:tab w:val="left" w:pos="6412"/>
+          <w:tab w:val="left" w:pos="7328"/>
+          <w:tab w:val="left" w:pos="8244"/>
+          <w:tab w:val="left" w:pos="9160"/>
+          <w:tab w:val="left" w:pos="10076"/>
+          <w:tab w:val="left" w:pos="10992"/>
+          <w:tab w:val="left" w:pos="11908"/>
+          <w:tab w:val="left" w:pos="12824"/>
+          <w:tab w:val="left" w:pos="13740"/>
+          <w:tab w:val="left" w:pos="14656"/>
+        </w:tabs>
+        <w:spacing w:after="0" w:line="240" w:lineRule="auto"/>
+        <w:rPr>
+          <w:rFonts w:ascii="Courier New" w:eastAsia="Times New Roman" w:hAnsi="Courier New" w:cs="Courier New"/>
+          <w:sz w:val="20"/>
+          <w:szCs w:val="20"/>
+          <w:lang w:eastAsia="en-IN"/>
+        </w:rPr>
+      </w:pPr>
+    </w:p>
+    <w:p>
+      <w:pPr>
+        <w:tabs>
+          <w:tab w:val="left" w:pos="916"/>
+          <w:tab w:val="left" w:pos="1832"/>
+          <w:tab w:val="left" w:pos="2748"/>
+          <w:tab w:val="left" w:pos="3664"/>
+          <w:tab w:val="left" w:pos="4580"/>
+          <w:tab w:val="left" w:pos="5496"/>
+          <w:tab w:val="left" w:pos="6412"/>
+          <w:tab w:val="left" w:pos="7328"/>
+          <w:tab w:val="left" w:pos="8244"/>
+          <w:tab w:val="left" w:pos="9160"/>
+          <w:tab w:val="left" w:pos="10076"/>
+          <w:tab w:val="left" w:pos="10992"/>
+          <w:tab w:val="left" w:pos="11908"/>
+          <w:tab w:val="left" w:pos="12824"/>
+          <w:tab w:val="left" w:pos="13740"/>
+          <w:tab w:val="left" w:pos="14656"/>
+        </w:tabs>
+        <w:spacing w:after="0" w:line="240" w:lineRule="auto"/>
+        <w:rPr>
+          <w:rFonts w:ascii="Courier New" w:eastAsia="Times New Roman" w:hAnsi="Courier New" w:cs="Courier New"/>
+          <w:sz w:val="20"/>
+          <w:szCs w:val="20"/>
+          <w:lang w:eastAsia="en-IN"/>
+        </w:rPr>
+      </w:pPr>
+      <w:r>
+        <w:rPr>
+          <w:rFonts w:ascii="Courier New" w:eastAsia="Times New Roman" w:hAnsi="Courier New" w:cs="Courier New"/>
+          <w:sz w:val="20"/>
+          <w:szCs w:val="20"/>
+          <w:lang w:eastAsia="en-IN"/>
+        </w:rPr>
+        <w:t>For next error—</w:t>
+      </w:r>
+    </w:p>
+    <w:p>
+      <w:pPr>
+        <w:pStyle w:val="Heading1"/>
+      </w:pPr>
+      <w:r>
+        <w:rPr>
+          <w:rFonts w:ascii="Segoe UI Emoji" w:hAnsi="Segoe UI Emoji" w:cs="Segoe UI Emoji"/>
+        </w:rPr>
+        <w:lastRenderedPageBreak/>
+        <w:t>🚀</w:t>
+      </w:r>
+      <w:r>
+        <w:t xml:space="preserve"> STEP 1 — TRAIN &amp; SAVE </w:t>
+      </w:r>
+      <w:proofErr w:type="spellStart"/>
+      <w:r>
+        <w:t>model.pkl</w:t>
+      </w:r>
+      <w:proofErr w:type="spellEnd"/>
+      <w:r>
+        <w:t xml:space="preserve"> LOCALLY</w:t>
+      </w:r>
+    </w:p>
+    <w:p>
+      <w:pPr>
+        <w:pStyle w:val="NormalWeb"/>
+      </w:pPr>
+      <w:r>
+        <w:t xml:space="preserve">Modify your </w:t>
+      </w:r>
+      <w:r>
+        <w:rPr>
+          <w:rStyle w:val="HTMLCode"/>
+        </w:rPr>
+        <w:t>model/train.py</w:t>
+      </w:r>
+      <w:r>
+        <w:t>.</w:t>
+      </w:r>
+    </w:p>
+    <w:p>
+      <w:pPr>
+        <w:pStyle w:val="NormalWeb"/>
+      </w:pPr>
+      <w:r>
+        <w:t>At the END add:</w:t>
+      </w:r>
+    </w:p>
+    <w:p>
+      <w:pPr>
+        <w:pStyle w:val="HTMLPreformatted"/>
+      </w:pPr>
+      <w:r>
+        <w:rPr>
+          <w:rStyle w:val="g"/>
+        </w:rPr>
+        <w:t>import</w:t>
+      </w:r>
+      <w:r>
+        <w:rPr>
+          <w:rStyle w:val="HTMLCode"/>
+        </w:rPr>
+        <w:t xml:space="preserve"> </w:t>
+      </w:r>
+      <w:proofErr w:type="spellStart"/>
+      <w:r>
+        <w:rPr>
+          <w:rStyle w:val="m"/>
+        </w:rPr>
+        <w:t>joblib</w:t>
+      </w:r>
+      <w:proofErr w:type="spellEnd"/>
+      <w:r>
+        <w:br/>
+      </w:r>
+      <w:r>
+        <w:br/>
+      </w:r>
+      <w:proofErr w:type="spellStart"/>
+      <w:proofErr w:type="gramStart"/>
+      <w:r>
+        <w:rPr>
+          <w:rStyle w:val="m"/>
+        </w:rPr>
+        <w:t>joblib</w:t>
+      </w:r>
+      <w:r>
+        <w:rPr>
+          <w:rStyle w:val="g"/>
+        </w:rPr>
+        <w:t>.</w:t>
+      </w:r>
+      <w:r>
+        <w:rPr>
+          <w:rStyle w:val="HTMLCode"/>
+        </w:rPr>
+        <w:t>dump</w:t>
+      </w:r>
+      <w:proofErr w:type="spellEnd"/>
+      <w:proofErr w:type="gramEnd"/>
+      <w:r>
+        <w:rPr>
+          <w:rStyle w:val="HTMLCode"/>
+        </w:rPr>
+        <w:t>(</w:t>
+      </w:r>
+      <w:r>
+        <w:rPr>
+          <w:rStyle w:val="m"/>
+        </w:rPr>
+        <w:t>pipeline</w:t>
+      </w:r>
+      <w:r>
+        <w:rPr>
+          <w:rStyle w:val="HTMLCode"/>
+        </w:rPr>
+        <w:t xml:space="preserve">, </w:t>
+      </w:r>
+      <w:r>
+        <w:rPr>
+          <w:rStyle w:val="k"/>
+        </w:rPr>
+        <w:t>"model/</w:t>
+      </w:r>
+      <w:proofErr w:type="spellStart"/>
+      <w:r>
+        <w:rPr>
+          <w:rStyle w:val="k"/>
+        </w:rPr>
+        <w:t>model.pkl</w:t>
+      </w:r>
+      <w:proofErr w:type="spellEnd"/>
+      <w:r>
+        <w:rPr>
+          <w:rStyle w:val="k"/>
+        </w:rPr>
+        <w:t>"</w:t>
+      </w:r>
+      <w:r>
+        <w:rPr>
+          <w:rStyle w:val="HTMLCode"/>
+        </w:rPr>
+        <w:t>)</w:t>
+      </w:r>
+      <w:r>
+        <w:br/>
+      </w:r>
+      <w:r>
+        <w:br/>
+      </w:r>
+      <w:r>
+        <w:rPr>
+          <w:rStyle w:val="m"/>
+        </w:rPr>
+        <w:t>print</w:t>
+      </w:r>
+      <w:r>
+        <w:rPr>
+          <w:rStyle w:val="HTMLCode"/>
+        </w:rPr>
+        <w:t>(</w:t>
+      </w:r>
+      <w:r>
+        <w:rPr>
+          <w:rStyle w:val="k"/>
+        </w:rPr>
+        <w:t>"Model saved successfully"</w:t>
+      </w:r>
+      <w:r>
+        <w:rPr>
+          <w:rStyle w:val="HTMLCode"/>
+        </w:rPr>
+        <w:t>)</w:t>
+      </w:r>
+    </w:p>
+    <w:p>
+      <w:pPr>
+        <w:tabs>
+          <w:tab w:val="left" w:pos="916"/>
+          <w:tab w:val="left" w:pos="1832"/>
+          <w:tab w:val="left" w:pos="2748"/>
+          <w:tab w:val="left" w:pos="3664"/>
+          <w:tab w:val="left" w:pos="4580"/>
+          <w:tab w:val="left" w:pos="5496"/>
+          <w:tab w:val="left" w:pos="6412"/>
+          <w:tab w:val="left" w:pos="7328"/>
+          <w:tab w:val="left" w:pos="8244"/>
+          <w:tab w:val="left" w:pos="9160"/>
+          <w:tab w:val="left" w:pos="10076"/>
+          <w:tab w:val="left" w:pos="10992"/>
+          <w:tab w:val="left" w:pos="11908"/>
+          <w:tab w:val="left" w:pos="12824"/>
+          <w:tab w:val="left" w:pos="13740"/>
+          <w:tab w:val="left" w:pos="14656"/>
+        </w:tabs>
+        <w:spacing w:after="0" w:line="240" w:lineRule="auto"/>
+        <w:rPr>
+          <w:rFonts w:ascii="Courier New" w:eastAsia="Times New Roman" w:hAnsi="Courier New" w:cs="Courier New"/>
+          <w:sz w:val="20"/>
+          <w:szCs w:val="20"/>
+          <w:lang w:eastAsia="en-IN"/>
+        </w:rPr>
+      </w:pPr>
+    </w:p>
     <w:p/>
     <w:sectPr>
       <w:pgSz w:w="11906" w:h="16838"/>
@@ -23899,7 +28769,6 @@
     <w:name w:val="Hyperlink"/>
     <w:basedOn w:val="DefaultParagraphFont"/>
     <w:uiPriority w:val="99"/>
-    <w:semiHidden/>
     <w:unhideWhenUsed/>
     <w:rsid w:val="00602D43"/>
     <w:rPr>
@@ -23931,6 +28800,43 @@
       <w:sz w:val="26"/>
       <w:szCs w:val="26"/>
     </w:rPr>
+  </w:style>
+  <w:style w:type="character" w:customStyle="1" w:styleId="k">
+    <w:name w:val="ͼk"/>
+    <w:basedOn w:val="DefaultParagraphFont"/>
+    <w:rsid w:val="00DB70D0"/>
+  </w:style>
+  <w:style w:type="character" w:customStyle="1" w:styleId="l">
+    <w:name w:val="ͼl"/>
+    <w:basedOn w:val="DefaultParagraphFont"/>
+    <w:rsid w:val="00DB70D0"/>
+  </w:style>
+  <w:style w:type="character" w:customStyle="1" w:styleId="n">
+    <w:name w:val="ͼn"/>
+    <w:basedOn w:val="DefaultParagraphFont"/>
+    <w:rsid w:val="00DB70D0"/>
+  </w:style>
+  <w:style w:type="character" w:styleId="UnresolvedMention">
+    <w:name w:val="Unresolved Mention"/>
+    <w:basedOn w:val="DefaultParagraphFont"/>
+    <w:uiPriority w:val="99"/>
+    <w:semiHidden/>
+    <w:unhideWhenUsed/>
+    <w:rsid w:val="009A30DA"/>
+    <w:rPr>
+      <w:color w:val="605E5C"/>
+      <w:shd w:val="clear" w:color="auto" w:fill="E1DFDD"/>
+    </w:rPr>
+  </w:style>
+  <w:style w:type="character" w:customStyle="1" w:styleId="g">
+    <w:name w:val="ͼg"/>
+    <w:basedOn w:val="DefaultParagraphFont"/>
+    <w:rsid w:val="00283D64"/>
+  </w:style>
+  <w:style w:type="character" w:customStyle="1" w:styleId="m">
+    <w:name w:val="ͼm"/>
+    <w:basedOn w:val="DefaultParagraphFont"/>
+    <w:rsid w:val="00283D64"/>
   </w:style>
 </w:styles>
 </file>

</xml_diff>